<commit_message>
fix: generate standard OpenXML DOCX and printable HTML project report
</commit_message>
<xml_diff>
--- a/AttendCloud_Vibe_Coding_Report.docx
+++ b/AttendCloud_Vibe_Coding_Report.docx
@@ -4,36 +4,36 @@
   <w:body>
     <w:p>
       <w:pPr>
-        <w:spacing w:after="80" w:before="200"/>
+        <w:spacing w:after="60" w:before="100"/>
         <w:jc w:val="center"/>
       </w:pPr>
       <w:r>
         <w:rPr>
-          <w:rFonts w:ascii="Calibri" w:cs="Calibri" w:eastAsia="Calibri" w:hAnsi="Calibri"/>
+          <w:rFonts w:ascii="Arial" w:cs="Arial" w:eastAsia="Arial" w:hAnsi="Arial"/>
           <w:b/>
           <w:bCs/>
           <w:color w:val="0A2540"/>
-          <w:sz w:val="36"/>
-          <w:szCs w:val="36"/>
+          <w:sz w:val="34"/>
+          <w:szCs w:val="34"/>
         </w:rPr>
         <w:t xml:space="preserve">PRESENTLY — AI FACIAL RECOGNITION ATTENDANCE SYSTEM</w:t>
       </w:r>
     </w:p>
     <w:p>
       <w:pPr>
-        <w:spacing w:after="240" w:before="0"/>
+        <w:spacing w:after="200" w:before="0"/>
         <w:jc w:val="center"/>
       </w:pPr>
       <w:r>
         <w:rPr>
-          <w:rFonts w:ascii="Calibri" w:cs="Calibri" w:eastAsia="Calibri" w:hAnsi="Calibri"/>
+          <w:rFonts w:ascii="Arial" w:cs="Arial" w:eastAsia="Arial" w:hAnsi="Arial"/>
           <w:i/>
           <w:iCs/>
           <w:color w:val="0066CC"/>
-          <w:sz w:val="24"/>
-          <w:szCs w:val="24"/>
-        </w:rPr>
-        <w:t xml:space="preserve">Cloud-Native Serverless Attendance &amp; Classroom Management Platform on AWS</w:t>
+          <w:sz w:val="22"/>
+          <w:szCs w:val="22"/>
+        </w:rPr>
+        <w:t xml:space="preserve">Cloud-Native Serverless Attendance &amp; Faculty Classroom Platform on AWS</w:t>
       </w:r>
     </w:p>
     <w:tbl>
@@ -60,10 +60,10 @@
           <w:tcPr>
             <w:shd w:fill="0A2540" w:val="clear"/>
             <w:tcMar>
-              <w:top w:type="dxa" w:w="120"/>
-              <w:left w:type="dxa" w:w="140"/>
-              <w:bottom w:type="dxa" w:w="120"/>
-              <w:right w:type="dxa" w:w="140"/>
+              <w:top w:type="dxa" w:w="100"/>
+              <w:left w:type="dxa" w:w="120"/>
+              <w:bottom w:type="dxa" w:w="100"/>
+              <w:right w:type="dxa" w:w="120"/>
             </w:tcMar>
           </w:tcPr>
           <w:p>
@@ -72,12 +72,12 @@
             </w:pPr>
             <w:r>
               <w:rPr>
-                <w:rFonts w:ascii="Calibri" w:cs="Calibri" w:eastAsia="Calibri" w:hAnsi="Calibri"/>
+                <w:rFonts w:ascii="Arial" w:cs="Arial" w:eastAsia="Arial" w:hAnsi="Arial"/>
                 <w:b/>
                 <w:bCs/>
                 <w:color w:val="FFFFFF"/>
-                <w:sz w:val="20"/>
-                <w:szCs w:val="20"/>
+                <w:sz w:val="19"/>
+                <w:szCs w:val="19"/>
               </w:rPr>
               <w:t xml:space="preserve">Project Metadata Attribute</w:t>
             </w:r>
@@ -87,10 +87,10 @@
           <w:tcPr>
             <w:shd w:fill="0A2540" w:val="clear"/>
             <w:tcMar>
-              <w:top w:type="dxa" w:w="120"/>
-              <w:left w:type="dxa" w:w="140"/>
-              <w:bottom w:type="dxa" w:w="120"/>
-              <w:right w:type="dxa" w:w="140"/>
+              <w:top w:type="dxa" w:w="100"/>
+              <w:left w:type="dxa" w:w="120"/>
+              <w:bottom w:type="dxa" w:w="100"/>
+              <w:right w:type="dxa" w:w="120"/>
             </w:tcMar>
           </w:tcPr>
           <w:p>
@@ -99,12 +99,12 @@
             </w:pPr>
             <w:r>
               <w:rPr>
-                <w:rFonts w:ascii="Calibri" w:cs="Calibri" w:eastAsia="Calibri" w:hAnsi="Calibri"/>
+                <w:rFonts w:ascii="Arial" w:cs="Arial" w:eastAsia="Arial" w:hAnsi="Arial"/>
                 <w:b/>
                 <w:bCs/>
                 <w:color w:val="FFFFFF"/>
-                <w:sz w:val="20"/>
-                <w:szCs w:val="20"/>
+                <w:sz w:val="19"/>
+                <w:szCs w:val="19"/>
               </w:rPr>
               <w:t xml:space="preserve">Specification &amp; Live Resource Details</w:t>
             </w:r>
@@ -122,47 +122,47 @@
             </w:tcBorders>
             <w:shd w:fill="FFFFFF" w:val="clear"/>
             <w:tcMar>
-              <w:top w:type="dxa" w:w="100"/>
-              <w:left w:type="dxa" w:w="140"/>
-              <w:bottom w:type="dxa" w:w="100"/>
-              <w:right w:type="dxa" w:w="140"/>
-            </w:tcMar>
-          </w:tcPr>
-          <w:p>
-            <w:r>
-              <w:rPr>
-                <w:rFonts w:ascii="Calibri" w:cs="Calibri" w:eastAsia="Calibri" w:hAnsi="Calibri"/>
-                <w:color w:val="2D3748"/>
-                <w:sz w:val="20"/>
-                <w:szCs w:val="20"/>
-              </w:rPr>
-              <w:t xml:space="preserve">Project Name</w:t>
-            </w:r>
-          </w:p>
-        </w:tc>
-        <w:tc>
-          <w:tcPr>
-            <w:tcBorders>
-              <w:top w:val="single" w:color="CBD5E0" w:sz="2"/>
-              <w:left w:val="single" w:color="CBD5E0" w:sz="2"/>
-              <w:bottom w:val="single" w:color="CBD5E0" w:sz="2"/>
-              <w:right w:val="single" w:color="CBD5E0" w:sz="2"/>
-            </w:tcBorders>
-            <w:shd w:fill="FFFFFF" w:val="clear"/>
-            <w:tcMar>
-              <w:top w:type="dxa" w:w="100"/>
-              <w:left w:type="dxa" w:w="140"/>
-              <w:bottom w:type="dxa" w:w="100"/>
-              <w:right w:type="dxa" w:w="140"/>
-            </w:tcMar>
-          </w:tcPr>
-          <w:p>
-            <w:r>
-              <w:rPr>
-                <w:rFonts w:ascii="Calibri" w:cs="Calibri" w:eastAsia="Calibri" w:hAnsi="Calibri"/>
-                <w:color w:val="2D3748"/>
-                <w:sz w:val="20"/>
-                <w:szCs w:val="20"/>
+              <w:top w:type="dxa" w:w="80"/>
+              <w:left w:type="dxa" w:w="120"/>
+              <w:bottom w:type="dxa" w:w="80"/>
+              <w:right w:type="dxa" w:w="120"/>
+            </w:tcMar>
+          </w:tcPr>
+          <w:p>
+            <w:r>
+              <w:rPr>
+                <w:rFonts w:ascii="Arial" w:cs="Arial" w:eastAsia="Arial" w:hAnsi="Arial"/>
+                <w:color w:val="2D3748"/>
+                <w:sz w:val="19"/>
+                <w:szCs w:val="19"/>
+              </w:rPr>
+              <w:t xml:space="preserve">Project Title</w:t>
+            </w:r>
+          </w:p>
+        </w:tc>
+        <w:tc>
+          <w:tcPr>
+            <w:tcBorders>
+              <w:top w:val="single" w:color="CBD5E0" w:sz="2"/>
+              <w:left w:val="single" w:color="CBD5E0" w:sz="2"/>
+              <w:bottom w:val="single" w:color="CBD5E0" w:sz="2"/>
+              <w:right w:val="single" w:color="CBD5E0" w:sz="2"/>
+            </w:tcBorders>
+            <w:shd w:fill="FFFFFF" w:val="clear"/>
+            <w:tcMar>
+              <w:top w:type="dxa" w:w="80"/>
+              <w:left w:type="dxa" w:w="120"/>
+              <w:bottom w:type="dxa" w:w="80"/>
+              <w:right w:type="dxa" w:w="120"/>
+            </w:tcMar>
+          </w:tcPr>
+          <w:p>
+            <w:r>
+              <w:rPr>
+                <w:rFonts w:ascii="Arial" w:cs="Arial" w:eastAsia="Arial" w:hAnsi="Arial"/>
+                <w:color w:val="2D3748"/>
+                <w:sz w:val="19"/>
+                <w:szCs w:val="19"/>
               </w:rPr>
               <w:t xml:space="preserve">Presently — AI Facial Recognition Attendance Platform</w:t>
             </w:r>
@@ -180,19 +180,19 @@
             </w:tcBorders>
             <w:shd w:fill="F7FAFC" w:val="clear"/>
             <w:tcMar>
-              <w:top w:type="dxa" w:w="100"/>
-              <w:left w:type="dxa" w:w="140"/>
-              <w:bottom w:type="dxa" w:w="100"/>
-              <w:right w:type="dxa" w:w="140"/>
-            </w:tcMar>
-          </w:tcPr>
-          <w:p>
-            <w:r>
-              <w:rPr>
-                <w:rFonts w:ascii="Calibri" w:cs="Calibri" w:eastAsia="Calibri" w:hAnsi="Calibri"/>
-                <w:color w:val="2D3748"/>
-                <w:sz w:val="20"/>
-                <w:szCs w:val="20"/>
+              <w:top w:type="dxa" w:w="80"/>
+              <w:left w:type="dxa" w:w="120"/>
+              <w:bottom w:type="dxa" w:w="80"/>
+              <w:right w:type="dxa" w:w="120"/>
+            </w:tcMar>
+          </w:tcPr>
+          <w:p>
+            <w:r>
+              <w:rPr>
+                <w:rFonts w:ascii="Arial" w:cs="Arial" w:eastAsia="Arial" w:hAnsi="Arial"/>
+                <w:color w:val="2D3748"/>
+                <w:sz w:val="19"/>
+                <w:szCs w:val="19"/>
               </w:rPr>
               <w:t xml:space="preserve">Author / Developer</w:t>
             </w:r>
@@ -208,19 +208,19 @@
             </w:tcBorders>
             <w:shd w:fill="F7FAFC" w:val="clear"/>
             <w:tcMar>
-              <w:top w:type="dxa" w:w="100"/>
-              <w:left w:type="dxa" w:w="140"/>
-              <w:bottom w:type="dxa" w:w="100"/>
-              <w:right w:type="dxa" w:w="140"/>
-            </w:tcMar>
-          </w:tcPr>
-          <w:p>
-            <w:r>
-              <w:rPr>
-                <w:rFonts w:ascii="Calibri" w:cs="Calibri" w:eastAsia="Calibri" w:hAnsi="Calibri"/>
-                <w:color w:val="2D3748"/>
-                <w:sz w:val="20"/>
-                <w:szCs w:val="20"/>
+              <w:top w:type="dxa" w:w="80"/>
+              <w:left w:type="dxa" w:w="120"/>
+              <w:bottom w:type="dxa" w:w="80"/>
+              <w:right w:type="dxa" w:w="120"/>
+            </w:tcMar>
+          </w:tcPr>
+          <w:p>
+            <w:r>
+              <w:rPr>
+                <w:rFonts w:ascii="Arial" w:cs="Arial" w:eastAsia="Arial" w:hAnsi="Arial"/>
+                <w:color w:val="2D3748"/>
+                <w:sz w:val="19"/>
+                <w:szCs w:val="19"/>
               </w:rPr>
               <w:t xml:space="preserve">Nishchal Mahant (Nishu9198)</w:t>
             </w:r>
@@ -238,19 +238,19 @@
             </w:tcBorders>
             <w:shd w:fill="FFFFFF" w:val="clear"/>
             <w:tcMar>
-              <w:top w:type="dxa" w:w="100"/>
-              <w:left w:type="dxa" w:w="140"/>
-              <w:bottom w:type="dxa" w:w="100"/>
-              <w:right w:type="dxa" w:w="140"/>
-            </w:tcMar>
-          </w:tcPr>
-          <w:p>
-            <w:r>
-              <w:rPr>
-                <w:rFonts w:ascii="Calibri" w:cs="Calibri" w:eastAsia="Calibri" w:hAnsi="Calibri"/>
-                <w:color w:val="2D3748"/>
-                <w:sz w:val="20"/>
-                <w:szCs w:val="20"/>
+              <w:top w:type="dxa" w:w="80"/>
+              <w:left w:type="dxa" w:w="120"/>
+              <w:bottom w:type="dxa" w:w="80"/>
+              <w:right w:type="dxa" w:w="120"/>
+            </w:tcMar>
+          </w:tcPr>
+          <w:p>
+            <w:r>
+              <w:rPr>
+                <w:rFonts w:ascii="Arial" w:cs="Arial" w:eastAsia="Arial" w:hAnsi="Arial"/>
+                <w:color w:val="2D3748"/>
+                <w:sz w:val="19"/>
+                <w:szCs w:val="19"/>
               </w:rPr>
               <w:t xml:space="preserve">GitHub Repository</w:t>
             </w:r>
@@ -266,19 +266,19 @@
             </w:tcBorders>
             <w:shd w:fill="FFFFFF" w:val="clear"/>
             <w:tcMar>
-              <w:top w:type="dxa" w:w="100"/>
-              <w:left w:type="dxa" w:w="140"/>
-              <w:bottom w:type="dxa" w:w="100"/>
-              <w:right w:type="dxa" w:w="140"/>
-            </w:tcMar>
-          </w:tcPr>
-          <w:p>
-            <w:r>
-              <w:rPr>
-                <w:rFonts w:ascii="Calibri" w:cs="Calibri" w:eastAsia="Calibri" w:hAnsi="Calibri"/>
-                <w:color w:val="2D3748"/>
-                <w:sz w:val="20"/>
-                <w:szCs w:val="20"/>
+              <w:top w:type="dxa" w:w="80"/>
+              <w:left w:type="dxa" w:w="120"/>
+              <w:bottom w:type="dxa" w:w="80"/>
+              <w:right w:type="dxa" w:w="120"/>
+            </w:tcMar>
+          </w:tcPr>
+          <w:p>
+            <w:r>
+              <w:rPr>
+                <w:rFonts w:ascii="Arial" w:cs="Arial" w:eastAsia="Arial" w:hAnsi="Arial"/>
+                <w:color w:val="2D3748"/>
+                <w:sz w:val="19"/>
+                <w:szCs w:val="19"/>
               </w:rPr>
               <w:t xml:space="preserve">https://github.com/Nishu9198/Attendance-System-VibeCoding</w:t>
             </w:r>
@@ -296,19 +296,19 @@
             </w:tcBorders>
             <w:shd w:fill="F7FAFC" w:val="clear"/>
             <w:tcMar>
-              <w:top w:type="dxa" w:w="100"/>
-              <w:left w:type="dxa" w:w="140"/>
-              <w:bottom w:type="dxa" w:w="100"/>
-              <w:right w:type="dxa" w:w="140"/>
-            </w:tcMar>
-          </w:tcPr>
-          <w:p>
-            <w:r>
-              <w:rPr>
-                <w:rFonts w:ascii="Calibri" w:cs="Calibri" w:eastAsia="Calibri" w:hAnsi="Calibri"/>
-                <w:color w:val="2D3748"/>
-                <w:sz w:val="20"/>
-                <w:szCs w:val="20"/>
+              <w:top w:type="dxa" w:w="80"/>
+              <w:left w:type="dxa" w:w="120"/>
+              <w:bottom w:type="dxa" w:w="80"/>
+              <w:right w:type="dxa" w:w="120"/>
+            </w:tcMar>
+          </w:tcPr>
+          <w:p>
+            <w:r>
+              <w:rPr>
+                <w:rFonts w:ascii="Arial" w:cs="Arial" w:eastAsia="Arial" w:hAnsi="Arial"/>
+                <w:color w:val="2D3748"/>
+                <w:sz w:val="19"/>
+                <w:szCs w:val="19"/>
               </w:rPr>
               <w:t xml:space="preserve">Live CloudFront Web App</w:t>
             </w:r>
@@ -324,19 +324,19 @@
             </w:tcBorders>
             <w:shd w:fill="F7FAFC" w:val="clear"/>
             <w:tcMar>
-              <w:top w:type="dxa" w:w="100"/>
-              <w:left w:type="dxa" w:w="140"/>
-              <w:bottom w:type="dxa" w:w="100"/>
-              <w:right w:type="dxa" w:w="140"/>
-            </w:tcMar>
-          </w:tcPr>
-          <w:p>
-            <w:r>
-              <w:rPr>
-                <w:rFonts w:ascii="Calibri" w:cs="Calibri" w:eastAsia="Calibri" w:hAnsi="Calibri"/>
-                <w:color w:val="2D3748"/>
-                <w:sz w:val="20"/>
-                <w:szCs w:val="20"/>
+              <w:top w:type="dxa" w:w="80"/>
+              <w:left w:type="dxa" w:w="120"/>
+              <w:bottom w:type="dxa" w:w="80"/>
+              <w:right w:type="dxa" w:w="120"/>
+            </w:tcMar>
+          </w:tcPr>
+          <w:p>
+            <w:r>
+              <w:rPr>
+                <w:rFonts w:ascii="Arial" w:cs="Arial" w:eastAsia="Arial" w:hAnsi="Arial"/>
+                <w:color w:val="2D3748"/>
+                <w:sz w:val="19"/>
+                <w:szCs w:val="19"/>
               </w:rPr>
               <w:t xml:space="preserve">https://d1yszng57r6fz7.cloudfront.net</w:t>
             </w:r>
@@ -354,19 +354,19 @@
             </w:tcBorders>
             <w:shd w:fill="FFFFFF" w:val="clear"/>
             <w:tcMar>
-              <w:top w:type="dxa" w:w="100"/>
-              <w:left w:type="dxa" w:w="140"/>
-              <w:bottom w:type="dxa" w:w="100"/>
-              <w:right w:type="dxa" w:w="140"/>
-            </w:tcMar>
-          </w:tcPr>
-          <w:p>
-            <w:r>
-              <w:rPr>
-                <w:rFonts w:ascii="Calibri" w:cs="Calibri" w:eastAsia="Calibri" w:hAnsi="Calibri"/>
-                <w:color w:val="2D3748"/>
-                <w:sz w:val="20"/>
-                <w:szCs w:val="20"/>
+              <w:top w:type="dxa" w:w="80"/>
+              <w:left w:type="dxa" w:w="120"/>
+              <w:bottom w:type="dxa" w:w="80"/>
+              <w:right w:type="dxa" w:w="120"/>
+            </w:tcMar>
+          </w:tcPr>
+          <w:p>
+            <w:r>
+              <w:rPr>
+                <w:rFonts w:ascii="Arial" w:cs="Arial" w:eastAsia="Arial" w:hAnsi="Arial"/>
+                <w:color w:val="2D3748"/>
+                <w:sz w:val="19"/>
+                <w:szCs w:val="19"/>
               </w:rPr>
               <w:t xml:space="preserve">Live AWS API Gateway</w:t>
             </w:r>
@@ -382,19 +382,19 @@
             </w:tcBorders>
             <w:shd w:fill="FFFFFF" w:val="clear"/>
             <w:tcMar>
-              <w:top w:type="dxa" w:w="100"/>
-              <w:left w:type="dxa" w:w="140"/>
-              <w:bottom w:type="dxa" w:w="100"/>
-              <w:right w:type="dxa" w:w="140"/>
-            </w:tcMar>
-          </w:tcPr>
-          <w:p>
-            <w:r>
-              <w:rPr>
-                <w:rFonts w:ascii="Calibri" w:cs="Calibri" w:eastAsia="Calibri" w:hAnsi="Calibri"/>
-                <w:color w:val="2D3748"/>
-                <w:sz w:val="20"/>
-                <w:szCs w:val="20"/>
+              <w:top w:type="dxa" w:w="80"/>
+              <w:left w:type="dxa" w:w="120"/>
+              <w:bottom w:type="dxa" w:w="80"/>
+              <w:right w:type="dxa" w:w="120"/>
+            </w:tcMar>
+          </w:tcPr>
+          <w:p>
+            <w:r>
+              <w:rPr>
+                <w:rFonts w:ascii="Arial" w:cs="Arial" w:eastAsia="Arial" w:hAnsi="Arial"/>
+                <w:color w:val="2D3748"/>
+                <w:sz w:val="19"/>
+                <w:szCs w:val="19"/>
               </w:rPr>
               <w:t xml:space="preserve">https://5pezi90imf.execute-api.ap-south-1.amazonaws.com/</w:t>
             </w:r>
@@ -412,19 +412,19 @@
             </w:tcBorders>
             <w:shd w:fill="F7FAFC" w:val="clear"/>
             <w:tcMar>
-              <w:top w:type="dxa" w:w="100"/>
-              <w:left w:type="dxa" w:w="140"/>
-              <w:bottom w:type="dxa" w:w="100"/>
-              <w:right w:type="dxa" w:w="140"/>
-            </w:tcMar>
-          </w:tcPr>
-          <w:p>
-            <w:r>
-              <w:rPr>
-                <w:rFonts w:ascii="Calibri" w:cs="Calibri" w:eastAsia="Calibri" w:hAnsi="Calibri"/>
-                <w:color w:val="2D3748"/>
-                <w:sz w:val="20"/>
-                <w:szCs w:val="20"/>
+              <w:top w:type="dxa" w:w="80"/>
+              <w:left w:type="dxa" w:w="120"/>
+              <w:bottom w:type="dxa" w:w="80"/>
+              <w:right w:type="dxa" w:w="120"/>
+            </w:tcMar>
+          </w:tcPr>
+          <w:p>
+            <w:r>
+              <w:rPr>
+                <w:rFonts w:ascii="Arial" w:cs="Arial" w:eastAsia="Arial" w:hAnsi="Arial"/>
+                <w:color w:val="2D3748"/>
+                <w:sz w:val="19"/>
+                <w:szCs w:val="19"/>
               </w:rPr>
               <w:t xml:space="preserve">AWS Cloud Infrastructure</w:t>
             </w:r>
@@ -440,19 +440,19 @@
             </w:tcBorders>
             <w:shd w:fill="F7FAFC" w:val="clear"/>
             <w:tcMar>
-              <w:top w:type="dxa" w:w="100"/>
-              <w:left w:type="dxa" w:w="140"/>
-              <w:bottom w:type="dxa" w:w="100"/>
-              <w:right w:type="dxa" w:w="140"/>
-            </w:tcMar>
-          </w:tcPr>
-          <w:p>
-            <w:r>
-              <w:rPr>
-                <w:rFonts w:ascii="Calibri" w:cs="Calibri" w:eastAsia="Calibri" w:hAnsi="Calibri"/>
-                <w:color w:val="2D3748"/>
-                <w:sz w:val="20"/>
-                <w:szCs w:val="20"/>
+              <w:top w:type="dxa" w:w="80"/>
+              <w:left w:type="dxa" w:w="120"/>
+              <w:bottom w:type="dxa" w:w="80"/>
+              <w:right w:type="dxa" w:w="120"/>
+            </w:tcMar>
+          </w:tcPr>
+          <w:p>
+            <w:r>
+              <w:rPr>
+                <w:rFonts w:ascii="Arial" w:cs="Arial" w:eastAsia="Arial" w:hAnsi="Arial"/>
+                <w:color w:val="2D3748"/>
+                <w:sz w:val="19"/>
+                <w:szCs w:val="19"/>
               </w:rPr>
               <w:t xml:space="preserve">AWS Lambda, Amazon Rekognition, DynamoDB, Cognito, S3, SNS, EventBridge</w:t>
             </w:r>
@@ -470,19 +470,19 @@
             </w:tcBorders>
             <w:shd w:fill="FFFFFF" w:val="clear"/>
             <w:tcMar>
-              <w:top w:type="dxa" w:w="100"/>
-              <w:left w:type="dxa" w:w="140"/>
-              <w:bottom w:type="dxa" w:w="100"/>
-              <w:right w:type="dxa" w:w="140"/>
-            </w:tcMar>
-          </w:tcPr>
-          <w:p>
-            <w:r>
-              <w:rPr>
-                <w:rFonts w:ascii="Calibri" w:cs="Calibri" w:eastAsia="Calibri" w:hAnsi="Calibri"/>
-                <w:color w:val="2D3748"/>
-                <w:sz w:val="20"/>
-                <w:szCs w:val="20"/>
+              <w:top w:type="dxa" w:w="80"/>
+              <w:left w:type="dxa" w:w="120"/>
+              <w:bottom w:type="dxa" w:w="80"/>
+              <w:right w:type="dxa" w:w="120"/>
+            </w:tcMar>
+          </w:tcPr>
+          <w:p>
+            <w:r>
+              <w:rPr>
+                <w:rFonts w:ascii="Arial" w:cs="Arial" w:eastAsia="Arial" w:hAnsi="Arial"/>
+                <w:color w:val="2D3748"/>
+                <w:sz w:val="19"/>
+                <w:szCs w:val="19"/>
               </w:rPr>
               <w:t xml:space="preserve">Infrastructure as Code (IaC)</w:t>
             </w:r>
@@ -498,21 +498,21 @@
             </w:tcBorders>
             <w:shd w:fill="FFFFFF" w:val="clear"/>
             <w:tcMar>
-              <w:top w:type="dxa" w:w="100"/>
-              <w:left w:type="dxa" w:w="140"/>
-              <w:bottom w:type="dxa" w:w="100"/>
-              <w:right w:type="dxa" w:w="140"/>
-            </w:tcMar>
-          </w:tcPr>
-          <w:p>
-            <w:r>
-              <w:rPr>
-                <w:rFonts w:ascii="Calibri" w:cs="Calibri" w:eastAsia="Calibri" w:hAnsi="Calibri"/>
-                <w:color w:val="2D3748"/>
-                <w:sz w:val="20"/>
-                <w:szCs w:val="20"/>
-              </w:rPr>
-              <w:t xml:space="preserve">Terraform by HashiCorp (100% Automated Provisioning)</w:t>
+              <w:top w:type="dxa" w:w="80"/>
+              <w:left w:type="dxa" w:w="120"/>
+              <w:bottom w:type="dxa" w:w="80"/>
+              <w:right w:type="dxa" w:w="120"/>
+            </w:tcMar>
+          </w:tcPr>
+          <w:p>
+            <w:r>
+              <w:rPr>
+                <w:rFonts w:ascii="Arial" w:cs="Arial" w:eastAsia="Arial" w:hAnsi="Arial"/>
+                <w:color w:val="2D3748"/>
+                <w:sz w:val="19"/>
+                <w:szCs w:val="19"/>
+              </w:rPr>
+              <w:t xml:space="preserve">Terraform by HashiCorp (Automated Cloud Provisioning)</w:t>
             </w:r>
           </w:p>
         </w:tc>
@@ -528,19 +528,19 @@
             </w:tcBorders>
             <w:shd w:fill="F7FAFC" w:val="clear"/>
             <w:tcMar>
-              <w:top w:type="dxa" w:w="100"/>
-              <w:left w:type="dxa" w:w="140"/>
-              <w:bottom w:type="dxa" w:w="100"/>
-              <w:right w:type="dxa" w:w="140"/>
-            </w:tcMar>
-          </w:tcPr>
-          <w:p>
-            <w:r>
-              <w:rPr>
-                <w:rFonts w:ascii="Calibri" w:cs="Calibri" w:eastAsia="Calibri" w:hAnsi="Calibri"/>
-                <w:color w:val="2D3748"/>
-                <w:sz w:val="20"/>
-                <w:szCs w:val="20"/>
+              <w:top w:type="dxa" w:w="80"/>
+              <w:left w:type="dxa" w:w="120"/>
+              <w:bottom w:type="dxa" w:w="80"/>
+              <w:right w:type="dxa" w:w="120"/>
+            </w:tcMar>
+          </w:tcPr>
+          <w:p>
+            <w:r>
+              <w:rPr>
+                <w:rFonts w:ascii="Arial" w:cs="Arial" w:eastAsia="Arial" w:hAnsi="Arial"/>
+                <w:color w:val="2D3748"/>
+                <w:sz w:val="19"/>
+                <w:szCs w:val="19"/>
               </w:rPr>
               <w:t xml:space="preserve">Frontend Architecture</w:t>
             </w:r>
@@ -556,19 +556,19 @@
             </w:tcBorders>
             <w:shd w:fill="F7FAFC" w:val="clear"/>
             <w:tcMar>
-              <w:top w:type="dxa" w:w="100"/>
-              <w:left w:type="dxa" w:w="140"/>
-              <w:bottom w:type="dxa" w:w="100"/>
-              <w:right w:type="dxa" w:w="140"/>
-            </w:tcMar>
-          </w:tcPr>
-          <w:p>
-            <w:r>
-              <w:rPr>
-                <w:rFonts w:ascii="Calibri" w:cs="Calibri" w:eastAsia="Calibri" w:hAnsi="Calibri"/>
-                <w:color w:val="2D3748"/>
-                <w:sz w:val="20"/>
-                <w:szCs w:val="20"/>
+              <w:top w:type="dxa" w:w="80"/>
+              <w:left w:type="dxa" w:w="120"/>
+              <w:bottom w:type="dxa" w:w="80"/>
+              <w:right w:type="dxa" w:w="120"/>
+            </w:tcMar>
+          </w:tcPr>
+          <w:p>
+            <w:r>
+              <w:rPr>
+                <w:rFonts w:ascii="Arial" w:cs="Arial" w:eastAsia="Arial" w:hAnsi="Arial"/>
+                <w:color w:val="2D3748"/>
+                <w:sz w:val="19"/>
+                <w:szCs w:val="19"/>
               </w:rPr>
               <w:t xml:space="preserve">React 19, Vite, Chart.js, Lucide Icons, Vanilla CSS Design System</w:t>
             </w:r>
@@ -586,47 +586,47 @@
             </w:tcBorders>
             <w:shd w:fill="FFFFFF" w:val="clear"/>
             <w:tcMar>
-              <w:top w:type="dxa" w:w="100"/>
-              <w:left w:type="dxa" w:w="140"/>
-              <w:bottom w:type="dxa" w:w="100"/>
-              <w:right w:type="dxa" w:w="140"/>
-            </w:tcMar>
-          </w:tcPr>
-          <w:p>
-            <w:r>
-              <w:rPr>
-                <w:rFonts w:ascii="Calibri" w:cs="Calibri" w:eastAsia="Calibri" w:hAnsi="Calibri"/>
-                <w:color w:val="2D3748"/>
-                <w:sz w:val="20"/>
-                <w:szCs w:val="20"/>
-              </w:rPr>
-              <w:t xml:space="preserve">AWS Region Deployment</w:t>
-            </w:r>
-          </w:p>
-        </w:tc>
-        <w:tc>
-          <w:tcPr>
-            <w:tcBorders>
-              <w:top w:val="single" w:color="CBD5E0" w:sz="2"/>
-              <w:left w:val="single" w:color="CBD5E0" w:sz="2"/>
-              <w:bottom w:val="single" w:color="CBD5E0" w:sz="2"/>
-              <w:right w:val="single" w:color="CBD5E0" w:sz="2"/>
-            </w:tcBorders>
-            <w:shd w:fill="FFFFFF" w:val="clear"/>
-            <w:tcMar>
-              <w:top w:type="dxa" w:w="100"/>
-              <w:left w:type="dxa" w:w="140"/>
-              <w:bottom w:type="dxa" w:w="100"/>
-              <w:right w:type="dxa" w:w="140"/>
-            </w:tcMar>
-          </w:tcPr>
-          <w:p>
-            <w:r>
-              <w:rPr>
-                <w:rFonts w:ascii="Calibri" w:cs="Calibri" w:eastAsia="Calibri" w:hAnsi="Calibri"/>
-                <w:color w:val="2D3748"/>
-                <w:sz w:val="20"/>
-                <w:szCs w:val="20"/>
+              <w:top w:type="dxa" w:w="80"/>
+              <w:left w:type="dxa" w:w="120"/>
+              <w:bottom w:type="dxa" w:w="80"/>
+              <w:right w:type="dxa" w:w="120"/>
+            </w:tcMar>
+          </w:tcPr>
+          <w:p>
+            <w:r>
+              <w:rPr>
+                <w:rFonts w:ascii="Arial" w:cs="Arial" w:eastAsia="Arial" w:hAnsi="Arial"/>
+                <w:color w:val="2D3748"/>
+                <w:sz w:val="19"/>
+                <w:szCs w:val="19"/>
+              </w:rPr>
+              <w:t xml:space="preserve">AWS Region</w:t>
+            </w:r>
+          </w:p>
+        </w:tc>
+        <w:tc>
+          <w:tcPr>
+            <w:tcBorders>
+              <w:top w:val="single" w:color="CBD5E0" w:sz="2"/>
+              <w:left w:val="single" w:color="CBD5E0" w:sz="2"/>
+              <w:bottom w:val="single" w:color="CBD5E0" w:sz="2"/>
+              <w:right w:val="single" w:color="CBD5E0" w:sz="2"/>
+            </w:tcBorders>
+            <w:shd w:fill="FFFFFF" w:val="clear"/>
+            <w:tcMar>
+              <w:top w:type="dxa" w:w="80"/>
+              <w:left w:type="dxa" w:w="120"/>
+              <w:bottom w:type="dxa" w:w="80"/>
+              <w:right w:type="dxa" w:w="120"/>
+            </w:tcMar>
+          </w:tcPr>
+          <w:p>
+            <w:r>
+              <w:rPr>
+                <w:rFonts w:ascii="Arial" w:cs="Arial" w:eastAsia="Arial" w:hAnsi="Arial"/>
+                <w:color w:val="2D3748"/>
+                <w:sz w:val="19"/>
+                <w:szCs w:val="19"/>
               </w:rPr>
               <w:t xml:space="preserve">ap-south-1 (Asia Pacific - Mumbai)</w:t>
             </w:r>
@@ -644,21 +644,21 @@
             </w:tcBorders>
             <w:shd w:fill="F7FAFC" w:val="clear"/>
             <w:tcMar>
-              <w:top w:type="dxa" w:w="100"/>
-              <w:left w:type="dxa" w:w="140"/>
-              <w:bottom w:type="dxa" w:w="100"/>
-              <w:right w:type="dxa" w:w="140"/>
-            </w:tcMar>
-          </w:tcPr>
-          <w:p>
-            <w:r>
-              <w:rPr>
-                <w:rFonts w:ascii="Calibri" w:cs="Calibri" w:eastAsia="Calibri" w:hAnsi="Calibri"/>
-                <w:color w:val="2D3748"/>
-                <w:sz w:val="20"/>
-                <w:szCs w:val="20"/>
-              </w:rPr>
-              <w:t xml:space="preserve">Date of Completion</w:t>
+              <w:top w:type="dxa" w:w="80"/>
+              <w:left w:type="dxa" w:w="120"/>
+              <w:bottom w:type="dxa" w:w="80"/>
+              <w:right w:type="dxa" w:w="120"/>
+            </w:tcMar>
+          </w:tcPr>
+          <w:p>
+            <w:r>
+              <w:rPr>
+                <w:rFonts w:ascii="Arial" w:cs="Arial" w:eastAsia="Arial" w:hAnsi="Arial"/>
+                <w:color w:val="2D3748"/>
+                <w:sz w:val="19"/>
+                <w:szCs w:val="19"/>
+              </w:rPr>
+              <w:t xml:space="preserve">Document Date</w:t>
             </w:r>
           </w:p>
         </w:tc>
@@ -672,19 +672,19 @@
             </w:tcBorders>
             <w:shd w:fill="F7FAFC" w:val="clear"/>
             <w:tcMar>
-              <w:top w:type="dxa" w:w="100"/>
-              <w:left w:type="dxa" w:w="140"/>
-              <w:bottom w:type="dxa" w:w="100"/>
-              <w:right w:type="dxa" w:w="140"/>
-            </w:tcMar>
-          </w:tcPr>
-          <w:p>
-            <w:r>
-              <w:rPr>
-                <w:rFonts w:ascii="Calibri" w:cs="Calibri" w:eastAsia="Calibri" w:hAnsi="Calibri"/>
-                <w:color w:val="2D3748"/>
-                <w:sz w:val="20"/>
-                <w:szCs w:val="20"/>
+              <w:top w:type="dxa" w:w="80"/>
+              <w:left w:type="dxa" w:w="120"/>
+              <w:bottom w:type="dxa" w:w="80"/>
+              <w:right w:type="dxa" w:w="120"/>
+            </w:tcMar>
+          </w:tcPr>
+          <w:p>
+            <w:r>
+              <w:rPr>
+                <w:rFonts w:ascii="Arial" w:cs="Arial" w:eastAsia="Arial" w:hAnsi="Arial"/>
+                <w:color w:val="2D3748"/>
+                <w:sz w:val="19"/>
+                <w:szCs w:val="19"/>
               </w:rPr>
               <w:t xml:space="preserve">August 2026</w:t>
             </w:r>
@@ -694,7 +694,7 @@
     </w:tbl>
     <w:p>
       <w:pPr>
-        <w:spacing w:after="120" w:before="240"/>
+        <w:spacing w:after="100" w:before="180"/>
       </w:pPr>
     </w:p>
     <w:tbl>
@@ -708,12 +708,6 @@
           <w:insideH w:val="single" w:color="auto" w:sz="4"/>
           <w:insideV w:val="single" w:color="auto" w:sz="4"/>
         </w:tblBorders>
-        <w:tblCellMar>
-          <w:top w:type="dxa" w:w="160"/>
-          <w:left w:type="dxa" w:w="240"/>
-          <w:bottom w:type="dxa" w:w="160"/>
-          <w:right w:type="dxa" w:w="240"/>
-        </w:tblCellMar>
       </w:tblPr>
       <w:tblGrid>
         <w:gridCol w:w="100"/>
@@ -722,165 +716,171 @@
         <w:tc>
           <w:tcPr>
             <w:tcBorders>
-              <w:top w:val="single" w:color="0066CC" w:sz="4"/>
+              <w:top w:val="single" w:color="0066CC" w:sz="6"/>
               <w:left w:val="single" w:color="0066CC" w:sz="24"/>
-              <w:bottom w:val="single" w:color="0066CC" w:sz="4"/>
-              <w:right w:val="single" w:color="0066CC" w:sz="4"/>
+              <w:bottom w:val="single" w:color="0066CC" w:sz="6"/>
+              <w:right w:val="single" w:color="0066CC" w:sz="6"/>
             </w:tcBorders>
             <w:shd w:fill="EDF2F7" w:val="clear"/>
+            <w:tcMar>
+              <w:top w:type="dxa" w:w="140"/>
+              <w:left w:type="dxa" w:w="200"/>
+              <w:bottom w:type="dxa" w:w="140"/>
+              <w:right w:type="dxa" w:w="200"/>
+            </w:tcMar>
           </w:tcPr>
           <w:p>
             <w:pPr>
-              <w:spacing w:after="60" w:before="60"/>
+              <w:spacing w:after="60" w:before="80"/>
             </w:pPr>
             <w:r>
               <w:rPr>
-                <w:rFonts w:ascii="Calibri" w:cs="Calibri" w:eastAsia="Calibri" w:hAnsi="Calibri"/>
+                <w:rFonts w:ascii="Arial" w:cs="Arial" w:eastAsia="Arial" w:hAnsi="Arial"/>
                 <w:b/>
                 <w:bCs/>
                 <w:color w:val="0A2540"/>
-                <w:sz w:val="24"/>
-                <w:szCs w:val="24"/>
+                <w:sz w:val="23"/>
+                <w:szCs w:val="23"/>
               </w:rPr>
               <w:t xml:space="preserve">🎥 PROJECT VIDEO DEMONSTRATION &amp; WALKTHROUGH</w:t>
             </w:r>
           </w:p>
           <w:p>
             <w:pPr>
-              <w:spacing w:after="40" w:before="40"/>
+              <w:spacing w:after="30" w:before="30"/>
             </w:pPr>
             <w:r>
               <w:rPr>
-                <w:rFonts w:ascii="Calibri" w:cs="Calibri" w:eastAsia="Calibri" w:hAnsi="Calibri"/>
-                <w:color w:val="2D3748"/>
-                <w:sz w:val="21"/>
-                <w:szCs w:val="21"/>
+                <w:rFonts w:ascii="Arial" w:cs="Arial" w:eastAsia="Arial" w:hAnsi="Arial"/>
+                <w:color w:val="2D3748"/>
+                <w:sz w:val="20"/>
+                <w:szCs w:val="20"/>
               </w:rPr>
               <w:t xml:space="preserve">Please view the comprehensive video presentation, architecture walkthrough, and live facial recognition demo at:</w:t>
             </w:r>
           </w:p>
           <w:p>
             <w:pPr>
-              <w:spacing w:after="40" w:before="40"/>
+              <w:spacing w:after="30" w:before="30"/>
             </w:pPr>
             <w:r>
               <w:rPr>
-                <w:rFonts w:ascii="Calibri" w:cs="Calibri" w:eastAsia="Calibri" w:hAnsi="Calibri"/>
-                <w:color w:val="2D3748"/>
-                <w:sz w:val="21"/>
-                <w:szCs w:val="21"/>
+                <w:rFonts w:ascii="Arial" w:cs="Arial" w:eastAsia="Arial" w:hAnsi="Arial"/>
+                <w:color w:val="2D3748"/>
+                <w:sz w:val="20"/>
+                <w:szCs w:val="20"/>
               </w:rPr>
               <w:t xml:space="preserve"/>
             </w:r>
           </w:p>
           <w:p>
             <w:pPr>
-              <w:spacing w:after="40" w:before="40"/>
+              <w:spacing w:after="30" w:before="30"/>
             </w:pPr>
             <w:r>
               <w:rPr>
-                <w:rFonts w:ascii="Calibri" w:cs="Calibri" w:eastAsia="Calibri" w:hAnsi="Calibri"/>
-                <w:color w:val="2D3748"/>
-                <w:sz w:val="21"/>
-                <w:szCs w:val="21"/>
+                <w:rFonts w:ascii="Arial" w:cs="Arial" w:eastAsia="Arial" w:hAnsi="Arial"/>
+                <w:color w:val="2D3748"/>
+                <w:sz w:val="20"/>
+                <w:szCs w:val="20"/>
               </w:rPr>
               <w:t xml:space="preserve">🔗 YouTube Video Link: [ PASTE YOUR YOUTUBE VIDEO LINK HERE ]</w:t>
             </w:r>
           </w:p>
           <w:p>
             <w:pPr>
-              <w:spacing w:after="40" w:before="40"/>
+              <w:spacing w:after="30" w:before="30"/>
             </w:pPr>
             <w:r>
               <w:rPr>
-                <w:rFonts w:ascii="Calibri" w:cs="Calibri" w:eastAsia="Calibri" w:hAnsi="Calibri"/>
-                <w:color w:val="2D3748"/>
-                <w:sz w:val="21"/>
-                <w:szCs w:val="21"/>
+                <w:rFonts w:ascii="Arial" w:cs="Arial" w:eastAsia="Arial" w:hAnsi="Arial"/>
+                <w:color w:val="2D3748"/>
+                <w:sz w:val="20"/>
+                <w:szCs w:val="20"/>
               </w:rPr>
               <w:t xml:space="preserve"/>
             </w:r>
           </w:p>
           <w:p>
             <w:pPr>
-              <w:spacing w:after="40" w:before="40"/>
+              <w:spacing w:after="30" w:before="30"/>
             </w:pPr>
             <w:r>
               <w:rPr>
-                <w:rFonts w:ascii="Calibri" w:cs="Calibri" w:eastAsia="Calibri" w:hAnsi="Calibri"/>
-                <w:color w:val="2D3748"/>
-                <w:sz w:val="21"/>
-                <w:szCs w:val="21"/>
-              </w:rPr>
-              <w:t xml:space="preserve">Demonstration Contents:</w:t>
+                <w:rFonts w:ascii="Arial" w:cs="Arial" w:eastAsia="Arial" w:hAnsi="Arial"/>
+                <w:color w:val="2D3748"/>
+                <w:sz w:val="20"/>
+                <w:szCs w:val="20"/>
+              </w:rPr>
+              <w:t xml:space="preserve">Demonstration Agenda:</w:t>
             </w:r>
           </w:p>
           <w:p>
             <w:pPr>
-              <w:spacing w:after="40" w:before="40"/>
+              <w:spacing w:after="30" w:before="30"/>
             </w:pPr>
             <w:r>
               <w:rPr>
-                <w:rFonts w:ascii="Calibri" w:cs="Calibri" w:eastAsia="Calibri" w:hAnsi="Calibri"/>
-                <w:color w:val="2D3748"/>
-                <w:sz w:val="21"/>
-                <w:szCs w:val="21"/>
+                <w:rFonts w:ascii="Arial" w:cs="Arial" w:eastAsia="Arial" w:hAnsi="Arial"/>
+                <w:color w:val="2D3748"/>
+                <w:sz w:val="20"/>
+                <w:szCs w:val="20"/>
               </w:rPr>
               <w:t xml:space="preserve">• 00:00 - Project Motivation &amp; AWS Serverless Architecture Overview</w:t>
             </w:r>
           </w:p>
           <w:p>
             <w:pPr>
-              <w:spacing w:after="40" w:before="40"/>
+              <w:spacing w:after="30" w:before="30"/>
             </w:pPr>
             <w:r>
               <w:rPr>
-                <w:rFonts w:ascii="Calibri" w:cs="Calibri" w:eastAsia="Calibri" w:hAnsi="Calibri"/>
-                <w:color w:val="2D3748"/>
-                <w:sz w:val="21"/>
-                <w:szCs w:val="21"/>
+                <w:rFonts w:ascii="Arial" w:cs="Arial" w:eastAsia="Arial" w:hAnsi="Arial"/>
+                <w:color w:val="2D3748"/>
+                <w:sz w:val="20"/>
+                <w:szCs w:val="20"/>
               </w:rPr>
               <w:t xml:space="preserve">• 02:15 - Live Facial Recognition Attendance Session &amp; 1-Click Face Enrollment</w:t>
             </w:r>
           </w:p>
           <w:p>
             <w:pPr>
-              <w:spacing w:after="40" w:before="40"/>
+              <w:spacing w:after="30" w:before="30"/>
             </w:pPr>
             <w:r>
               <w:rPr>
-                <w:rFonts w:ascii="Calibri" w:cs="Calibri" w:eastAsia="Calibri" w:hAnsi="Calibri"/>
-                <w:color w:val="2D3748"/>
-                <w:sz w:val="21"/>
-                <w:szCs w:val="21"/>
+                <w:rFonts w:ascii="Arial" w:cs="Arial" w:eastAsia="Arial" w:hAnsi="Arial"/>
+                <w:color w:val="2D3748"/>
+                <w:sz w:val="20"/>
+                <w:szCs w:val="20"/>
               </w:rPr>
               <w:t xml:space="preserve">• 04:30 - Weekly Master Timetable Matrix &amp; Dynamic Student Roster Scheduling</w:t>
             </w:r>
           </w:p>
           <w:p>
             <w:pPr>
-              <w:spacing w:after="40" w:before="40"/>
+              <w:spacing w:after="30" w:before="30"/>
             </w:pPr>
             <w:r>
               <w:rPr>
-                <w:rFonts w:ascii="Calibri" w:cs="Calibri" w:eastAsia="Calibri" w:hAnsi="Calibri"/>
-                <w:color w:val="2D3748"/>
-                <w:sz w:val="21"/>
-                <w:szCs w:val="21"/>
+                <w:rFonts w:ascii="Arial" w:cs="Arial" w:eastAsia="Arial" w:hAnsi="Arial"/>
+                <w:color w:val="2D3748"/>
+                <w:sz w:val="20"/>
+                <w:szCs w:val="20"/>
               </w:rPr>
               <w:t xml:space="preserve">• 06:45 - Amazon SNS 24-Hour Unmarked Class Notification Dispatch &amp; Cloud Console Verification</w:t>
             </w:r>
           </w:p>
           <w:p>
             <w:pPr>
-              <w:spacing w:after="40" w:before="40"/>
+              <w:spacing w:after="30" w:before="30"/>
             </w:pPr>
             <w:r>
               <w:rPr>
-                <w:rFonts w:ascii="Calibri" w:cs="Calibri" w:eastAsia="Calibri" w:hAnsi="Calibri"/>
-                <w:color w:val="2D3748"/>
-                <w:sz w:val="21"/>
-                <w:szCs w:val="21"/>
+                <w:rFonts w:ascii="Arial" w:cs="Arial" w:eastAsia="Arial" w:hAnsi="Arial"/>
+                <w:color w:val="2D3748"/>
+                <w:sz w:val="20"/>
+                <w:szCs w:val="20"/>
               </w:rPr>
               <w:t xml:space="preserve">• 08:30 - Terraform Automated Cloud Provisioning &amp; Deployment Walkthrough</w:t>
             </w:r>
@@ -890,23 +890,23 @@
     </w:tbl>
     <w:p>
       <w:pPr>
-        <w:spacing w:after="120" w:before="240"/>
+        <w:spacing w:after="100" w:before="180"/>
       </w:pPr>
     </w:p>
     <w:p>
       <w:pPr>
         <w:pStyle w:val="Heading1"/>
         <w:spacing w:after="140" w:before="360"/>
-        <w:rPr>
-          <w:rFonts w:ascii="Calibri" w:cs="Calibri" w:eastAsia="Calibri" w:hAnsi="Calibri"/>
+      </w:pPr>
+      <w:r>
+        <w:rPr>
+          <w:rFonts w:ascii="Arial" w:cs="Arial" w:eastAsia="Arial" w:hAnsi="Arial"/>
           <w:b/>
           <w:bCs/>
           <w:color w:val="0A2540"/>
-          <w:sz w:val="32"/>
-          <w:szCs w:val="32"/>
-        </w:rPr>
-      </w:pPr>
-      <w:r>
+          <w:sz w:val="30"/>
+          <w:szCs w:val="30"/>
+        </w:rPr>
         <w:t xml:space="preserve">1. Executive Summary &amp; Problem Statement</w:t>
       </w:r>
     </w:p>
@@ -916,14 +916,14 @@
       </w:pPr>
       <w:r>
         <w:rPr>
-          <w:rFonts w:ascii="Calibri" w:cs="Calibri" w:eastAsia="Calibri" w:hAnsi="Calibri"/>
+          <w:rFonts w:ascii="Arial" w:cs="Arial" w:eastAsia="Arial" w:hAnsi="Arial"/>
           <w:b w:val="false"/>
           <w:bCs w:val="false"/>
           <w:i w:val="false"/>
           <w:iCs w:val="false"/>
           <w:color w:val="2D3748"/>
-          <w:sz w:val="22"/>
-          <w:szCs w:val="22"/>
+          <w:sz w:val="21"/>
+          <w:szCs w:val="21"/>
         </w:rPr>
         <w:t xml:space="preserve">Traditional educational attendance management systems suffer from high administrative overhead, manual transcription errors, proxy attendance, and rigid schedules. In addition, legacy on-premise attendance software often requires expensive dedicated hardware and ongoing server maintenance.</w:t>
       </w:r>
@@ -934,14 +934,14 @@
       </w:pPr>
       <w:r>
         <w:rPr>
-          <w:rFonts w:ascii="Calibri" w:cs="Calibri" w:eastAsia="Calibri" w:hAnsi="Calibri"/>
+          <w:rFonts w:ascii="Arial" w:cs="Arial" w:eastAsia="Arial" w:hAnsi="Arial"/>
           <w:b w:val="false"/>
           <w:bCs w:val="false"/>
           <w:i w:val="false"/>
           <w:iCs w:val="false"/>
           <w:color w:val="2D3748"/>
-          <w:sz w:val="22"/>
-          <w:szCs w:val="22"/>
+          <w:sz w:val="21"/>
+          <w:szCs w:val="21"/>
         </w:rPr>
         <w:t xml:space="preserve">Presently solves these challenges by delivering a cloud-native, serverless attendance and classroom management platform powered entirely by AWS Free Tier infrastructure. Utilizing Amazon Rekognition for high-confidence biometric AI verification, Amazon DynamoDB for millisecond-latency data retrieval, Amazon Cognito for secure faculty authentication, and Amazon CloudFront for edge-cached web delivery, Presently eliminates proxy attendance while guaranteeing zero server idle costs.</w:t>
       </w:r>
@@ -950,16 +950,16 @@
       <w:pPr>
         <w:pStyle w:val="Heading1"/>
         <w:spacing w:after="140" w:before="360"/>
-        <w:rPr>
-          <w:rFonts w:ascii="Calibri" w:cs="Calibri" w:eastAsia="Calibri" w:hAnsi="Calibri"/>
+      </w:pPr>
+      <w:r>
+        <w:rPr>
+          <w:rFonts w:ascii="Arial" w:cs="Arial" w:eastAsia="Arial" w:hAnsi="Arial"/>
           <w:b/>
           <w:bCs/>
           <w:color w:val="0A2540"/>
-          <w:sz w:val="32"/>
-          <w:szCs w:val="32"/>
-        </w:rPr>
-      </w:pPr>
-      <w:r>
+          <w:sz w:val="30"/>
+          <w:szCs w:val="30"/>
+        </w:rPr>
         <w:t xml:space="preserve">2. Vibe Coding Journey — Prompts &amp; Solutions Generated</w:t>
       </w:r>
     </w:p>
@@ -969,14 +969,14 @@
       </w:pPr>
       <w:r>
         <w:rPr>
-          <w:rFonts w:ascii="Calibri" w:cs="Calibri" w:eastAsia="Calibri" w:hAnsi="Calibri"/>
+          <w:rFonts w:ascii="Arial" w:cs="Arial" w:eastAsia="Arial" w:hAnsi="Arial"/>
           <w:b w:val="false"/>
           <w:bCs w:val="false"/>
           <w:i w:val="false"/>
           <w:iCs w:val="false"/>
           <w:color w:val="2D3748"/>
-          <w:sz w:val="22"/>
-          <w:szCs w:val="22"/>
+          <w:sz w:val="21"/>
+          <w:szCs w:val="21"/>
         </w:rPr>
         <w:t xml:space="preserve">The entire Presently application was architected, implemented, iterated, and deployed using advanced Agentic AI Pair Programming (Vibe Coding). Below is the comprehensive log of key user prompts, challenges encountered, root-cause analyses, and solutions engineered throughout the lifecycle:</w:t>
       </w:r>
@@ -1006,10 +1006,10 @@
           <w:tcPr>
             <w:shd w:fill="0A2540" w:val="clear"/>
             <w:tcMar>
-              <w:top w:type="dxa" w:w="120"/>
-              <w:left w:type="dxa" w:w="140"/>
-              <w:bottom w:type="dxa" w:w="120"/>
-              <w:right w:type="dxa" w:w="140"/>
+              <w:top w:type="dxa" w:w="100"/>
+              <w:left w:type="dxa" w:w="120"/>
+              <w:bottom w:type="dxa" w:w="100"/>
+              <w:right w:type="dxa" w:w="120"/>
             </w:tcMar>
           </w:tcPr>
           <w:p>
@@ -1018,12 +1018,12 @@
             </w:pPr>
             <w:r>
               <w:rPr>
-                <w:rFonts w:ascii="Calibri" w:cs="Calibri" w:eastAsia="Calibri" w:hAnsi="Calibri"/>
+                <w:rFonts w:ascii="Arial" w:cs="Arial" w:eastAsia="Arial" w:hAnsi="Arial"/>
                 <w:b/>
                 <w:bCs/>
                 <w:color w:val="FFFFFF"/>
-                <w:sz w:val="20"/>
-                <w:szCs w:val="20"/>
+                <w:sz w:val="19"/>
+                <w:szCs w:val="19"/>
               </w:rPr>
               <w:t xml:space="preserve">Phase &amp; Prompt #</w:t>
             </w:r>
@@ -1033,10 +1033,10 @@
           <w:tcPr>
             <w:shd w:fill="0A2540" w:val="clear"/>
             <w:tcMar>
-              <w:top w:type="dxa" w:w="120"/>
-              <w:left w:type="dxa" w:w="140"/>
-              <w:bottom w:type="dxa" w:w="120"/>
-              <w:right w:type="dxa" w:w="140"/>
+              <w:top w:type="dxa" w:w="100"/>
+              <w:left w:type="dxa" w:w="120"/>
+              <w:bottom w:type="dxa" w:w="100"/>
+              <w:right w:type="dxa" w:w="120"/>
             </w:tcMar>
           </w:tcPr>
           <w:p>
@@ -1045,12 +1045,12 @@
             </w:pPr>
             <w:r>
               <w:rPr>
-                <w:rFonts w:ascii="Calibri" w:cs="Calibri" w:eastAsia="Calibri" w:hAnsi="Calibri"/>
+                <w:rFonts w:ascii="Arial" w:cs="Arial" w:eastAsia="Arial" w:hAnsi="Arial"/>
                 <w:b/>
                 <w:bCs/>
                 <w:color w:val="FFFFFF"/>
-                <w:sz w:val="20"/>
-                <w:szCs w:val="20"/>
+                <w:sz w:val="19"/>
+                <w:szCs w:val="19"/>
               </w:rPr>
               <w:t xml:space="preserve">User Prompt / Instruction</w:t>
             </w:r>
@@ -1060,10 +1060,10 @@
           <w:tcPr>
             <w:shd w:fill="0A2540" w:val="clear"/>
             <w:tcMar>
-              <w:top w:type="dxa" w:w="120"/>
-              <w:left w:type="dxa" w:w="140"/>
-              <w:bottom w:type="dxa" w:w="120"/>
-              <w:right w:type="dxa" w:w="140"/>
+              <w:top w:type="dxa" w:w="100"/>
+              <w:left w:type="dxa" w:w="120"/>
+              <w:bottom w:type="dxa" w:w="100"/>
+              <w:right w:type="dxa" w:w="120"/>
             </w:tcMar>
           </w:tcPr>
           <w:p>
@@ -1072,12 +1072,12 @@
             </w:pPr>
             <w:r>
               <w:rPr>
-                <w:rFonts w:ascii="Calibri" w:cs="Calibri" w:eastAsia="Calibri" w:hAnsi="Calibri"/>
+                <w:rFonts w:ascii="Arial" w:cs="Arial" w:eastAsia="Arial" w:hAnsi="Arial"/>
                 <w:b/>
                 <w:bCs/>
                 <w:color w:val="FFFFFF"/>
-                <w:sz w:val="20"/>
-                <w:szCs w:val="20"/>
+                <w:sz w:val="19"/>
+                <w:szCs w:val="19"/>
               </w:rPr>
               <w:t xml:space="preserve">Technical Challenge &amp; Agentic Solution Generated</w:t>
             </w:r>
@@ -1095,19 +1095,19 @@
             </w:tcBorders>
             <w:shd w:fill="FFFFFF" w:val="clear"/>
             <w:tcMar>
-              <w:top w:type="dxa" w:w="100"/>
-              <w:left w:type="dxa" w:w="140"/>
-              <w:bottom w:type="dxa" w:w="100"/>
-              <w:right w:type="dxa" w:w="140"/>
-            </w:tcMar>
-          </w:tcPr>
-          <w:p>
-            <w:r>
-              <w:rPr>
-                <w:rFonts w:ascii="Calibri" w:cs="Calibri" w:eastAsia="Calibri" w:hAnsi="Calibri"/>
-                <w:color w:val="2D3748"/>
-                <w:sz w:val="20"/>
-                <w:szCs w:val="20"/>
+              <w:top w:type="dxa" w:w="80"/>
+              <w:left w:type="dxa" w:w="120"/>
+              <w:bottom w:type="dxa" w:w="80"/>
+              <w:right w:type="dxa" w:w="120"/>
+            </w:tcMar>
+          </w:tcPr>
+          <w:p>
+            <w:r>
+              <w:rPr>
+                <w:rFonts w:ascii="Arial" w:cs="Arial" w:eastAsia="Arial" w:hAnsi="Arial"/>
+                <w:color w:val="2D3748"/>
+                <w:sz w:val="19"/>
+                <w:szCs w:val="19"/>
               </w:rPr>
               <w:t xml:space="preserve">1. Initialization</w:t>
             </w:r>
@@ -1123,19 +1123,19 @@
             </w:tcBorders>
             <w:shd w:fill="FFFFFF" w:val="clear"/>
             <w:tcMar>
-              <w:top w:type="dxa" w:w="100"/>
-              <w:left w:type="dxa" w:w="140"/>
-              <w:bottom w:type="dxa" w:w="100"/>
-              <w:right w:type="dxa" w:w="140"/>
-            </w:tcMar>
-          </w:tcPr>
-          <w:p>
-            <w:r>
-              <w:rPr>
-                <w:rFonts w:ascii="Calibri" w:cs="Calibri" w:eastAsia="Calibri" w:hAnsi="Calibri"/>
-                <w:color w:val="2D3748"/>
-                <w:sz w:val="20"/>
-                <w:szCs w:val="20"/>
+              <w:top w:type="dxa" w:w="80"/>
+              <w:left w:type="dxa" w:w="120"/>
+              <w:bottom w:type="dxa" w:w="80"/>
+              <w:right w:type="dxa" w:w="120"/>
+            </w:tcMar>
+          </w:tcPr>
+          <w:p>
+            <w:r>
+              <w:rPr>
+                <w:rFonts w:ascii="Arial" w:cs="Arial" w:eastAsia="Arial" w:hAnsi="Arial"/>
+                <w:color w:val="2D3748"/>
+                <w:sz w:val="19"/>
+                <w:szCs w:val="19"/>
               </w:rPr>
               <w:t xml:space="preserve">"lets run to check the application &amp; everything should work like terraform"</w:t>
             </w:r>
@@ -1151,19 +1151,19 @@
             </w:tcBorders>
             <w:shd w:fill="FFFFFF" w:val="clear"/>
             <w:tcMar>
-              <w:top w:type="dxa" w:w="100"/>
-              <w:left w:type="dxa" w:w="140"/>
-              <w:bottom w:type="dxa" w:w="100"/>
-              <w:right w:type="dxa" w:w="140"/>
-            </w:tcMar>
-          </w:tcPr>
-          <w:p>
-            <w:r>
-              <w:rPr>
-                <w:rFonts w:ascii="Calibri" w:cs="Calibri" w:eastAsia="Calibri" w:hAnsi="Calibri"/>
-                <w:color w:val="2D3748"/>
-                <w:sz w:val="20"/>
-                <w:szCs w:val="20"/>
+              <w:top w:type="dxa" w:w="80"/>
+              <w:left w:type="dxa" w:w="120"/>
+              <w:bottom w:type="dxa" w:w="80"/>
+              <w:right w:type="dxa" w:w="120"/>
+            </w:tcMar>
+          </w:tcPr>
+          <w:p>
+            <w:r>
+              <w:rPr>
+                <w:rFonts w:ascii="Arial" w:cs="Arial" w:eastAsia="Arial" w:hAnsi="Arial"/>
+                <w:color w:val="2D3748"/>
+                <w:sz w:val="19"/>
+                <w:szCs w:val="19"/>
               </w:rPr>
               <w:t xml:space="preserve">Verified Terraform state outputs (API Gateway, DynamoDB tables, Cognito Pool, S3 buckets). Created frontend/.env configuration to bridge the React client directly to live AWS endpoints in ap-south-1.</w:t>
             </w:r>
@@ -1181,19 +1181,19 @@
             </w:tcBorders>
             <w:shd w:fill="F7FAFC" w:val="clear"/>
             <w:tcMar>
-              <w:top w:type="dxa" w:w="100"/>
-              <w:left w:type="dxa" w:w="140"/>
-              <w:bottom w:type="dxa" w:w="100"/>
-              <w:right w:type="dxa" w:w="140"/>
-            </w:tcMar>
-          </w:tcPr>
-          <w:p>
-            <w:r>
-              <w:rPr>
-                <w:rFonts w:ascii="Calibri" w:cs="Calibri" w:eastAsia="Calibri" w:hAnsi="Calibri"/>
-                <w:color w:val="2D3748"/>
-                <w:sz w:val="20"/>
-                <w:szCs w:val="20"/>
+              <w:top w:type="dxa" w:w="80"/>
+              <w:left w:type="dxa" w:w="120"/>
+              <w:bottom w:type="dxa" w:w="80"/>
+              <w:right w:type="dxa" w:w="120"/>
+            </w:tcMar>
+          </w:tcPr>
+          <w:p>
+            <w:r>
+              <w:rPr>
+                <w:rFonts w:ascii="Arial" w:cs="Arial" w:eastAsia="Arial" w:hAnsi="Arial"/>
+                <w:color w:val="2D3748"/>
+                <w:sz w:val="19"/>
+                <w:szCs w:val="19"/>
               </w:rPr>
               <w:t xml:space="preserve">2. Dynamic Identity</w:t>
             </w:r>
@@ -1209,19 +1209,19 @@
             </w:tcBorders>
             <w:shd w:fill="F7FAFC" w:val="clear"/>
             <w:tcMar>
-              <w:top w:type="dxa" w:w="100"/>
-              <w:left w:type="dxa" w:w="140"/>
-              <w:bottom w:type="dxa" w:w="100"/>
-              <w:right w:type="dxa" w:w="140"/>
-            </w:tcMar>
-          </w:tcPr>
-          <w:p>
-            <w:r>
-              <w:rPr>
-                <w:rFonts w:ascii="Calibri" w:cs="Calibri" w:eastAsia="Calibri" w:hAnsi="Calibri"/>
-                <w:color w:val="2D3748"/>
-                <w:sz w:val="20"/>
-                <w:szCs w:val="20"/>
+              <w:top w:type="dxa" w:w="80"/>
+              <w:left w:type="dxa" w:w="120"/>
+              <w:bottom w:type="dxa" w:w="80"/>
+              <w:right w:type="dxa" w:w="120"/>
+            </w:tcMar>
+          </w:tcPr>
+          <w:p>
+            <w:r>
+              <w:rPr>
+                <w:rFonts w:ascii="Arial" w:cs="Arial" w:eastAsia="Arial" w:hAnsi="Arial"/>
+                <w:color w:val="2D3748"/>
+                <w:sz w:val="19"/>
+                <w:szCs w:val="19"/>
               </w:rPr>
               <w:t xml:space="preserve">"here it just gave me the name aarav sharma but shouldnt it ask for my name also ask me which subject am i enrolled in"</w:t>
             </w:r>
@@ -1237,19 +1237,19 @@
             </w:tcBorders>
             <w:shd w:fill="F7FAFC" w:val="clear"/>
             <w:tcMar>
-              <w:top w:type="dxa" w:w="100"/>
-              <w:left w:type="dxa" w:w="140"/>
-              <w:bottom w:type="dxa" w:w="100"/>
-              <w:right w:type="dxa" w:w="140"/>
-            </w:tcMar>
-          </w:tcPr>
-          <w:p>
-            <w:r>
-              <w:rPr>
-                <w:rFonts w:ascii="Calibri" w:cs="Calibri" w:eastAsia="Calibri" w:hAnsi="Calibri"/>
-                <w:color w:val="2D3748"/>
-                <w:sz w:val="20"/>
-                <w:szCs w:val="20"/>
+              <w:top w:type="dxa" w:w="80"/>
+              <w:left w:type="dxa" w:w="120"/>
+              <w:bottom w:type="dxa" w:w="80"/>
+              <w:right w:type="dxa" w:w="120"/>
+            </w:tcMar>
+          </w:tcPr>
+          <w:p>
+            <w:r>
+              <w:rPr>
+                <w:rFonts w:ascii="Arial" w:cs="Arial" w:eastAsia="Arial" w:hAnsi="Arial"/>
+                <w:color w:val="2D3748"/>
+                <w:sz w:val="19"/>
+                <w:szCs w:val="19"/>
               </w:rPr>
               <w:t xml:space="preserve">Eliminated hardcoded student defaults (STU001 / Aarav Sharma). Re-engineered auth.js and students.py to dynamically query and bind individual profiles, unique roll numbers, and assigned subjects by email address.</w:t>
             </w:r>
@@ -1267,19 +1267,19 @@
             </w:tcBorders>
             <w:shd w:fill="FFFFFF" w:val="clear"/>
             <w:tcMar>
-              <w:top w:type="dxa" w:w="100"/>
-              <w:left w:type="dxa" w:w="140"/>
-              <w:bottom w:type="dxa" w:w="100"/>
-              <w:right w:type="dxa" w:w="140"/>
-            </w:tcMar>
-          </w:tcPr>
-          <w:p>
-            <w:r>
-              <w:rPr>
-                <w:rFonts w:ascii="Calibri" w:cs="Calibri" w:eastAsia="Calibri" w:hAnsi="Calibri"/>
-                <w:color w:val="2D3748"/>
-                <w:sz w:val="20"/>
-                <w:szCs w:val="20"/>
+              <w:top w:type="dxa" w:w="80"/>
+              <w:left w:type="dxa" w:w="120"/>
+              <w:bottom w:type="dxa" w:w="80"/>
+              <w:right w:type="dxa" w:w="120"/>
+            </w:tcMar>
+          </w:tcPr>
+          <w:p>
+            <w:r>
+              <w:rPr>
+                <w:rFonts w:ascii="Arial" w:cs="Arial" w:eastAsia="Arial" w:hAnsi="Arial"/>
+                <w:color w:val="2D3748"/>
+                <w:sz w:val="19"/>
+                <w:szCs w:val="19"/>
               </w:rPr>
               <w:t xml:space="preserve">3. Bug Resolution</w:t>
             </w:r>
@@ -1295,19 +1295,19 @@
             </w:tcBorders>
             <w:shd w:fill="FFFFFF" w:val="clear"/>
             <w:tcMar>
-              <w:top w:type="dxa" w:w="100"/>
-              <w:left w:type="dxa" w:w="140"/>
-              <w:bottom w:type="dxa" w:w="100"/>
-              <w:right w:type="dxa" w:w="140"/>
-            </w:tcMar>
-          </w:tcPr>
-          <w:p>
-            <w:r>
-              <w:rPr>
-                <w:rFonts w:ascii="Calibri" w:cs="Calibri" w:eastAsia="Calibri" w:hAnsi="Calibri"/>
-                <w:color w:val="2D3748"/>
-                <w:sz w:val="20"/>
-                <w:szCs w:val="20"/>
+              <w:top w:type="dxa" w:w="80"/>
+              <w:left w:type="dxa" w:w="120"/>
+              <w:bottom w:type="dxa" w:w="80"/>
+              <w:right w:type="dxa" w:w="120"/>
+            </w:tcMar>
+          </w:tcPr>
+          <w:p>
+            <w:r>
+              <w:rPr>
+                <w:rFonts w:ascii="Arial" w:cs="Arial" w:eastAsia="Arial" w:hAnsi="Arial"/>
+                <w:color w:val="2D3748"/>
+                <w:sz w:val="19"/>
+                <w:szCs w:val="19"/>
               </w:rPr>
               <w:t xml:space="preserve">"nothing appearing / its showing a white screen"</w:t>
             </w:r>
@@ -1323,19 +1323,19 @@
             </w:tcBorders>
             <w:shd w:fill="FFFFFF" w:val="clear"/>
             <w:tcMar>
-              <w:top w:type="dxa" w:w="100"/>
-              <w:left w:type="dxa" w:w="140"/>
-              <w:bottom w:type="dxa" w:w="100"/>
-              <w:right w:type="dxa" w:w="140"/>
-            </w:tcMar>
-          </w:tcPr>
-          <w:p>
-            <w:r>
-              <w:rPr>
-                <w:rFonts w:ascii="Calibri" w:cs="Calibri" w:eastAsia="Calibri" w:hAnsi="Calibri"/>
-                <w:color w:val="2D3748"/>
-                <w:sz w:val="20"/>
-                <w:szCs w:val="20"/>
+              <w:top w:type="dxa" w:w="80"/>
+              <w:left w:type="dxa" w:w="120"/>
+              <w:bottom w:type="dxa" w:w="80"/>
+              <w:right w:type="dxa" w:w="120"/>
+            </w:tcMar>
+          </w:tcPr>
+          <w:p>
+            <w:r>
+              <w:rPr>
+                <w:rFonts w:ascii="Arial" w:cs="Arial" w:eastAsia="Arial" w:hAnsi="Arial"/>
+                <w:color w:val="2D3748"/>
+                <w:sz w:val="19"/>
+                <w:szCs w:val="19"/>
               </w:rPr>
               <w:t xml:space="preserve">Diagnosed two fatal client-side crashes: (1) React Hook rule violation in StudentRosterPage.jsx caused by hook execution after an early return, and (2) Missing logout declaration in AuthContext.jsx causing an uncaught ReferenceError. Fixed hook ordering, defined logout handler, and verified clean Vite bundle builds.</w:t>
             </w:r>
@@ -1353,19 +1353,19 @@
             </w:tcBorders>
             <w:shd w:fill="F7FAFC" w:val="clear"/>
             <w:tcMar>
-              <w:top w:type="dxa" w:w="100"/>
-              <w:left w:type="dxa" w:w="140"/>
-              <w:bottom w:type="dxa" w:w="100"/>
-              <w:right w:type="dxa" w:w="140"/>
-            </w:tcMar>
-          </w:tcPr>
-          <w:p>
-            <w:r>
-              <w:rPr>
-                <w:rFonts w:ascii="Calibri" w:cs="Calibri" w:eastAsia="Calibri" w:hAnsi="Calibri"/>
-                <w:color w:val="2D3748"/>
-                <w:sz w:val="20"/>
-                <w:szCs w:val="20"/>
+              <w:top w:type="dxa" w:w="80"/>
+              <w:left w:type="dxa" w:w="120"/>
+              <w:bottom w:type="dxa" w:w="80"/>
+              <w:right w:type="dxa" w:w="120"/>
+            </w:tcMar>
+          </w:tcPr>
+          <w:p>
+            <w:r>
+              <w:rPr>
+                <w:rFonts w:ascii="Arial" w:cs="Arial" w:eastAsia="Arial" w:hAnsi="Arial"/>
+                <w:color w:val="2D3748"/>
+                <w:sz w:val="19"/>
+                <w:szCs w:val="19"/>
               </w:rPr>
               <w:t xml:space="preserve">4. Architectural Pivot</w:t>
             </w:r>
@@ -1381,19 +1381,19 @@
             </w:tcBorders>
             <w:shd w:fill="F7FAFC" w:val="clear"/>
             <w:tcMar>
-              <w:top w:type="dxa" w:w="100"/>
-              <w:left w:type="dxa" w:w="140"/>
-              <w:bottom w:type="dxa" w:w="100"/>
-              <w:right w:type="dxa" w:w="140"/>
-            </w:tcMar>
-          </w:tcPr>
-          <w:p>
-            <w:r>
-              <w:rPr>
-                <w:rFonts w:ascii="Calibri" w:cs="Calibri" w:eastAsia="Calibri" w:hAnsi="Calibri"/>
-                <w:color w:val="2D3748"/>
-                <w:sz w:val="20"/>
-                <w:szCs w:val="20"/>
+              <w:top w:type="dxa" w:w="80"/>
+              <w:left w:type="dxa" w:w="120"/>
+              <w:bottom w:type="dxa" w:w="80"/>
+              <w:right w:type="dxa" w:w="120"/>
+            </w:tcMar>
+          </w:tcPr>
+          <w:p>
+            <w:r>
+              <w:rPr>
+                <w:rFonts w:ascii="Arial" w:cs="Arial" w:eastAsia="Arial" w:hAnsi="Arial"/>
+                <w:color w:val="2D3748"/>
+                <w:sz w:val="19"/>
+                <w:szCs w:val="19"/>
               </w:rPr>
               <w:t xml:space="preserve">"basically dont change anything in the teacher part just remove the student part completely"</w:t>
             </w:r>
@@ -1409,19 +1409,19 @@
             </w:tcBorders>
             <w:shd w:fill="F7FAFC" w:val="clear"/>
             <w:tcMar>
-              <w:top w:type="dxa" w:w="100"/>
-              <w:left w:type="dxa" w:w="140"/>
-              <w:bottom w:type="dxa" w:w="100"/>
-              <w:right w:type="dxa" w:w="140"/>
-            </w:tcMar>
-          </w:tcPr>
-          <w:p>
-            <w:r>
-              <w:rPr>
-                <w:rFonts w:ascii="Calibri" w:cs="Calibri" w:eastAsia="Calibri" w:hAnsi="Calibri"/>
-                <w:color w:val="2D3748"/>
-                <w:sz w:val="20"/>
-                <w:szCs w:val="20"/>
+              <w:top w:type="dxa" w:w="80"/>
+              <w:left w:type="dxa" w:w="120"/>
+              <w:bottom w:type="dxa" w:w="80"/>
+              <w:right w:type="dxa" w:w="120"/>
+            </w:tcMar>
+          </w:tcPr>
+          <w:p>
+            <w:r>
+              <w:rPr>
+                <w:rFonts w:ascii="Arial" w:cs="Arial" w:eastAsia="Arial" w:hAnsi="Arial"/>
+                <w:color w:val="2D3748"/>
+                <w:sz w:val="19"/>
+                <w:szCs w:val="19"/>
               </w:rPr>
               <w:t xml:space="preserve">Streamlined the platform into a dedicated Faculty &amp; Classroom Management Suite. Removed student-facing routing, student sidebars, and obsolete student modals. Preserved 100% of teacher capabilities (Timetable, Face Recognition, Roster, Subject Settings, SNS Alerts).</w:t>
             </w:r>
@@ -1439,19 +1439,19 @@
             </w:tcBorders>
             <w:shd w:fill="FFFFFF" w:val="clear"/>
             <w:tcMar>
-              <w:top w:type="dxa" w:w="100"/>
-              <w:left w:type="dxa" w:w="140"/>
-              <w:bottom w:type="dxa" w:w="100"/>
-              <w:right w:type="dxa" w:w="140"/>
-            </w:tcMar>
-          </w:tcPr>
-          <w:p>
-            <w:r>
-              <w:rPr>
-                <w:rFonts w:ascii="Calibri" w:cs="Calibri" w:eastAsia="Calibri" w:hAnsi="Calibri"/>
-                <w:color w:val="2D3748"/>
-                <w:sz w:val="20"/>
-                <w:szCs w:val="20"/>
+              <w:top w:type="dxa" w:w="80"/>
+              <w:left w:type="dxa" w:w="120"/>
+              <w:bottom w:type="dxa" w:w="80"/>
+              <w:right w:type="dxa" w:w="120"/>
+            </w:tcMar>
+          </w:tcPr>
+          <w:p>
+            <w:r>
+              <w:rPr>
+                <w:rFonts w:ascii="Arial" w:cs="Arial" w:eastAsia="Arial" w:hAnsi="Arial"/>
+                <w:color w:val="2D3748"/>
+                <w:sz w:val="19"/>
+                <w:szCs w:val="19"/>
               </w:rPr>
               <w:t xml:space="preserve">5. Authentication</w:t>
             </w:r>
@@ -1467,19 +1467,19 @@
             </w:tcBorders>
             <w:shd w:fill="FFFFFF" w:val="clear"/>
             <w:tcMar>
-              <w:top w:type="dxa" w:w="100"/>
-              <w:left w:type="dxa" w:w="140"/>
-              <w:bottom w:type="dxa" w:w="100"/>
-              <w:right w:type="dxa" w:w="140"/>
-            </w:tcMar>
-          </w:tcPr>
-          <w:p>
-            <w:r>
-              <w:rPr>
-                <w:rFonts w:ascii="Calibri" w:cs="Calibri" w:eastAsia="Calibri" w:hAnsi="Calibri"/>
-                <w:color w:val="2D3748"/>
-                <w:sz w:val="20"/>
-                <w:szCs w:val="20"/>
+              <w:top w:type="dxa" w:w="80"/>
+              <w:left w:type="dxa" w:w="120"/>
+              <w:bottom w:type="dxa" w:w="80"/>
+              <w:right w:type="dxa" w:w="120"/>
+            </w:tcMar>
+          </w:tcPr>
+          <w:p>
+            <w:r>
+              <w:rPr>
+                <w:rFonts w:ascii="Arial" w:cs="Arial" w:eastAsia="Arial" w:hAnsi="Arial"/>
+                <w:color w:val="2D3748"/>
+                <w:sz w:val="19"/>
+                <w:szCs w:val="19"/>
               </w:rPr>
               <w:t xml:space="preserve">"BUT COGNITO NOT WORKING"</w:t>
             </w:r>
@@ -1495,19 +1495,19 @@
             </w:tcBorders>
             <w:shd w:fill="FFFFFF" w:val="clear"/>
             <w:tcMar>
-              <w:top w:type="dxa" w:w="100"/>
-              <w:left w:type="dxa" w:w="140"/>
-              <w:bottom w:type="dxa" w:w="100"/>
-              <w:right w:type="dxa" w:w="140"/>
-            </w:tcMar>
-          </w:tcPr>
-          <w:p>
-            <w:r>
-              <w:rPr>
-                <w:rFonts w:ascii="Calibri" w:cs="Calibri" w:eastAsia="Calibri" w:hAnsi="Calibri"/>
-                <w:color w:val="2D3748"/>
-                <w:sz w:val="20"/>
-                <w:szCs w:val="20"/>
+              <w:top w:type="dxa" w:w="80"/>
+              <w:left w:type="dxa" w:w="120"/>
+              <w:bottom w:type="dxa" w:w="80"/>
+              <w:right w:type="dxa" w:w="120"/>
+            </w:tcMar>
+          </w:tcPr>
+          <w:p>
+            <w:r>
+              <w:rPr>
+                <w:rFonts w:ascii="Arial" w:cs="Arial" w:eastAsia="Arial" w:hAnsi="Arial"/>
+                <w:color w:val="2D3748"/>
+                <w:sz w:val="19"/>
+                <w:szCs w:val="19"/>
               </w:rPr>
               <w:t xml:space="preserve">Fixed mock fallback bypassing in auth.js. Added window global polyfill in vite.config.js for amazon-cognito-identity-js SRP protocol execution. Verified seamless AWS Cognito User Pool authentication with JWT token lifecycle.</w:t>
             </w:r>
@@ -1525,19 +1525,19 @@
             </w:tcBorders>
             <w:shd w:fill="F7FAFC" w:val="clear"/>
             <w:tcMar>
-              <w:top w:type="dxa" w:w="100"/>
-              <w:left w:type="dxa" w:w="140"/>
-              <w:bottom w:type="dxa" w:w="100"/>
-              <w:right w:type="dxa" w:w="140"/>
-            </w:tcMar>
-          </w:tcPr>
-          <w:p>
-            <w:r>
-              <w:rPr>
-                <w:rFonts w:ascii="Calibri" w:cs="Calibri" w:eastAsia="Calibri" w:hAnsi="Calibri"/>
-                <w:color w:val="2D3748"/>
-                <w:sz w:val="20"/>
-                <w:szCs w:val="20"/>
+              <w:top w:type="dxa" w:w="80"/>
+              <w:left w:type="dxa" w:w="120"/>
+              <w:bottom w:type="dxa" w:w="80"/>
+              <w:right w:type="dxa" w:w="120"/>
+            </w:tcMar>
+          </w:tcPr>
+          <w:p>
+            <w:r>
+              <w:rPr>
+                <w:rFonts w:ascii="Arial" w:cs="Arial" w:eastAsia="Arial" w:hAnsi="Arial"/>
+                <w:color w:val="2D3748"/>
+                <w:sz w:val="19"/>
+                <w:szCs w:val="19"/>
               </w:rPr>
               <w:t xml:space="preserve">6. Biometric AI Enrollment</w:t>
             </w:r>
@@ -1553,19 +1553,19 @@
             </w:tcBorders>
             <w:shd w:fill="F7FAFC" w:val="clear"/>
             <w:tcMar>
-              <w:top w:type="dxa" w:w="100"/>
-              <w:left w:type="dxa" w:w="140"/>
-              <w:bottom w:type="dxa" w:w="100"/>
-              <w:right w:type="dxa" w:w="140"/>
-            </w:tcMar>
-          </w:tcPr>
-          <w:p>
-            <w:r>
-              <w:rPr>
-                <w:rFonts w:ascii="Calibri" w:cs="Calibri" w:eastAsia="Calibri" w:hAnsi="Calibri"/>
-                <w:color w:val="2D3748"/>
-                <w:sz w:val="20"/>
-                <w:szCs w:val="20"/>
+              <w:top w:type="dxa" w:w="80"/>
+              <w:left w:type="dxa" w:w="120"/>
+              <w:bottom w:type="dxa" w:w="80"/>
+              <w:right w:type="dxa" w:w="120"/>
+            </w:tcMar>
+          </w:tcPr>
+          <w:p>
+            <w:r>
+              <w:rPr>
+                <w:rFonts w:ascii="Arial" w:cs="Arial" w:eastAsia="Arial" w:hAnsi="Arial"/>
+                <w:color w:val="2D3748"/>
+                <w:sz w:val="19"/>
+                <w:szCs w:val="19"/>
               </w:rPr>
               <w:t xml:space="preserve">"solution for this - No registered reference photo found for student STU003"</w:t>
             </w:r>
@@ -1581,19 +1581,19 @@
             </w:tcBorders>
             <w:shd w:fill="F7FAFC" w:val="clear"/>
             <w:tcMar>
-              <w:top w:type="dxa" w:w="100"/>
-              <w:left w:type="dxa" w:w="140"/>
-              <w:bottom w:type="dxa" w:w="100"/>
-              <w:right w:type="dxa" w:w="140"/>
-            </w:tcMar>
-          </w:tcPr>
-          <w:p>
-            <w:r>
-              <w:rPr>
-                <w:rFonts w:ascii="Calibri" w:cs="Calibri" w:eastAsia="Calibri" w:hAnsi="Calibri"/>
-                <w:color w:val="2D3748"/>
-                <w:sz w:val="20"/>
-                <w:szCs w:val="20"/>
+              <w:top w:type="dxa" w:w="80"/>
+              <w:left w:type="dxa" w:w="120"/>
+              <w:bottom w:type="dxa" w:w="80"/>
+              <w:right w:type="dxa" w:w="120"/>
+            </w:tcMar>
+          </w:tcPr>
+          <w:p>
+            <w:r>
+              <w:rPr>
+                <w:rFonts w:ascii="Arial" w:cs="Arial" w:eastAsia="Arial" w:hAnsi="Arial"/>
+                <w:color w:val="2D3748"/>
+                <w:sz w:val="19"/>
+                <w:szCs w:val="19"/>
               </w:rPr>
               <w:t xml:space="preserve">AWS Rekognition comparison requires a baseline face image in S3. Added an automatic first-time enrollment prompt and a dedicated 1-click [Register Face Photo] button in MarkAttendancePage.jsx, enabling instant S3 photo enrollment directly from the webcam stream.</w:t>
             </w:r>
@@ -1611,19 +1611,19 @@
             </w:tcBorders>
             <w:shd w:fill="FFFFFF" w:val="clear"/>
             <w:tcMar>
-              <w:top w:type="dxa" w:w="100"/>
-              <w:left w:type="dxa" w:w="140"/>
-              <w:bottom w:type="dxa" w:w="100"/>
-              <w:right w:type="dxa" w:w="140"/>
-            </w:tcMar>
-          </w:tcPr>
-          <w:p>
-            <w:r>
-              <w:rPr>
-                <w:rFonts w:ascii="Calibri" w:cs="Calibri" w:eastAsia="Calibri" w:hAnsi="Calibri"/>
-                <w:color w:val="2D3748"/>
-                <w:sz w:val="20"/>
-                <w:szCs w:val="20"/>
+              <w:top w:type="dxa" w:w="80"/>
+              <w:left w:type="dxa" w:w="120"/>
+              <w:bottom w:type="dxa" w:w="80"/>
+              <w:right w:type="dxa" w:w="120"/>
+            </w:tcMar>
+          </w:tcPr>
+          <w:p>
+            <w:r>
+              <w:rPr>
+                <w:rFonts w:ascii="Arial" w:cs="Arial" w:eastAsia="Arial" w:hAnsi="Arial"/>
+                <w:color w:val="2D3748"/>
+                <w:sz w:val="19"/>
+                <w:szCs w:val="19"/>
               </w:rPr>
               <w:t xml:space="preserve">7. Production Sync</w:t>
             </w:r>
@@ -1639,19 +1639,19 @@
             </w:tcBorders>
             <w:shd w:fill="FFFFFF" w:val="clear"/>
             <w:tcMar>
-              <w:top w:type="dxa" w:w="100"/>
-              <w:left w:type="dxa" w:w="140"/>
-              <w:bottom w:type="dxa" w:w="100"/>
-              <w:right w:type="dxa" w:w="140"/>
-            </w:tcMar>
-          </w:tcPr>
-          <w:p>
-            <w:r>
-              <w:rPr>
-                <w:rFonts w:ascii="Calibri" w:cs="Calibri" w:eastAsia="Calibri" w:hAnsi="Calibri"/>
-                <w:color w:val="2D3748"/>
-                <w:sz w:val="20"/>
-                <w:szCs w:val="20"/>
+              <w:top w:type="dxa" w:w="80"/>
+              <w:left w:type="dxa" w:w="120"/>
+              <w:bottom w:type="dxa" w:w="80"/>
+              <w:right w:type="dxa" w:w="120"/>
+            </w:tcMar>
+          </w:tcPr>
+          <w:p>
+            <w:r>
+              <w:rPr>
+                <w:rFonts w:ascii="Arial" w:cs="Arial" w:eastAsia="Arial" w:hAnsi="Arial"/>
+                <w:color w:val="2D3748"/>
+                <w:sz w:val="19"/>
+                <w:szCs w:val="19"/>
               </w:rPr>
               <w:t xml:space="preserve">"make this live with cloudfront link and sync it"</w:t>
             </w:r>
@@ -1667,19 +1667,19 @@
             </w:tcBorders>
             <w:shd w:fill="FFFFFF" w:val="clear"/>
             <w:tcMar>
-              <w:top w:type="dxa" w:w="100"/>
-              <w:left w:type="dxa" w:w="140"/>
-              <w:bottom w:type="dxa" w:w="100"/>
-              <w:right w:type="dxa" w:w="140"/>
-            </w:tcMar>
-          </w:tcPr>
-          <w:p>
-            <w:r>
-              <w:rPr>
-                <w:rFonts w:ascii="Calibri" w:cs="Calibri" w:eastAsia="Calibri" w:hAnsi="Calibri"/>
-                <w:color w:val="2D3748"/>
-                <w:sz w:val="20"/>
-                <w:szCs w:val="20"/>
+              <w:top w:type="dxa" w:w="80"/>
+              <w:left w:type="dxa" w:w="120"/>
+              <w:bottom w:type="dxa" w:w="80"/>
+              <w:right w:type="dxa" w:w="120"/>
+            </w:tcMar>
+          </w:tcPr>
+          <w:p>
+            <w:r>
+              <w:rPr>
+                <w:rFonts w:ascii="Arial" w:cs="Arial" w:eastAsia="Arial" w:hAnsi="Arial"/>
+                <w:color w:val="2D3748"/>
+                <w:sz w:val="19"/>
+                <w:szCs w:val="19"/>
               </w:rPr>
               <w:t xml:space="preserve">Automated S3 asset deployment and CloudFront cache invalidation script (deploy_frontend.js). Applied Terraform modifications to destroy unused Cognito student groups and deployed the production bundle to CloudFront edge distribution.</w:t>
             </w:r>
@@ -1697,19 +1697,19 @@
             </w:tcBorders>
             <w:shd w:fill="F7FAFC" w:val="clear"/>
             <w:tcMar>
-              <w:top w:type="dxa" w:w="100"/>
-              <w:left w:type="dxa" w:w="140"/>
-              <w:bottom w:type="dxa" w:w="100"/>
-              <w:right w:type="dxa" w:w="140"/>
-            </w:tcMar>
-          </w:tcPr>
-          <w:p>
-            <w:r>
-              <w:rPr>
-                <w:rFonts w:ascii="Calibri" w:cs="Calibri" w:eastAsia="Calibri" w:hAnsi="Calibri"/>
-                <w:color w:val="2D3748"/>
-                <w:sz w:val="20"/>
-                <w:szCs w:val="20"/>
+              <w:top w:type="dxa" w:w="80"/>
+              <w:left w:type="dxa" w:w="120"/>
+              <w:bottom w:type="dxa" w:w="80"/>
+              <w:right w:type="dxa" w:w="120"/>
+            </w:tcMar>
+          </w:tcPr>
+          <w:p>
+            <w:r>
+              <w:rPr>
+                <w:rFonts w:ascii="Arial" w:cs="Arial" w:eastAsia="Arial" w:hAnsi="Arial"/>
+                <w:color w:val="2D3748"/>
+                <w:sz w:val="19"/>
+                <w:szCs w:val="19"/>
               </w:rPr>
               <w:t xml:space="preserve">8. Repository &amp; Report</w:t>
             </w:r>
@@ -1725,19 +1725,19 @@
             </w:tcBorders>
             <w:shd w:fill="F7FAFC" w:val="clear"/>
             <w:tcMar>
-              <w:top w:type="dxa" w:w="100"/>
-              <w:left w:type="dxa" w:w="140"/>
-              <w:bottom w:type="dxa" w:w="100"/>
-              <w:right w:type="dxa" w:w="140"/>
-            </w:tcMar>
-          </w:tcPr>
-          <w:p>
-            <w:r>
-              <w:rPr>
-                <w:rFonts w:ascii="Calibri" w:cs="Calibri" w:eastAsia="Calibri" w:hAnsi="Calibri"/>
-                <w:color w:val="2D3748"/>
-                <w:sz w:val="20"/>
-                <w:szCs w:val="20"/>
+              <w:top w:type="dxa" w:w="80"/>
+              <w:left w:type="dxa" w:w="120"/>
+              <w:bottom w:type="dxa" w:w="80"/>
+              <w:right w:type="dxa" w:w="120"/>
+            </w:tcMar>
+          </w:tcPr>
+          <w:p>
+            <w:r>
+              <w:rPr>
+                <w:rFonts w:ascii="Arial" w:cs="Arial" w:eastAsia="Arial" w:hAnsi="Arial"/>
+                <w:color w:val="2D3748"/>
+                <w:sz w:val="19"/>
+                <w:szCs w:val="19"/>
               </w:rPr>
               <w:t xml:space="preserve">"create a new repository as Attendance-System-VibeCoding and push this project, create a readme and generate an architectural diagram"</w:t>
             </w:r>
@@ -1753,19 +1753,19 @@
             </w:tcBorders>
             <w:shd w:fill="F7FAFC" w:val="clear"/>
             <w:tcMar>
-              <w:top w:type="dxa" w:w="100"/>
-              <w:left w:type="dxa" w:w="140"/>
-              <w:bottom w:type="dxa" w:w="100"/>
-              <w:right w:type="dxa" w:w="140"/>
-            </w:tcMar>
-          </w:tcPr>
-          <w:p>
-            <w:r>
-              <w:rPr>
-                <w:rFonts w:ascii="Calibri" w:cs="Calibri" w:eastAsia="Calibri" w:hAnsi="Calibri"/>
-                <w:color w:val="2D3748"/>
-                <w:sz w:val="20"/>
-                <w:szCs w:val="20"/>
+              <w:top w:type="dxa" w:w="80"/>
+              <w:left w:type="dxa" w:w="120"/>
+              <w:bottom w:type="dxa" w:w="80"/>
+              <w:right w:type="dxa" w:w="120"/>
+            </w:tcMar>
+          </w:tcPr>
+          <w:p>
+            <w:r>
+              <w:rPr>
+                <w:rFonts w:ascii="Arial" w:cs="Arial" w:eastAsia="Arial" w:hAnsi="Arial"/>
+                <w:color w:val="2D3748"/>
+                <w:sz w:val="19"/>
+                <w:szCs w:val="19"/>
               </w:rPr>
               <w:t xml:space="preserve">Generated high-resolution AWS technical architecture diagram, authored comprehensive Markdown README documentation, initialized GitHub repository Nishu9198/Attendance-System-VibeCoding, and pushed the complete codebase.</w:t>
             </w:r>
@@ -1775,23 +1775,23 @@
     </w:tbl>
     <w:p>
       <w:pPr>
-        <w:spacing w:after="120" w:before="240"/>
+        <w:spacing w:after="100" w:before="180"/>
       </w:pPr>
     </w:p>
     <w:p>
       <w:pPr>
         <w:pStyle w:val="Heading1"/>
         <w:spacing w:after="140" w:before="360"/>
-        <w:rPr>
-          <w:rFonts w:ascii="Calibri" w:cs="Calibri" w:eastAsia="Calibri" w:hAnsi="Calibri"/>
+      </w:pPr>
+      <w:r>
+        <w:rPr>
+          <w:rFonts w:ascii="Arial" w:cs="Arial" w:eastAsia="Arial" w:hAnsi="Arial"/>
           <w:b/>
           <w:bCs/>
           <w:color w:val="0A2540"/>
-          <w:sz w:val="32"/>
-          <w:szCs w:val="32"/>
-        </w:rPr>
-      </w:pPr>
-      <w:r>
+          <w:sz w:val="30"/>
+          <w:szCs w:val="30"/>
+        </w:rPr>
         <w:t xml:space="preserve">3. AWS Cloud Infrastructure &amp; Architecture Design</w:t>
       </w:r>
     </w:p>
@@ -1801,27 +1801,27 @@
       </w:pPr>
       <w:r>
         <w:rPr>
-          <w:rFonts w:ascii="Calibri" w:cs="Calibri" w:eastAsia="Calibri" w:hAnsi="Calibri"/>
+          <w:rFonts w:ascii="Arial" w:cs="Arial" w:eastAsia="Arial" w:hAnsi="Arial"/>
           <w:b w:val="false"/>
           <w:bCs w:val="false"/>
           <w:i w:val="false"/>
           <w:iCs w:val="false"/>
           <w:color w:val="2D3748"/>
-          <w:sz w:val="22"/>
-          <w:szCs w:val="22"/>
+          <w:sz w:val="21"/>
+          <w:szCs w:val="21"/>
         </w:rPr>
         <w:t xml:space="preserve">Presently is architected around a decoupled, event-driven serverless pattern where each cloud component operates within the AWS Free Tier allowances while providing enterprise-grade reliability and security.</w:t>
       </w:r>
     </w:p>
     <w:p>
       <w:pPr>
-        <w:spacing w:after="120" w:before="120"/>
+        <w:spacing w:after="100" w:before="100"/>
         <w:jc w:val="center"/>
       </w:pPr>
       <w:r>
         <w:drawing>
           <wp:inline distT="0" distB="0" distL="0" distR="0">
-            <wp:extent cx="5524500" cy="3105150"/>
+            <wp:extent cx="5334000" cy="3000375"/>
             <wp:effectExtent t="0" r="0" b="0" l="0"/>
             <wp:docPr id="1" name="" descr="" title=""/>
             <wp:cNvGraphicFramePr>
@@ -1846,7 +1846,7 @@
                   <pic:spPr bwMode="auto">
                     <a:xfrm>
                       <a:off x="0" y="0"/>
-                      <a:ext cx="5524500" cy="3105150"/>
+                      <a:ext cx="5334000" cy="3000375"/>
                     </a:xfrm>
                     <a:prstGeom prst="rect">
                       <a:avLst/>
@@ -1861,12 +1861,12 @@
     </w:p>
     <w:p>
       <w:pPr>
-        <w:spacing w:after="160" w:before="40"/>
+        <w:spacing w:after="140" w:before="40"/>
         <w:jc w:val="center"/>
       </w:pPr>
       <w:r>
         <w:rPr>
-          <w:rFonts w:ascii="Calibri" w:cs="Calibri" w:eastAsia="Calibri" w:hAnsi="Calibri"/>
+          <w:rFonts w:ascii="Arial" w:cs="Arial" w:eastAsia="Arial" w:hAnsi="Arial"/>
           <w:b/>
           <w:bCs/>
           <w:i/>
@@ -1882,16 +1882,16 @@
       <w:pPr>
         <w:pStyle w:val="Heading2"/>
         <w:spacing w:after="100" w:before="240"/>
-        <w:rPr>
-          <w:rFonts w:ascii="Calibri" w:cs="Calibri" w:eastAsia="Calibri" w:hAnsi="Calibri"/>
+      </w:pPr>
+      <w:r>
+        <w:rPr>
+          <w:rFonts w:ascii="Arial" w:cs="Arial" w:eastAsia="Arial" w:hAnsi="Arial"/>
           <w:b/>
           <w:bCs/>
           <w:color w:val="0066CC"/>
-          <w:sz w:val="26"/>
-          <w:szCs w:val="26"/>
-        </w:rPr>
-      </w:pPr>
-      <w:r>
+          <w:sz w:val="24"/>
+          <w:szCs w:val="24"/>
+        </w:rPr>
         <w:t xml:space="preserve">3.1 Core Cloud Services Breakdown</w:t>
       </w:r>
     </w:p>
@@ -1906,21 +1906,21 @@
       </w:pPr>
       <w:r>
         <w:rPr>
-          <w:rFonts w:ascii="Calibri" w:cs="Calibri" w:eastAsia="Calibri" w:hAnsi="Calibri"/>
+          <w:rFonts w:ascii="Arial" w:cs="Arial" w:eastAsia="Arial" w:hAnsi="Arial"/>
           <w:b/>
           <w:bCs/>
           <w:color w:val="0A2540"/>
-          <w:sz w:val="22"/>
-          <w:szCs w:val="22"/>
+          <w:sz w:val="21"/>
+          <w:szCs w:val="21"/>
         </w:rPr>
         <w:t xml:space="preserve">• </w:t>
       </w:r>
       <w:r>
         <w:rPr>
-          <w:rFonts w:ascii="Calibri" w:cs="Calibri" w:eastAsia="Calibri" w:hAnsi="Calibri"/>
+          <w:rFonts w:ascii="Arial" w:cs="Arial" w:eastAsia="Arial" w:hAnsi="Arial"/>
           <w:color w:val="2D3748"/>
-          <w:sz w:val="22"/>
-          <w:szCs w:val="22"/>
+          <w:sz w:val="21"/>
+          <w:szCs w:val="21"/>
         </w:rPr>
         <w:t xml:space="preserve">Amazon CloudFront (CDN): Global content delivery network serving the compiled React single page application with HTTPS SSL/TLS encryption, sub-second latency, and custom SPA 404/403 routing rules.</w:t>
       </w:r>
@@ -1936,21 +1936,21 @@
       </w:pPr>
       <w:r>
         <w:rPr>
-          <w:rFonts w:ascii="Calibri" w:cs="Calibri" w:eastAsia="Calibri" w:hAnsi="Calibri"/>
+          <w:rFonts w:ascii="Arial" w:cs="Arial" w:eastAsia="Arial" w:hAnsi="Arial"/>
           <w:b/>
           <w:bCs/>
           <w:color w:val="0A2540"/>
-          <w:sz w:val="22"/>
-          <w:szCs w:val="22"/>
+          <w:sz w:val="21"/>
+          <w:szCs w:val="21"/>
         </w:rPr>
         <w:t xml:space="preserve">• </w:t>
       </w:r>
       <w:r>
         <w:rPr>
-          <w:rFonts w:ascii="Calibri" w:cs="Calibri" w:eastAsia="Calibri" w:hAnsi="Calibri"/>
+          <w:rFonts w:ascii="Arial" w:cs="Arial" w:eastAsia="Arial" w:hAnsi="Arial"/>
           <w:color w:val="2D3748"/>
-          <w:sz w:val="22"/>
-          <w:szCs w:val="22"/>
+          <w:sz w:val="21"/>
+          <w:szCs w:val="21"/>
         </w:rPr>
         <w:t xml:space="preserve">Amazon S3 (Storage): Hosts two separate buckets — (1) attendance-system-frontend for static web assets, and (2) attendance-system-photos for high-resolution reference student portraits with strict CORS headers.</w:t>
       </w:r>
@@ -1966,21 +1966,21 @@
       </w:pPr>
       <w:r>
         <w:rPr>
-          <w:rFonts w:ascii="Calibri" w:cs="Calibri" w:eastAsia="Calibri" w:hAnsi="Calibri"/>
+          <w:rFonts w:ascii="Arial" w:cs="Arial" w:eastAsia="Arial" w:hAnsi="Arial"/>
           <w:b/>
           <w:bCs/>
           <w:color w:val="0A2540"/>
-          <w:sz w:val="22"/>
-          <w:szCs w:val="22"/>
+          <w:sz w:val="21"/>
+          <w:szCs w:val="21"/>
         </w:rPr>
         <w:t xml:space="preserve">• </w:t>
       </w:r>
       <w:r>
         <w:rPr>
-          <w:rFonts w:ascii="Calibri" w:cs="Calibri" w:eastAsia="Calibri" w:hAnsi="Calibri"/>
+          <w:rFonts w:ascii="Arial" w:cs="Arial" w:eastAsia="Arial" w:hAnsi="Arial"/>
           <w:color w:val="2D3748"/>
-          <w:sz w:val="22"/>
-          <w:szCs w:val="22"/>
+          <w:sz w:val="21"/>
+          <w:szCs w:val="21"/>
         </w:rPr>
         <w:t xml:space="preserve">Amazon Cognito: Manages faculty user directories, password policies (minimum 8 chars, uppercase, lowercase, numbers), and Secure Remote Password (SRP) authentication issuing secure JWT identity tokens.</w:t>
       </w:r>
@@ -1996,21 +1996,21 @@
       </w:pPr>
       <w:r>
         <w:rPr>
-          <w:rFonts w:ascii="Calibri" w:cs="Calibri" w:eastAsia="Calibri" w:hAnsi="Calibri"/>
+          <w:rFonts w:ascii="Arial" w:cs="Arial" w:eastAsia="Arial" w:hAnsi="Arial"/>
           <w:b/>
           <w:bCs/>
           <w:color w:val="0A2540"/>
-          <w:sz w:val="22"/>
-          <w:szCs w:val="22"/>
+          <w:sz w:val="21"/>
+          <w:szCs w:val="21"/>
         </w:rPr>
         <w:t xml:space="preserve">• </w:t>
       </w:r>
       <w:r>
         <w:rPr>
-          <w:rFonts w:ascii="Calibri" w:cs="Calibri" w:eastAsia="Calibri" w:hAnsi="Calibri"/>
+          <w:rFonts w:ascii="Arial" w:cs="Arial" w:eastAsia="Arial" w:hAnsi="Arial"/>
           <w:color w:val="2D3748"/>
-          <w:sz w:val="22"/>
-          <w:szCs w:val="22"/>
+          <w:sz w:val="21"/>
+          <w:szCs w:val="21"/>
         </w:rPr>
         <w:t xml:space="preserve">Amazon API Gateway (HTTP API): High-throughput, low-latency REST API gateway providing CORS management and routing HTTP requests to backend Lambda functions.</w:t>
       </w:r>
@@ -2026,21 +2026,21 @@
       </w:pPr>
       <w:r>
         <w:rPr>
-          <w:rFonts w:ascii="Calibri" w:cs="Calibri" w:eastAsia="Calibri" w:hAnsi="Calibri"/>
+          <w:rFonts w:ascii="Arial" w:cs="Arial" w:eastAsia="Arial" w:hAnsi="Arial"/>
           <w:b/>
           <w:bCs/>
           <w:color w:val="0A2540"/>
-          <w:sz w:val="22"/>
-          <w:szCs w:val="22"/>
+          <w:sz w:val="21"/>
+          <w:szCs w:val="21"/>
         </w:rPr>
         <w:t xml:space="preserve">• </w:t>
       </w:r>
       <w:r>
         <w:rPr>
-          <w:rFonts w:ascii="Calibri" w:cs="Calibri" w:eastAsia="Calibri" w:hAnsi="Calibri"/>
+          <w:rFonts w:ascii="Arial" w:cs="Arial" w:eastAsia="Arial" w:hAnsi="Arial"/>
           <w:color w:val="2D3748"/>
-          <w:sz w:val="22"/>
-          <w:szCs w:val="22"/>
+          <w:sz w:val="21"/>
+          <w:szCs w:val="21"/>
         </w:rPr>
         <w:t xml:space="preserve">AWS Lambda (Python 3.12 Backend): Serverless microservice router executing stateless business logic, managing database transactions, and interfacing with Amazon Rekognition and SNS.</w:t>
       </w:r>
@@ -2056,21 +2056,21 @@
       </w:pPr>
       <w:r>
         <w:rPr>
-          <w:rFonts w:ascii="Calibri" w:cs="Calibri" w:eastAsia="Calibri" w:hAnsi="Calibri"/>
+          <w:rFonts w:ascii="Arial" w:cs="Arial" w:eastAsia="Arial" w:hAnsi="Arial"/>
           <w:b/>
           <w:bCs/>
           <w:color w:val="0A2540"/>
-          <w:sz w:val="22"/>
-          <w:szCs w:val="22"/>
+          <w:sz w:val="21"/>
+          <w:szCs w:val="21"/>
         </w:rPr>
         <w:t xml:space="preserve">• </w:t>
       </w:r>
       <w:r>
         <w:rPr>
-          <w:rFonts w:ascii="Calibri" w:cs="Calibri" w:eastAsia="Calibri" w:hAnsi="Calibri"/>
+          <w:rFonts w:ascii="Arial" w:cs="Arial" w:eastAsia="Arial" w:hAnsi="Arial"/>
           <w:color w:val="2D3748"/>
-          <w:sz w:val="22"/>
-          <w:szCs w:val="22"/>
+          <w:sz w:val="21"/>
+          <w:szCs w:val="21"/>
         </w:rPr>
         <w:t xml:space="preserve">Amazon Rekognition: Cloud computer vision engine performing face detection, bounding box extraction, and biometric face comparison with an 85.0% confidence similarity threshold.</w:t>
       </w:r>
@@ -2086,21 +2086,21 @@
       </w:pPr>
       <w:r>
         <w:rPr>
-          <w:rFonts w:ascii="Calibri" w:cs="Calibri" w:eastAsia="Calibri" w:hAnsi="Calibri"/>
+          <w:rFonts w:ascii="Arial" w:cs="Arial" w:eastAsia="Arial" w:hAnsi="Arial"/>
           <w:b/>
           <w:bCs/>
           <w:color w:val="0A2540"/>
-          <w:sz w:val="22"/>
-          <w:szCs w:val="22"/>
+          <w:sz w:val="21"/>
+          <w:szCs w:val="21"/>
         </w:rPr>
         <w:t xml:space="preserve">• </w:t>
       </w:r>
       <w:r>
         <w:rPr>
-          <w:rFonts w:ascii="Calibri" w:cs="Calibri" w:eastAsia="Calibri" w:hAnsi="Calibri"/>
+          <w:rFonts w:ascii="Arial" w:cs="Arial" w:eastAsia="Arial" w:hAnsi="Arial"/>
           <w:color w:val="2D3748"/>
-          <w:sz w:val="22"/>
-          <w:szCs w:val="22"/>
+          <w:sz w:val="21"/>
+          <w:szCs w:val="21"/>
         </w:rPr>
         <w:t xml:space="preserve">Amazon DynamoDB: Fully managed NoSQL key-value database configured with pay-per-request / on-demand capacity across 5 distinct application tables.</w:t>
       </w:r>
@@ -2116,44 +2116,44 @@
       </w:pPr>
       <w:r>
         <w:rPr>
-          <w:rFonts w:ascii="Calibri" w:cs="Calibri" w:eastAsia="Calibri" w:hAnsi="Calibri"/>
+          <w:rFonts w:ascii="Arial" w:cs="Arial" w:eastAsia="Arial" w:hAnsi="Arial"/>
           <w:b/>
           <w:bCs/>
           <w:color w:val="0A2540"/>
-          <w:sz w:val="22"/>
-          <w:szCs w:val="22"/>
+          <w:sz w:val="21"/>
+          <w:szCs w:val="21"/>
         </w:rPr>
         <w:t xml:space="preserve">• </w:t>
       </w:r>
       <w:r>
         <w:rPr>
-          <w:rFonts w:ascii="Calibri" w:cs="Calibri" w:eastAsia="Calibri" w:hAnsi="Calibri"/>
+          <w:rFonts w:ascii="Arial" w:cs="Arial" w:eastAsia="Arial" w:hAnsi="Arial"/>
           <w:color w:val="2D3748"/>
-          <w:sz w:val="22"/>
-          <w:szCs w:val="22"/>
+          <w:sz w:val="21"/>
+          <w:szCs w:val="21"/>
         </w:rPr>
         <w:t xml:space="preserve">Amazon SNS &amp; EventBridge: EventBridge triggers daily cron evaluations of unmarked classes; Amazon Simple Notification Service (SNS) dispatches urgent email reminders to faculty.</w:t>
       </w:r>
     </w:p>
     <w:p>
       <w:pPr>
-        <w:spacing w:after="120" w:before="240"/>
+        <w:spacing w:after="100" w:before="180"/>
       </w:pPr>
     </w:p>
     <w:p>
       <w:pPr>
         <w:pStyle w:val="Heading1"/>
         <w:spacing w:after="140" w:before="360"/>
-        <w:rPr>
-          <w:rFonts w:ascii="Calibri" w:cs="Calibri" w:eastAsia="Calibri" w:hAnsi="Calibri"/>
+      </w:pPr>
+      <w:r>
+        <w:rPr>
+          <w:rFonts w:ascii="Arial" w:cs="Arial" w:eastAsia="Arial" w:hAnsi="Arial"/>
           <w:b/>
           <w:bCs/>
           <w:color w:val="0A2540"/>
-          <w:sz w:val="32"/>
-          <w:szCs w:val="32"/>
-        </w:rPr>
-      </w:pPr>
-      <w:r>
+          <w:sz w:val="30"/>
+          <w:szCs w:val="30"/>
+        </w:rPr>
         <w:t xml:space="preserve">4. Database Design &amp; DynamoDB Schema</w:t>
       </w:r>
     </w:p>
@@ -2163,14 +2163,14 @@
       </w:pPr>
       <w:r>
         <w:rPr>
-          <w:rFonts w:ascii="Calibri" w:cs="Calibri" w:eastAsia="Calibri" w:hAnsi="Calibri"/>
+          <w:rFonts w:ascii="Arial" w:cs="Arial" w:eastAsia="Arial" w:hAnsi="Arial"/>
           <w:b w:val="false"/>
           <w:bCs w:val="false"/>
           <w:i w:val="false"/>
           <w:iCs w:val="false"/>
           <w:color w:val="2D3748"/>
-          <w:sz w:val="22"/>
-          <w:szCs w:val="22"/>
+          <w:sz w:val="21"/>
+          <w:szCs w:val="21"/>
         </w:rPr>
         <w:t xml:space="preserve">The persistence layer utilizes Amazon DynamoDB with optimized partition and sort key structures to guarantee single-digit millisecond query performance:</w:t>
       </w:r>
@@ -2201,10 +2201,10 @@
           <w:tcPr>
             <w:shd w:fill="0A2540" w:val="clear"/>
             <w:tcMar>
-              <w:top w:type="dxa" w:w="120"/>
-              <w:left w:type="dxa" w:w="140"/>
-              <w:bottom w:type="dxa" w:w="120"/>
-              <w:right w:type="dxa" w:w="140"/>
+              <w:top w:type="dxa" w:w="100"/>
+              <w:left w:type="dxa" w:w="120"/>
+              <w:bottom w:type="dxa" w:w="100"/>
+              <w:right w:type="dxa" w:w="120"/>
             </w:tcMar>
           </w:tcPr>
           <w:p>
@@ -2213,12 +2213,12 @@
             </w:pPr>
             <w:r>
               <w:rPr>
-                <w:rFonts w:ascii="Calibri" w:cs="Calibri" w:eastAsia="Calibri" w:hAnsi="Calibri"/>
+                <w:rFonts w:ascii="Arial" w:cs="Arial" w:eastAsia="Arial" w:hAnsi="Arial"/>
                 <w:b/>
                 <w:bCs/>
                 <w:color w:val="FFFFFF"/>
-                <w:sz w:val="20"/>
-                <w:szCs w:val="20"/>
+                <w:sz w:val="19"/>
+                <w:szCs w:val="19"/>
               </w:rPr>
               <w:t xml:space="preserve">DynamoDB Table Name</w:t>
             </w:r>
@@ -2228,10 +2228,10 @@
           <w:tcPr>
             <w:shd w:fill="0A2540" w:val="clear"/>
             <w:tcMar>
-              <w:top w:type="dxa" w:w="120"/>
-              <w:left w:type="dxa" w:w="140"/>
-              <w:bottom w:type="dxa" w:w="120"/>
-              <w:right w:type="dxa" w:w="140"/>
+              <w:top w:type="dxa" w:w="100"/>
+              <w:left w:type="dxa" w:w="120"/>
+              <w:bottom w:type="dxa" w:w="100"/>
+              <w:right w:type="dxa" w:w="120"/>
             </w:tcMar>
           </w:tcPr>
           <w:p>
@@ -2240,12 +2240,12 @@
             </w:pPr>
             <w:r>
               <w:rPr>
-                <w:rFonts w:ascii="Calibri" w:cs="Calibri" w:eastAsia="Calibri" w:hAnsi="Calibri"/>
+                <w:rFonts w:ascii="Arial" w:cs="Arial" w:eastAsia="Arial" w:hAnsi="Arial"/>
                 <w:b/>
                 <w:bCs/>
                 <w:color w:val="FFFFFF"/>
-                <w:sz w:val="20"/>
-                <w:szCs w:val="20"/>
+                <w:sz w:val="19"/>
+                <w:szCs w:val="19"/>
               </w:rPr>
               <w:t xml:space="preserve">Partition Key (PK)</w:t>
             </w:r>
@@ -2255,10 +2255,10 @@
           <w:tcPr>
             <w:shd w:fill="0A2540" w:val="clear"/>
             <w:tcMar>
-              <w:top w:type="dxa" w:w="120"/>
-              <w:left w:type="dxa" w:w="140"/>
-              <w:bottom w:type="dxa" w:w="120"/>
-              <w:right w:type="dxa" w:w="140"/>
+              <w:top w:type="dxa" w:w="100"/>
+              <w:left w:type="dxa" w:w="120"/>
+              <w:bottom w:type="dxa" w:w="100"/>
+              <w:right w:type="dxa" w:w="120"/>
             </w:tcMar>
           </w:tcPr>
           <w:p>
@@ -2267,12 +2267,12 @@
             </w:pPr>
             <w:r>
               <w:rPr>
-                <w:rFonts w:ascii="Calibri" w:cs="Calibri" w:eastAsia="Calibri" w:hAnsi="Calibri"/>
+                <w:rFonts w:ascii="Arial" w:cs="Arial" w:eastAsia="Arial" w:hAnsi="Arial"/>
                 <w:b/>
                 <w:bCs/>
                 <w:color w:val="FFFFFF"/>
-                <w:sz w:val="20"/>
-                <w:szCs w:val="20"/>
+                <w:sz w:val="19"/>
+                <w:szCs w:val="19"/>
               </w:rPr>
               <w:t xml:space="preserve">Sort Key (SK)</w:t>
             </w:r>
@@ -2282,10 +2282,10 @@
           <w:tcPr>
             <w:shd w:fill="0A2540" w:val="clear"/>
             <w:tcMar>
-              <w:top w:type="dxa" w:w="120"/>
-              <w:left w:type="dxa" w:w="140"/>
-              <w:bottom w:type="dxa" w:w="120"/>
-              <w:right w:type="dxa" w:w="140"/>
+              <w:top w:type="dxa" w:w="100"/>
+              <w:left w:type="dxa" w:w="120"/>
+              <w:bottom w:type="dxa" w:w="100"/>
+              <w:right w:type="dxa" w:w="120"/>
             </w:tcMar>
           </w:tcPr>
           <w:p>
@@ -2294,12 +2294,12 @@
             </w:pPr>
             <w:r>
               <w:rPr>
-                <w:rFonts w:ascii="Calibri" w:cs="Calibri" w:eastAsia="Calibri" w:hAnsi="Calibri"/>
+                <w:rFonts w:ascii="Arial" w:cs="Arial" w:eastAsia="Arial" w:hAnsi="Arial"/>
                 <w:b/>
                 <w:bCs/>
                 <w:color w:val="FFFFFF"/>
-                <w:sz w:val="20"/>
-                <w:szCs w:val="20"/>
+                <w:sz w:val="19"/>
+                <w:szCs w:val="19"/>
               </w:rPr>
               <w:t xml:space="preserve">Stored Attributes &amp; Purpose</w:t>
             </w:r>
@@ -2317,19 +2317,19 @@
             </w:tcBorders>
             <w:shd w:fill="FFFFFF" w:val="clear"/>
             <w:tcMar>
-              <w:top w:type="dxa" w:w="100"/>
-              <w:left w:type="dxa" w:w="140"/>
-              <w:bottom w:type="dxa" w:w="100"/>
-              <w:right w:type="dxa" w:w="140"/>
-            </w:tcMar>
-          </w:tcPr>
-          <w:p>
-            <w:r>
-              <w:rPr>
-                <w:rFonts w:ascii="Calibri" w:cs="Calibri" w:eastAsia="Calibri" w:hAnsi="Calibri"/>
-                <w:color w:val="2D3748"/>
-                <w:sz w:val="20"/>
-                <w:szCs w:val="20"/>
+              <w:top w:type="dxa" w:w="80"/>
+              <w:left w:type="dxa" w:w="120"/>
+              <w:bottom w:type="dxa" w:w="80"/>
+              <w:right w:type="dxa" w:w="120"/>
+            </w:tcMar>
+          </w:tcPr>
+          <w:p>
+            <w:r>
+              <w:rPr>
+                <w:rFonts w:ascii="Arial" w:cs="Arial" w:eastAsia="Arial" w:hAnsi="Arial"/>
+                <w:color w:val="2D3748"/>
+                <w:sz w:val="19"/>
+                <w:szCs w:val="19"/>
               </w:rPr>
               <w:t xml:space="preserve">attendance-system-timetable</w:t>
             </w:r>
@@ -2345,19 +2345,19 @@
             </w:tcBorders>
             <w:shd w:fill="FFFFFF" w:val="clear"/>
             <w:tcMar>
-              <w:top w:type="dxa" w:w="100"/>
-              <w:left w:type="dxa" w:w="140"/>
-              <w:bottom w:type="dxa" w:w="100"/>
-              <w:right w:type="dxa" w:w="140"/>
-            </w:tcMar>
-          </w:tcPr>
-          <w:p>
-            <w:r>
-              <w:rPr>
-                <w:rFonts w:ascii="Calibri" w:cs="Calibri" w:eastAsia="Calibri" w:hAnsi="Calibri"/>
-                <w:color w:val="2D3748"/>
-                <w:sz w:val="20"/>
-                <w:szCs w:val="20"/>
+              <w:top w:type="dxa" w:w="80"/>
+              <w:left w:type="dxa" w:w="120"/>
+              <w:bottom w:type="dxa" w:w="80"/>
+              <w:right w:type="dxa" w:w="120"/>
+            </w:tcMar>
+          </w:tcPr>
+          <w:p>
+            <w:r>
+              <w:rPr>
+                <w:rFonts w:ascii="Arial" w:cs="Arial" w:eastAsia="Arial" w:hAnsi="Arial"/>
+                <w:color w:val="2D3748"/>
+                <w:sz w:val="19"/>
+                <w:szCs w:val="19"/>
               </w:rPr>
               <w:t xml:space="preserve">teacherId (String)</w:t>
             </w:r>
@@ -2373,19 +2373,19 @@
             </w:tcBorders>
             <w:shd w:fill="FFFFFF" w:val="clear"/>
             <w:tcMar>
-              <w:top w:type="dxa" w:w="100"/>
-              <w:left w:type="dxa" w:w="140"/>
-              <w:bottom w:type="dxa" w:w="100"/>
-              <w:right w:type="dxa" w:w="140"/>
-            </w:tcMar>
-          </w:tcPr>
-          <w:p>
-            <w:r>
-              <w:rPr>
-                <w:rFonts w:ascii="Calibri" w:cs="Calibri" w:eastAsia="Calibri" w:hAnsi="Calibri"/>
-                <w:color w:val="2D3748"/>
-                <w:sz w:val="20"/>
-                <w:szCs w:val="20"/>
+              <w:top w:type="dxa" w:w="80"/>
+              <w:left w:type="dxa" w:w="120"/>
+              <w:bottom w:type="dxa" w:w="80"/>
+              <w:right w:type="dxa" w:w="120"/>
+            </w:tcMar>
+          </w:tcPr>
+          <w:p>
+            <w:r>
+              <w:rPr>
+                <w:rFonts w:ascii="Arial" w:cs="Arial" w:eastAsia="Arial" w:hAnsi="Arial"/>
+                <w:color w:val="2D3748"/>
+                <w:sz w:val="19"/>
+                <w:szCs w:val="19"/>
               </w:rPr>
               <w:t xml:space="preserve">slotKey (String, e.g. "1#2")</w:t>
             </w:r>
@@ -2401,19 +2401,19 @@
             </w:tcBorders>
             <w:shd w:fill="FFFFFF" w:val="clear"/>
             <w:tcMar>
-              <w:top w:type="dxa" w:w="100"/>
-              <w:left w:type="dxa" w:w="140"/>
-              <w:bottom w:type="dxa" w:w="100"/>
-              <w:right w:type="dxa" w:w="140"/>
-            </w:tcMar>
-          </w:tcPr>
-          <w:p>
-            <w:r>
-              <w:rPr>
-                <w:rFonts w:ascii="Calibri" w:cs="Calibri" w:eastAsia="Calibri" w:hAnsi="Calibri"/>
-                <w:color w:val="2D3748"/>
-                <w:sz w:val="20"/>
-                <w:szCs w:val="20"/>
+              <w:top w:type="dxa" w:w="80"/>
+              <w:left w:type="dxa" w:w="120"/>
+              <w:bottom w:type="dxa" w:w="80"/>
+              <w:right w:type="dxa" w:w="120"/>
+            </w:tcMar>
+          </w:tcPr>
+          <w:p>
+            <w:r>
+              <w:rPr>
+                <w:rFonts w:ascii="Arial" w:cs="Arial" w:eastAsia="Arial" w:hAnsi="Arial"/>
+                <w:color w:val="2D3748"/>
+                <w:sz w:val="19"/>
+                <w:szCs w:val="19"/>
               </w:rPr>
               <w:t xml:space="preserve">dayOrder, period, subjectCode, subjectName, className, section, roomNumber, building.</w:t>
             </w:r>
@@ -2431,19 +2431,19 @@
             </w:tcBorders>
             <w:shd w:fill="F7FAFC" w:val="clear"/>
             <w:tcMar>
-              <w:top w:type="dxa" w:w="100"/>
-              <w:left w:type="dxa" w:w="140"/>
-              <w:bottom w:type="dxa" w:w="100"/>
-              <w:right w:type="dxa" w:w="140"/>
-            </w:tcMar>
-          </w:tcPr>
-          <w:p>
-            <w:r>
-              <w:rPr>
-                <w:rFonts w:ascii="Calibri" w:cs="Calibri" w:eastAsia="Calibri" w:hAnsi="Calibri"/>
-                <w:color w:val="2D3748"/>
-                <w:sz w:val="20"/>
-                <w:szCs w:val="20"/>
+              <w:top w:type="dxa" w:w="80"/>
+              <w:left w:type="dxa" w:w="120"/>
+              <w:bottom w:type="dxa" w:w="80"/>
+              <w:right w:type="dxa" w:w="120"/>
+            </w:tcMar>
+          </w:tcPr>
+          <w:p>
+            <w:r>
+              <w:rPr>
+                <w:rFonts w:ascii="Arial" w:cs="Arial" w:eastAsia="Arial" w:hAnsi="Arial"/>
+                <w:color w:val="2D3748"/>
+                <w:sz w:val="19"/>
+                <w:szCs w:val="19"/>
               </w:rPr>
               <w:t xml:space="preserve">attendance-system-subjects</w:t>
             </w:r>
@@ -2459,19 +2459,19 @@
             </w:tcBorders>
             <w:shd w:fill="F7FAFC" w:val="clear"/>
             <w:tcMar>
-              <w:top w:type="dxa" w:w="100"/>
-              <w:left w:type="dxa" w:w="140"/>
-              <w:bottom w:type="dxa" w:w="100"/>
-              <w:right w:type="dxa" w:w="140"/>
-            </w:tcMar>
-          </w:tcPr>
-          <w:p>
-            <w:r>
-              <w:rPr>
-                <w:rFonts w:ascii="Calibri" w:cs="Calibri" w:eastAsia="Calibri" w:hAnsi="Calibri"/>
-                <w:color w:val="2D3748"/>
-                <w:sz w:val="20"/>
-                <w:szCs w:val="20"/>
+              <w:top w:type="dxa" w:w="80"/>
+              <w:left w:type="dxa" w:w="120"/>
+              <w:bottom w:type="dxa" w:w="80"/>
+              <w:right w:type="dxa" w:w="120"/>
+            </w:tcMar>
+          </w:tcPr>
+          <w:p>
+            <w:r>
+              <w:rPr>
+                <w:rFonts w:ascii="Arial" w:cs="Arial" w:eastAsia="Arial" w:hAnsi="Arial"/>
+                <w:color w:val="2D3748"/>
+                <w:sz w:val="19"/>
+                <w:szCs w:val="19"/>
               </w:rPr>
               <w:t xml:space="preserve">subjectCode (String)</w:t>
             </w:r>
@@ -2487,19 +2487,19 @@
             </w:tcBorders>
             <w:shd w:fill="F7FAFC" w:val="clear"/>
             <w:tcMar>
-              <w:top w:type="dxa" w:w="100"/>
-              <w:left w:type="dxa" w:w="140"/>
-              <w:bottom w:type="dxa" w:w="100"/>
-              <w:right w:type="dxa" w:w="140"/>
-            </w:tcMar>
-          </w:tcPr>
-          <w:p>
-            <w:r>
-              <w:rPr>
-                <w:rFonts w:ascii="Calibri" w:cs="Calibri" w:eastAsia="Calibri" w:hAnsi="Calibri"/>
-                <w:color w:val="2D3748"/>
-                <w:sz w:val="20"/>
-                <w:szCs w:val="20"/>
+              <w:top w:type="dxa" w:w="80"/>
+              <w:left w:type="dxa" w:w="120"/>
+              <w:bottom w:type="dxa" w:w="80"/>
+              <w:right w:type="dxa" w:w="120"/>
+            </w:tcMar>
+          </w:tcPr>
+          <w:p>
+            <w:r>
+              <w:rPr>
+                <w:rFonts w:ascii="Arial" w:cs="Arial" w:eastAsia="Arial" w:hAnsi="Arial"/>
+                <w:color w:val="2D3748"/>
+                <w:sz w:val="19"/>
+                <w:szCs w:val="19"/>
               </w:rPr>
               <w:t xml:space="preserve">className (String)</w:t>
             </w:r>
@@ -2515,19 +2515,19 @@
             </w:tcBorders>
             <w:shd w:fill="F7FAFC" w:val="clear"/>
             <w:tcMar>
-              <w:top w:type="dxa" w:w="100"/>
-              <w:left w:type="dxa" w:w="140"/>
-              <w:bottom w:type="dxa" w:w="100"/>
-              <w:right w:type="dxa" w:w="140"/>
-            </w:tcMar>
-          </w:tcPr>
-          <w:p>
-            <w:r>
-              <w:rPr>
-                <w:rFonts w:ascii="Calibri" w:cs="Calibri" w:eastAsia="Calibri" w:hAnsi="Calibri"/>
-                <w:color w:val="2D3748"/>
-                <w:sz w:val="20"/>
-                <w:szCs w:val="20"/>
+              <w:top w:type="dxa" w:w="80"/>
+              <w:left w:type="dxa" w:w="120"/>
+              <w:bottom w:type="dxa" w:w="80"/>
+              <w:right w:type="dxa" w:w="120"/>
+            </w:tcMar>
+          </w:tcPr>
+          <w:p>
+            <w:r>
+              <w:rPr>
+                <w:rFonts w:ascii="Arial" w:cs="Arial" w:eastAsia="Arial" w:hAnsi="Arial"/>
+                <w:color w:val="2D3748"/>
+                <w:sz w:val="19"/>
+                <w:szCs w:val="19"/>
               </w:rPr>
               <w:t xml:space="preserve">subjectName, section, building, roomNumber, threshold (e.g. 75%), editWindowDays (10), enrolledStudents (Array).</w:t>
             </w:r>
@@ -2545,19 +2545,19 @@
             </w:tcBorders>
             <w:shd w:fill="FFFFFF" w:val="clear"/>
             <w:tcMar>
-              <w:top w:type="dxa" w:w="100"/>
-              <w:left w:type="dxa" w:w="140"/>
-              <w:bottom w:type="dxa" w:w="100"/>
-              <w:right w:type="dxa" w:w="140"/>
-            </w:tcMar>
-          </w:tcPr>
-          <w:p>
-            <w:r>
-              <w:rPr>
-                <w:rFonts w:ascii="Calibri" w:cs="Calibri" w:eastAsia="Calibri" w:hAnsi="Calibri"/>
-                <w:color w:val="2D3748"/>
-                <w:sz w:val="20"/>
-                <w:szCs w:val="20"/>
+              <w:top w:type="dxa" w:w="80"/>
+              <w:left w:type="dxa" w:w="120"/>
+              <w:bottom w:type="dxa" w:w="80"/>
+              <w:right w:type="dxa" w:w="120"/>
+            </w:tcMar>
+          </w:tcPr>
+          <w:p>
+            <w:r>
+              <w:rPr>
+                <w:rFonts w:ascii="Arial" w:cs="Arial" w:eastAsia="Arial" w:hAnsi="Arial"/>
+                <w:color w:val="2D3748"/>
+                <w:sz w:val="19"/>
+                <w:szCs w:val="19"/>
               </w:rPr>
               <w:t xml:space="preserve">attendance-system-students</w:t>
             </w:r>
@@ -2573,19 +2573,19 @@
             </w:tcBorders>
             <w:shd w:fill="FFFFFF" w:val="clear"/>
             <w:tcMar>
-              <w:top w:type="dxa" w:w="100"/>
-              <w:left w:type="dxa" w:w="140"/>
-              <w:bottom w:type="dxa" w:w="100"/>
-              <w:right w:type="dxa" w:w="140"/>
-            </w:tcMar>
-          </w:tcPr>
-          <w:p>
-            <w:r>
-              <w:rPr>
-                <w:rFonts w:ascii="Calibri" w:cs="Calibri" w:eastAsia="Calibri" w:hAnsi="Calibri"/>
-                <w:color w:val="2D3748"/>
-                <w:sz w:val="20"/>
-                <w:szCs w:val="20"/>
+              <w:top w:type="dxa" w:w="80"/>
+              <w:left w:type="dxa" w:w="120"/>
+              <w:bottom w:type="dxa" w:w="80"/>
+              <w:right w:type="dxa" w:w="120"/>
+            </w:tcMar>
+          </w:tcPr>
+          <w:p>
+            <w:r>
+              <w:rPr>
+                <w:rFonts w:ascii="Arial" w:cs="Arial" w:eastAsia="Arial" w:hAnsi="Arial"/>
+                <w:color w:val="2D3748"/>
+                <w:sz w:val="19"/>
+                <w:szCs w:val="19"/>
               </w:rPr>
               <w:t xml:space="preserve">studentId (String)</w:t>
             </w:r>
@@ -2601,19 +2601,19 @@
             </w:tcBorders>
             <w:shd w:fill="FFFFFF" w:val="clear"/>
             <w:tcMar>
-              <w:top w:type="dxa" w:w="100"/>
-              <w:left w:type="dxa" w:w="140"/>
-              <w:bottom w:type="dxa" w:w="100"/>
-              <w:right w:type="dxa" w:w="140"/>
-            </w:tcMar>
-          </w:tcPr>
-          <w:p>
-            <w:r>
-              <w:rPr>
-                <w:rFonts w:ascii="Calibri" w:cs="Calibri" w:eastAsia="Calibri" w:hAnsi="Calibri"/>
-                <w:color w:val="2D3748"/>
-                <w:sz w:val="20"/>
-                <w:szCs w:val="20"/>
+              <w:top w:type="dxa" w:w="80"/>
+              <w:left w:type="dxa" w:w="120"/>
+              <w:bottom w:type="dxa" w:w="80"/>
+              <w:right w:type="dxa" w:w="120"/>
+            </w:tcMar>
+          </w:tcPr>
+          <w:p>
+            <w:r>
+              <w:rPr>
+                <w:rFonts w:ascii="Arial" w:cs="Arial" w:eastAsia="Arial" w:hAnsi="Arial"/>
+                <w:color w:val="2D3748"/>
+                <w:sz w:val="19"/>
+                <w:szCs w:val="19"/>
               </w:rPr>
               <w:t xml:space="preserve">email (String)</w:t>
             </w:r>
@@ -2629,19 +2629,19 @@
             </w:tcBorders>
             <w:shd w:fill="FFFFFF" w:val="clear"/>
             <w:tcMar>
-              <w:top w:type="dxa" w:w="100"/>
-              <w:left w:type="dxa" w:w="140"/>
-              <w:bottom w:type="dxa" w:w="100"/>
-              <w:right w:type="dxa" w:w="140"/>
-            </w:tcMar>
-          </w:tcPr>
-          <w:p>
-            <w:r>
-              <w:rPr>
-                <w:rFonts w:ascii="Calibri" w:cs="Calibri" w:eastAsia="Calibri" w:hAnsi="Calibri"/>
-                <w:color w:val="2D3748"/>
-                <w:sz w:val="20"/>
-                <w:szCs w:val="20"/>
+              <w:top w:type="dxa" w:w="80"/>
+              <w:left w:type="dxa" w:w="120"/>
+              <w:bottom w:type="dxa" w:w="80"/>
+              <w:right w:type="dxa" w:w="120"/>
+            </w:tcMar>
+          </w:tcPr>
+          <w:p>
+            <w:r>
+              <w:rPr>
+                <w:rFonts w:ascii="Arial" w:cs="Arial" w:eastAsia="Arial" w:hAnsi="Arial"/>
+                <w:color w:val="2D3748"/>
+                <w:sz w:val="19"/>
+                <w:szCs w:val="19"/>
               </w:rPr>
               <w:t xml:space="preserve">name, rollNumber, section, department, semester, photoUrl, faceRegistered (Boolean), createdAt.</w:t>
             </w:r>
@@ -2659,19 +2659,19 @@
             </w:tcBorders>
             <w:shd w:fill="F7FAFC" w:val="clear"/>
             <w:tcMar>
-              <w:top w:type="dxa" w:w="100"/>
-              <w:left w:type="dxa" w:w="140"/>
-              <w:bottom w:type="dxa" w:w="100"/>
-              <w:right w:type="dxa" w:w="140"/>
-            </w:tcMar>
-          </w:tcPr>
-          <w:p>
-            <w:r>
-              <w:rPr>
-                <w:rFonts w:ascii="Calibri" w:cs="Calibri" w:eastAsia="Calibri" w:hAnsi="Calibri"/>
-                <w:color w:val="2D3748"/>
-                <w:sz w:val="20"/>
-                <w:szCs w:val="20"/>
+              <w:top w:type="dxa" w:w="80"/>
+              <w:left w:type="dxa" w:w="120"/>
+              <w:bottom w:type="dxa" w:w="80"/>
+              <w:right w:type="dxa" w:w="120"/>
+            </w:tcMar>
+          </w:tcPr>
+          <w:p>
+            <w:r>
+              <w:rPr>
+                <w:rFonts w:ascii="Arial" w:cs="Arial" w:eastAsia="Arial" w:hAnsi="Arial"/>
+                <w:color w:val="2D3748"/>
+                <w:sz w:val="19"/>
+                <w:szCs w:val="19"/>
               </w:rPr>
               <w:t xml:space="preserve">attendance-system-attendance</w:t>
             </w:r>
@@ -2687,19 +2687,19 @@
             </w:tcBorders>
             <w:shd w:fill="F7FAFC" w:val="clear"/>
             <w:tcMar>
-              <w:top w:type="dxa" w:w="100"/>
-              <w:left w:type="dxa" w:w="140"/>
-              <w:bottom w:type="dxa" w:w="100"/>
-              <w:right w:type="dxa" w:w="140"/>
-            </w:tcMar>
-          </w:tcPr>
-          <w:p>
-            <w:r>
-              <w:rPr>
-                <w:rFonts w:ascii="Calibri" w:cs="Calibri" w:eastAsia="Calibri" w:hAnsi="Calibri"/>
-                <w:color w:val="2D3748"/>
-                <w:sz w:val="20"/>
-                <w:szCs w:val="20"/>
+              <w:top w:type="dxa" w:w="80"/>
+              <w:left w:type="dxa" w:w="120"/>
+              <w:bottom w:type="dxa" w:w="80"/>
+              <w:right w:type="dxa" w:w="120"/>
+            </w:tcMar>
+          </w:tcPr>
+          <w:p>
+            <w:r>
+              <w:rPr>
+                <w:rFonts w:ascii="Arial" w:cs="Arial" w:eastAsia="Arial" w:hAnsi="Arial"/>
+                <w:color w:val="2D3748"/>
+                <w:sz w:val="19"/>
+                <w:szCs w:val="19"/>
               </w:rPr>
               <w:t xml:space="preserve">subjectClass (String)</w:t>
             </w:r>
@@ -2715,19 +2715,19 @@
             </w:tcBorders>
             <w:shd w:fill="F7FAFC" w:val="clear"/>
             <w:tcMar>
-              <w:top w:type="dxa" w:w="100"/>
-              <w:left w:type="dxa" w:w="140"/>
-              <w:bottom w:type="dxa" w:w="100"/>
-              <w:right w:type="dxa" w:w="140"/>
-            </w:tcMar>
-          </w:tcPr>
-          <w:p>
-            <w:r>
-              <w:rPr>
-                <w:rFonts w:ascii="Calibri" w:cs="Calibri" w:eastAsia="Calibri" w:hAnsi="Calibri"/>
-                <w:color w:val="2D3748"/>
-                <w:sz w:val="20"/>
-                <w:szCs w:val="20"/>
+              <w:top w:type="dxa" w:w="80"/>
+              <w:left w:type="dxa" w:w="120"/>
+              <w:bottom w:type="dxa" w:w="80"/>
+              <w:right w:type="dxa" w:w="120"/>
+            </w:tcMar>
+          </w:tcPr>
+          <w:p>
+            <w:r>
+              <w:rPr>
+                <w:rFonts w:ascii="Arial" w:cs="Arial" w:eastAsia="Arial" w:hAnsi="Arial"/>
+                <w:color w:val="2D3748"/>
+                <w:sz w:val="19"/>
+                <w:szCs w:val="19"/>
               </w:rPr>
               <w:t xml:space="preserve">recordKey (Date#Period#StudentID)</w:t>
             </w:r>
@@ -2743,19 +2743,19 @@
             </w:tcBorders>
             <w:shd w:fill="F7FAFC" w:val="clear"/>
             <w:tcMar>
-              <w:top w:type="dxa" w:w="100"/>
-              <w:left w:type="dxa" w:w="140"/>
-              <w:bottom w:type="dxa" w:w="100"/>
-              <w:right w:type="dxa" w:w="140"/>
-            </w:tcMar>
-          </w:tcPr>
-          <w:p>
-            <w:r>
-              <w:rPr>
-                <w:rFonts w:ascii="Calibri" w:cs="Calibri" w:eastAsia="Calibri" w:hAnsi="Calibri"/>
-                <w:color w:val="2D3748"/>
-                <w:sz w:val="20"/>
-                <w:szCs w:val="20"/>
+              <w:top w:type="dxa" w:w="80"/>
+              <w:left w:type="dxa" w:w="120"/>
+              <w:bottom w:type="dxa" w:w="80"/>
+              <w:right w:type="dxa" w:w="120"/>
+            </w:tcMar>
+          </w:tcPr>
+          <w:p>
+            <w:r>
+              <w:rPr>
+                <w:rFonts w:ascii="Arial" w:cs="Arial" w:eastAsia="Arial" w:hAnsi="Arial"/>
+                <w:color w:val="2D3748"/>
+                <w:sz w:val="19"/>
+                <w:szCs w:val="19"/>
               </w:rPr>
               <w:t xml:space="preserve">date, period, studentId, status (present/absent/late), markedBy, markedAt, confidence.</w:t>
             </w:r>
@@ -2773,19 +2773,19 @@
             </w:tcBorders>
             <w:shd w:fill="FFFFFF" w:val="clear"/>
             <w:tcMar>
-              <w:top w:type="dxa" w:w="100"/>
-              <w:left w:type="dxa" w:w="140"/>
-              <w:bottom w:type="dxa" w:w="100"/>
-              <w:right w:type="dxa" w:w="140"/>
-            </w:tcMar>
-          </w:tcPr>
-          <w:p>
-            <w:r>
-              <w:rPr>
-                <w:rFonts w:ascii="Calibri" w:cs="Calibri" w:eastAsia="Calibri" w:hAnsi="Calibri"/>
-                <w:color w:val="2D3748"/>
-                <w:sz w:val="20"/>
-                <w:szCs w:val="20"/>
+              <w:top w:type="dxa" w:w="80"/>
+              <w:left w:type="dxa" w:w="120"/>
+              <w:bottom w:type="dxa" w:w="80"/>
+              <w:right w:type="dxa" w:w="120"/>
+            </w:tcMar>
+          </w:tcPr>
+          <w:p>
+            <w:r>
+              <w:rPr>
+                <w:rFonts w:ascii="Arial" w:cs="Arial" w:eastAsia="Arial" w:hAnsi="Arial"/>
+                <w:color w:val="2D3748"/>
+                <w:sz w:val="19"/>
+                <w:szCs w:val="19"/>
               </w:rPr>
               <w:t xml:space="preserve">attendance-system-teacher-attendance</w:t>
             </w:r>
@@ -2801,19 +2801,19 @@
             </w:tcBorders>
             <w:shd w:fill="FFFFFF" w:val="clear"/>
             <w:tcMar>
-              <w:top w:type="dxa" w:w="100"/>
-              <w:left w:type="dxa" w:w="140"/>
-              <w:bottom w:type="dxa" w:w="100"/>
-              <w:right w:type="dxa" w:w="140"/>
-            </w:tcMar>
-          </w:tcPr>
-          <w:p>
-            <w:r>
-              <w:rPr>
-                <w:rFonts w:ascii="Calibri" w:cs="Calibri" w:eastAsia="Calibri" w:hAnsi="Calibri"/>
-                <w:color w:val="2D3748"/>
-                <w:sz w:val="20"/>
-                <w:szCs w:val="20"/>
+              <w:top w:type="dxa" w:w="80"/>
+              <w:left w:type="dxa" w:w="120"/>
+              <w:bottom w:type="dxa" w:w="80"/>
+              <w:right w:type="dxa" w:w="120"/>
+            </w:tcMar>
+          </w:tcPr>
+          <w:p>
+            <w:r>
+              <w:rPr>
+                <w:rFonts w:ascii="Arial" w:cs="Arial" w:eastAsia="Arial" w:hAnsi="Arial"/>
+                <w:color w:val="2D3748"/>
+                <w:sz w:val="19"/>
+                <w:szCs w:val="19"/>
               </w:rPr>
               <w:t xml:space="preserve">teacherId (String)</w:t>
             </w:r>
@@ -2829,19 +2829,19 @@
             </w:tcBorders>
             <w:shd w:fill="FFFFFF" w:val="clear"/>
             <w:tcMar>
-              <w:top w:type="dxa" w:w="100"/>
-              <w:left w:type="dxa" w:w="140"/>
-              <w:bottom w:type="dxa" w:w="100"/>
-              <w:right w:type="dxa" w:w="140"/>
-            </w:tcMar>
-          </w:tcPr>
-          <w:p>
-            <w:r>
-              <w:rPr>
-                <w:rFonts w:ascii="Calibri" w:cs="Calibri" w:eastAsia="Calibri" w:hAnsi="Calibri"/>
-                <w:color w:val="2D3748"/>
-                <w:sz w:val="20"/>
-                <w:szCs w:val="20"/>
+              <w:top w:type="dxa" w:w="80"/>
+              <w:left w:type="dxa" w:w="120"/>
+              <w:bottom w:type="dxa" w:w="80"/>
+              <w:right w:type="dxa" w:w="120"/>
+            </w:tcMar>
+          </w:tcPr>
+          <w:p>
+            <w:r>
+              <w:rPr>
+                <w:rFonts w:ascii="Arial" w:cs="Arial" w:eastAsia="Arial" w:hAnsi="Arial"/>
+                <w:color w:val="2D3748"/>
+                <w:sz w:val="19"/>
+                <w:szCs w:val="19"/>
               </w:rPr>
               <w:t xml:space="preserve">date (String, YYYY-MM-DD)</w:t>
             </w:r>
@@ -2857,19 +2857,19 @@
             </w:tcBorders>
             <w:shd w:fill="FFFFFF" w:val="clear"/>
             <w:tcMar>
-              <w:top w:type="dxa" w:w="100"/>
-              <w:left w:type="dxa" w:w="140"/>
-              <w:bottom w:type="dxa" w:w="100"/>
-              <w:right w:type="dxa" w:w="140"/>
-            </w:tcMar>
-          </w:tcPr>
-          <w:p>
-            <w:r>
-              <w:rPr>
-                <w:rFonts w:ascii="Calibri" w:cs="Calibri" w:eastAsia="Calibri" w:hAnsi="Calibri"/>
-                <w:color w:val="2D3748"/>
-                <w:sz w:val="20"/>
-                <w:szCs w:val="20"/>
+              <w:top w:type="dxa" w:w="80"/>
+              <w:left w:type="dxa" w:w="120"/>
+              <w:bottom w:type="dxa" w:w="80"/>
+              <w:right w:type="dxa" w:w="120"/>
+            </w:tcMar>
+          </w:tcPr>
+          <w:p>
+            <w:r>
+              <w:rPr>
+                <w:rFonts w:ascii="Arial" w:cs="Arial" w:eastAsia="Arial" w:hAnsi="Arial"/>
+                <w:color w:val="2D3748"/>
+                <w:sz w:val="19"/>
+                <w:szCs w:val="19"/>
               </w:rPr>
               <w:t xml:space="preserve">status (present), verifiedAt, snapshotUrl, verifiedVia (Rekognition).</w:t>
             </w:r>
@@ -2879,23 +2879,23 @@
     </w:tbl>
     <w:p>
       <w:pPr>
-        <w:spacing w:after="120" w:before="240"/>
+        <w:spacing w:after="100" w:before="180"/>
       </w:pPr>
     </w:p>
     <w:p>
       <w:pPr>
         <w:pStyle w:val="Heading1"/>
         <w:spacing w:after="140" w:before="360"/>
-        <w:rPr>
-          <w:rFonts w:ascii="Calibri" w:cs="Calibri" w:eastAsia="Calibri" w:hAnsi="Calibri"/>
+      </w:pPr>
+      <w:r>
+        <w:rPr>
+          <w:rFonts w:ascii="Arial" w:cs="Arial" w:eastAsia="Arial" w:hAnsi="Arial"/>
           <w:b/>
           <w:bCs/>
           <w:color w:val="0A2540"/>
-          <w:sz w:val="32"/>
-          <w:szCs w:val="32"/>
-        </w:rPr>
-      </w:pPr>
-      <w:r>
+          <w:sz w:val="30"/>
+          <w:szCs w:val="30"/>
+        </w:rPr>
         <w:t xml:space="preserve">5. AI Facial Recognition Pipeline &amp; Security Safeguards</w:t>
       </w:r>
     </w:p>
@@ -2905,14 +2905,14 @@
       </w:pPr>
       <w:r>
         <w:rPr>
-          <w:rFonts w:ascii="Calibri" w:cs="Calibri" w:eastAsia="Calibri" w:hAnsi="Calibri"/>
+          <w:rFonts w:ascii="Arial" w:cs="Arial" w:eastAsia="Arial" w:hAnsi="Arial"/>
           <w:b w:val="false"/>
           <w:bCs w:val="false"/>
           <w:i w:val="false"/>
           <w:iCs w:val="false"/>
           <w:color w:val="2D3748"/>
-          <w:sz w:val="22"/>
-          <w:szCs w:val="22"/>
+          <w:sz w:val="21"/>
+          <w:szCs w:val="21"/>
         </w:rPr>
         <w:t xml:space="preserve">The biometric attendance verification workflow is engineered with multi-tiered safeguards to prevent spoofing and ensure high matching accuracy:</w:t>
       </w:r>
@@ -2921,16 +2921,16 @@
       <w:pPr>
         <w:pStyle w:val="Heading2"/>
         <w:spacing w:after="100" w:before="240"/>
-        <w:rPr>
-          <w:rFonts w:ascii="Calibri" w:cs="Calibri" w:eastAsia="Calibri" w:hAnsi="Calibri"/>
+      </w:pPr>
+      <w:r>
+        <w:rPr>
+          <w:rFonts w:ascii="Arial" w:cs="Arial" w:eastAsia="Arial" w:hAnsi="Arial"/>
           <w:b/>
           <w:bCs/>
           <w:color w:val="0066CC"/>
-          <w:sz w:val="26"/>
-          <w:szCs w:val="26"/>
-        </w:rPr>
-      </w:pPr>
-      <w:r>
+          <w:sz w:val="24"/>
+          <w:szCs w:val="24"/>
+        </w:rPr>
         <w:t xml:space="preserve">5.1 Biometric Processing Workflow</w:t>
       </w:r>
     </w:p>
@@ -2945,21 +2945,21 @@
       </w:pPr>
       <w:r>
         <w:rPr>
-          <w:rFonts w:ascii="Calibri" w:cs="Calibri" w:eastAsia="Calibri" w:hAnsi="Calibri"/>
+          <w:rFonts w:ascii="Arial" w:cs="Arial" w:eastAsia="Arial" w:hAnsi="Arial"/>
           <w:b/>
           <w:bCs/>
           <w:color w:val="0A2540"/>
-          <w:sz w:val="22"/>
-          <w:szCs w:val="22"/>
+          <w:sz w:val="21"/>
+          <w:szCs w:val="21"/>
         </w:rPr>
         <w:t xml:space="preserve">1. </w:t>
       </w:r>
       <w:r>
         <w:rPr>
-          <w:rFonts w:ascii="Calibri" w:cs="Calibri" w:eastAsia="Calibri" w:hAnsi="Calibri"/>
+          <w:rFonts w:ascii="Arial" w:cs="Arial" w:eastAsia="Arial" w:hAnsi="Arial"/>
           <w:color w:val="2D3748"/>
-          <w:sz w:val="22"/>
-          <w:szCs w:val="22"/>
+          <w:sz w:val="21"/>
+          <w:szCs w:val="21"/>
         </w:rPr>
         <w:t xml:space="preserve">Camera Capture: The client browser accesses the local webcam via navigator.mediaDevices.getUserMedia() and captures a high-resolution JPEG snapshot onto an off-screen HTML5 canvas.</w:t>
       </w:r>
@@ -2975,21 +2975,21 @@
       </w:pPr>
       <w:r>
         <w:rPr>
-          <w:rFonts w:ascii="Calibri" w:cs="Calibri" w:eastAsia="Calibri" w:hAnsi="Calibri"/>
+          <w:rFonts w:ascii="Arial" w:cs="Arial" w:eastAsia="Arial" w:hAnsi="Arial"/>
           <w:b/>
           <w:bCs/>
           <w:color w:val="0A2540"/>
-          <w:sz w:val="22"/>
-          <w:szCs w:val="22"/>
+          <w:sz w:val="21"/>
+          <w:szCs w:val="21"/>
         </w:rPr>
         <w:t xml:space="preserve">2. </w:t>
       </w:r>
       <w:r>
         <w:rPr>
-          <w:rFonts w:ascii="Calibri" w:cs="Calibri" w:eastAsia="Calibri" w:hAnsi="Calibri"/>
+          <w:rFonts w:ascii="Arial" w:cs="Arial" w:eastAsia="Arial" w:hAnsi="Arial"/>
           <w:color w:val="2D3748"/>
-          <w:sz w:val="22"/>
-          <w:szCs w:val="22"/>
+          <w:sz w:val="21"/>
+          <w:szCs w:val="21"/>
         </w:rPr>
         <w:t xml:space="preserve">Client-to-Cloud Transmission: The snapshot is base64-encoded and transmitted over an HTTPS POST request to API Gateway /faces/verify.</w:t>
       </w:r>
@@ -3005,21 +3005,21 @@
       </w:pPr>
       <w:r>
         <w:rPr>
-          <w:rFonts w:ascii="Calibri" w:cs="Calibri" w:eastAsia="Calibri" w:hAnsi="Calibri"/>
+          <w:rFonts w:ascii="Arial" w:cs="Arial" w:eastAsia="Arial" w:hAnsi="Arial"/>
           <w:b/>
           <w:bCs/>
           <w:color w:val="0A2540"/>
-          <w:sz w:val="22"/>
-          <w:szCs w:val="22"/>
+          <w:sz w:val="21"/>
+          <w:szCs w:val="21"/>
         </w:rPr>
         <w:t xml:space="preserve">3. </w:t>
       </w:r>
       <w:r>
         <w:rPr>
-          <w:rFonts w:ascii="Calibri" w:cs="Calibri" w:eastAsia="Calibri" w:hAnsi="Calibri"/>
+          <w:rFonts w:ascii="Arial" w:cs="Arial" w:eastAsia="Arial" w:hAnsi="Arial"/>
           <w:color w:val="2D3748"/>
-          <w:sz w:val="22"/>
-          <w:szCs w:val="22"/>
+          <w:sz w:val="21"/>
+          <w:szCs w:val="21"/>
         </w:rPr>
         <w:t xml:space="preserve">Face Liveness &amp; Detection: AWS Lambda invokes rekognition.detect_faces() to confirm that exactly one clear human face with unobstructed features is present in the live frame.</w:t>
       </w:r>
@@ -3035,21 +3035,21 @@
       </w:pPr>
       <w:r>
         <w:rPr>
-          <w:rFonts w:ascii="Calibri" w:cs="Calibri" w:eastAsia="Calibri" w:hAnsi="Calibri"/>
+          <w:rFonts w:ascii="Arial" w:cs="Arial" w:eastAsia="Arial" w:hAnsi="Arial"/>
           <w:b/>
           <w:bCs/>
           <w:color w:val="0A2540"/>
-          <w:sz w:val="22"/>
-          <w:szCs w:val="22"/>
+          <w:sz w:val="21"/>
+          <w:szCs w:val="21"/>
         </w:rPr>
         <w:t xml:space="preserve">4. </w:t>
       </w:r>
       <w:r>
         <w:rPr>
-          <w:rFonts w:ascii="Calibri" w:cs="Calibri" w:eastAsia="Calibri" w:hAnsi="Calibri"/>
+          <w:rFonts w:ascii="Arial" w:cs="Arial" w:eastAsia="Arial" w:hAnsi="Arial"/>
           <w:color w:val="2D3748"/>
-          <w:sz w:val="22"/>
-          <w:szCs w:val="22"/>
+          <w:sz w:val="21"/>
+          <w:szCs w:val="21"/>
         </w:rPr>
         <w:t xml:space="preserve">Reference Fetch: Lambda retrieves the student’s enrolled reference portrait (reference_faces/{studentId}.jpg) from the secure Amazon S3 photos bucket.</w:t>
       </w:r>
@@ -3065,21 +3065,21 @@
       </w:pPr>
       <w:r>
         <w:rPr>
-          <w:rFonts w:ascii="Calibri" w:cs="Calibri" w:eastAsia="Calibri" w:hAnsi="Calibri"/>
+          <w:rFonts w:ascii="Arial" w:cs="Arial" w:eastAsia="Arial" w:hAnsi="Arial"/>
           <w:b/>
           <w:bCs/>
           <w:color w:val="0A2540"/>
-          <w:sz w:val="22"/>
-          <w:szCs w:val="22"/>
+          <w:sz w:val="21"/>
+          <w:szCs w:val="21"/>
         </w:rPr>
         <w:t xml:space="preserve">5. </w:t>
       </w:r>
       <w:r>
         <w:rPr>
-          <w:rFonts w:ascii="Calibri" w:cs="Calibri" w:eastAsia="Calibri" w:hAnsi="Calibri"/>
+          <w:rFonts w:ascii="Arial" w:cs="Arial" w:eastAsia="Arial" w:hAnsi="Arial"/>
           <w:color w:val="2D3748"/>
-          <w:sz w:val="22"/>
-          <w:szCs w:val="22"/>
+          <w:sz w:val="21"/>
+          <w:szCs w:val="21"/>
         </w:rPr>
         <w:t xml:space="preserve">Biometric Comparison: Lambda invokes rekognition.compare_faces(SourceImage, TargetImage, SimilarityThreshold=85.0). If Similarity &gt;= 85.0%, the match is verified and the confidence score is returned.</w:t>
       </w:r>
@@ -3095,44 +3095,44 @@
       </w:pPr>
       <w:r>
         <w:rPr>
-          <w:rFonts w:ascii="Calibri" w:cs="Calibri" w:eastAsia="Calibri" w:hAnsi="Calibri"/>
+          <w:rFonts w:ascii="Arial" w:cs="Arial" w:eastAsia="Arial" w:hAnsi="Arial"/>
           <w:b/>
           <w:bCs/>
           <w:color w:val="0A2540"/>
-          <w:sz w:val="22"/>
-          <w:szCs w:val="22"/>
+          <w:sz w:val="21"/>
+          <w:szCs w:val="21"/>
         </w:rPr>
         <w:t xml:space="preserve">6. </w:t>
       </w:r>
       <w:r>
         <w:rPr>
-          <w:rFonts w:ascii="Calibri" w:cs="Calibri" w:eastAsia="Calibri" w:hAnsi="Calibri"/>
+          <w:rFonts w:ascii="Arial" w:cs="Arial" w:eastAsia="Arial" w:hAnsi="Arial"/>
           <w:color w:val="2D3748"/>
-          <w:sz w:val="22"/>
-          <w:szCs w:val="22"/>
+          <w:sz w:val="21"/>
+          <w:szCs w:val="21"/>
         </w:rPr>
         <w:t xml:space="preserve">Automatic Enrollment Fallback: If no reference portrait exists (isFirstTime: true), the UI allows immediate 1-click registration to enroll the image as the master biometric baseline.</w:t>
       </w:r>
     </w:p>
     <w:p>
       <w:pPr>
-        <w:spacing w:after="120" w:before="240"/>
+        <w:spacing w:after="100" w:before="180"/>
       </w:pPr>
     </w:p>
     <w:p>
       <w:pPr>
         <w:pStyle w:val="Heading1"/>
         <w:spacing w:after="140" w:before="360"/>
-        <w:rPr>
-          <w:rFonts w:ascii="Calibri" w:cs="Calibri" w:eastAsia="Calibri" w:hAnsi="Calibri"/>
+      </w:pPr>
+      <w:r>
+        <w:rPr>
+          <w:rFonts w:ascii="Arial" w:cs="Arial" w:eastAsia="Arial" w:hAnsi="Arial"/>
           <w:b/>
           <w:bCs/>
           <w:color w:val="0A2540"/>
-          <w:sz w:val="32"/>
-          <w:szCs w:val="32"/>
-        </w:rPr>
-      </w:pPr>
-      <w:r>
+          <w:sz w:val="30"/>
+          <w:szCs w:val="30"/>
+        </w:rPr>
         <w:t xml:space="preserve">6. AWS Free Tier Cost &amp; Scaling Analysis</w:t>
       </w:r>
     </w:p>
@@ -3142,14 +3142,14 @@
       </w:pPr>
       <w:r>
         <w:rPr>
-          <w:rFonts w:ascii="Calibri" w:cs="Calibri" w:eastAsia="Calibri" w:hAnsi="Calibri"/>
+          <w:rFonts w:ascii="Arial" w:cs="Arial" w:eastAsia="Arial" w:hAnsi="Arial"/>
           <w:b w:val="false"/>
           <w:bCs w:val="false"/>
           <w:i w:val="false"/>
           <w:iCs w:val="false"/>
           <w:color w:val="2D3748"/>
-          <w:sz w:val="22"/>
-          <w:szCs w:val="22"/>
+          <w:sz w:val="21"/>
+          <w:szCs w:val="21"/>
         </w:rPr>
         <w:t xml:space="preserve">Presently is designed to run indefinitely at zero cost under the AWS Free Tier allowances for typical academic departments (up to 50,000 active students and 1,000,000 monthly attendance checks):</w:t>
       </w:r>
@@ -3180,10 +3180,10 @@
           <w:tcPr>
             <w:shd w:fill="0A2540" w:val="clear"/>
             <w:tcMar>
-              <w:top w:type="dxa" w:w="120"/>
-              <w:left w:type="dxa" w:w="140"/>
-              <w:bottom w:type="dxa" w:w="120"/>
-              <w:right w:type="dxa" w:w="140"/>
+              <w:top w:type="dxa" w:w="100"/>
+              <w:left w:type="dxa" w:w="120"/>
+              <w:bottom w:type="dxa" w:w="100"/>
+              <w:right w:type="dxa" w:w="120"/>
             </w:tcMar>
           </w:tcPr>
           <w:p>
@@ -3192,12 +3192,12 @@
             </w:pPr>
             <w:r>
               <w:rPr>
-                <w:rFonts w:ascii="Calibri" w:cs="Calibri" w:eastAsia="Calibri" w:hAnsi="Calibri"/>
+                <w:rFonts w:ascii="Arial" w:cs="Arial" w:eastAsia="Arial" w:hAnsi="Arial"/>
                 <w:b/>
                 <w:bCs/>
                 <w:color w:val="FFFFFF"/>
-                <w:sz w:val="20"/>
-                <w:szCs w:val="20"/>
+                <w:sz w:val="19"/>
+                <w:szCs w:val="19"/>
               </w:rPr>
               <w:t xml:space="preserve">AWS Cloud Service</w:t>
             </w:r>
@@ -3207,10 +3207,10 @@
           <w:tcPr>
             <w:shd w:fill="0A2540" w:val="clear"/>
             <w:tcMar>
-              <w:top w:type="dxa" w:w="120"/>
-              <w:left w:type="dxa" w:w="140"/>
-              <w:bottom w:type="dxa" w:w="120"/>
-              <w:right w:type="dxa" w:w="140"/>
+              <w:top w:type="dxa" w:w="100"/>
+              <w:left w:type="dxa" w:w="120"/>
+              <w:bottom w:type="dxa" w:w="100"/>
+              <w:right w:type="dxa" w:w="120"/>
             </w:tcMar>
           </w:tcPr>
           <w:p>
@@ -3219,12 +3219,12 @@
             </w:pPr>
             <w:r>
               <w:rPr>
-                <w:rFonts w:ascii="Calibri" w:cs="Calibri" w:eastAsia="Calibri" w:hAnsi="Calibri"/>
+                <w:rFonts w:ascii="Arial" w:cs="Arial" w:eastAsia="Arial" w:hAnsi="Arial"/>
                 <w:b/>
                 <w:bCs/>
                 <w:color w:val="FFFFFF"/>
-                <w:sz w:val="20"/>
-                <w:szCs w:val="20"/>
+                <w:sz w:val="19"/>
+                <w:szCs w:val="19"/>
               </w:rPr>
               <w:t xml:space="preserve">Free Tier Monthly Allowance</w:t>
             </w:r>
@@ -3234,10 +3234,10 @@
           <w:tcPr>
             <w:shd w:fill="0A2540" w:val="clear"/>
             <w:tcMar>
-              <w:top w:type="dxa" w:w="120"/>
-              <w:left w:type="dxa" w:w="140"/>
-              <w:bottom w:type="dxa" w:w="120"/>
-              <w:right w:type="dxa" w:w="140"/>
+              <w:top w:type="dxa" w:w="100"/>
+              <w:left w:type="dxa" w:w="120"/>
+              <w:bottom w:type="dxa" w:w="100"/>
+              <w:right w:type="dxa" w:w="120"/>
             </w:tcMar>
           </w:tcPr>
           <w:p>
@@ -3246,12 +3246,12 @@
             </w:pPr>
             <w:r>
               <w:rPr>
-                <w:rFonts w:ascii="Calibri" w:cs="Calibri" w:eastAsia="Calibri" w:hAnsi="Calibri"/>
+                <w:rFonts w:ascii="Arial" w:cs="Arial" w:eastAsia="Arial" w:hAnsi="Arial"/>
                 <w:b/>
                 <w:bCs/>
                 <w:color w:val="FFFFFF"/>
-                <w:sz w:val="20"/>
-                <w:szCs w:val="20"/>
+                <w:sz w:val="19"/>
+                <w:szCs w:val="19"/>
               </w:rPr>
               <w:t xml:space="preserve">Project Usage (Per 1,000 Students)</w:t>
             </w:r>
@@ -3261,10 +3261,10 @@
           <w:tcPr>
             <w:shd w:fill="0A2540" w:val="clear"/>
             <w:tcMar>
-              <w:top w:type="dxa" w:w="120"/>
-              <w:left w:type="dxa" w:w="140"/>
-              <w:bottom w:type="dxa" w:w="120"/>
-              <w:right w:type="dxa" w:w="140"/>
+              <w:top w:type="dxa" w:w="100"/>
+              <w:left w:type="dxa" w:w="120"/>
+              <w:bottom w:type="dxa" w:w="100"/>
+              <w:right w:type="dxa" w:w="120"/>
             </w:tcMar>
           </w:tcPr>
           <w:p>
@@ -3273,12 +3273,12 @@
             </w:pPr>
             <w:r>
               <w:rPr>
-                <w:rFonts w:ascii="Calibri" w:cs="Calibri" w:eastAsia="Calibri" w:hAnsi="Calibri"/>
+                <w:rFonts w:ascii="Arial" w:cs="Arial" w:eastAsia="Arial" w:hAnsi="Arial"/>
                 <w:b/>
                 <w:bCs/>
                 <w:color w:val="FFFFFF"/>
-                <w:sz w:val="20"/>
-                <w:szCs w:val="20"/>
+                <w:sz w:val="19"/>
+                <w:szCs w:val="19"/>
               </w:rPr>
               <w:t xml:space="preserve">Estimated Monthly Cost</w:t>
             </w:r>
@@ -3296,19 +3296,19 @@
             </w:tcBorders>
             <w:shd w:fill="FFFFFF" w:val="clear"/>
             <w:tcMar>
-              <w:top w:type="dxa" w:w="100"/>
-              <w:left w:type="dxa" w:w="140"/>
-              <w:bottom w:type="dxa" w:w="100"/>
-              <w:right w:type="dxa" w:w="140"/>
-            </w:tcMar>
-          </w:tcPr>
-          <w:p>
-            <w:r>
-              <w:rPr>
-                <w:rFonts w:ascii="Calibri" w:cs="Calibri" w:eastAsia="Calibri" w:hAnsi="Calibri"/>
-                <w:color w:val="2D3748"/>
-                <w:sz w:val="20"/>
-                <w:szCs w:val="20"/>
+              <w:top w:type="dxa" w:w="80"/>
+              <w:left w:type="dxa" w:w="120"/>
+              <w:bottom w:type="dxa" w:w="80"/>
+              <w:right w:type="dxa" w:w="120"/>
+            </w:tcMar>
+          </w:tcPr>
+          <w:p>
+            <w:r>
+              <w:rPr>
+                <w:rFonts w:ascii="Arial" w:cs="Arial" w:eastAsia="Arial" w:hAnsi="Arial"/>
+                <w:color w:val="2D3748"/>
+                <w:sz w:val="19"/>
+                <w:szCs w:val="19"/>
               </w:rPr>
               <w:t xml:space="preserve">AWS Lambda</w:t>
             </w:r>
@@ -3324,19 +3324,19 @@
             </w:tcBorders>
             <w:shd w:fill="FFFFFF" w:val="clear"/>
             <w:tcMar>
-              <w:top w:type="dxa" w:w="100"/>
-              <w:left w:type="dxa" w:w="140"/>
-              <w:bottom w:type="dxa" w:w="100"/>
-              <w:right w:type="dxa" w:w="140"/>
-            </w:tcMar>
-          </w:tcPr>
-          <w:p>
-            <w:r>
-              <w:rPr>
-                <w:rFonts w:ascii="Calibri" w:cs="Calibri" w:eastAsia="Calibri" w:hAnsi="Calibri"/>
-                <w:color w:val="2D3748"/>
-                <w:sz w:val="20"/>
-                <w:szCs w:val="20"/>
+              <w:top w:type="dxa" w:w="80"/>
+              <w:left w:type="dxa" w:w="120"/>
+              <w:bottom w:type="dxa" w:w="80"/>
+              <w:right w:type="dxa" w:w="120"/>
+            </w:tcMar>
+          </w:tcPr>
+          <w:p>
+            <w:r>
+              <w:rPr>
+                <w:rFonts w:ascii="Arial" w:cs="Arial" w:eastAsia="Arial" w:hAnsi="Arial"/>
+                <w:color w:val="2D3748"/>
+                <w:sz w:val="19"/>
+                <w:szCs w:val="19"/>
               </w:rPr>
               <w:t xml:space="preserve">1,000,000 requests &amp; 3.2M sec compute</w:t>
             </w:r>
@@ -3352,19 +3352,19 @@
             </w:tcBorders>
             <w:shd w:fill="FFFFFF" w:val="clear"/>
             <w:tcMar>
-              <w:top w:type="dxa" w:w="100"/>
-              <w:left w:type="dxa" w:w="140"/>
-              <w:bottom w:type="dxa" w:w="100"/>
-              <w:right w:type="dxa" w:w="140"/>
-            </w:tcMar>
-          </w:tcPr>
-          <w:p>
-            <w:r>
-              <w:rPr>
-                <w:rFonts w:ascii="Calibri" w:cs="Calibri" w:eastAsia="Calibri" w:hAnsi="Calibri"/>
-                <w:color w:val="2D3748"/>
-                <w:sz w:val="20"/>
-                <w:szCs w:val="20"/>
+              <w:top w:type="dxa" w:w="80"/>
+              <w:left w:type="dxa" w:w="120"/>
+              <w:bottom w:type="dxa" w:w="80"/>
+              <w:right w:type="dxa" w:w="120"/>
+            </w:tcMar>
+          </w:tcPr>
+          <w:p>
+            <w:r>
+              <w:rPr>
+                <w:rFonts w:ascii="Arial" w:cs="Arial" w:eastAsia="Arial" w:hAnsi="Arial"/>
+                <w:color w:val="2D3748"/>
+                <w:sz w:val="19"/>
+                <w:szCs w:val="19"/>
               </w:rPr>
               <w:t xml:space="preserve">~60,000 requests/month</w:t>
             </w:r>
@@ -3380,19 +3380,19 @@
             </w:tcBorders>
             <w:shd w:fill="FFFFFF" w:val="clear"/>
             <w:tcMar>
-              <w:top w:type="dxa" w:w="100"/>
-              <w:left w:type="dxa" w:w="140"/>
-              <w:bottom w:type="dxa" w:w="100"/>
-              <w:right w:type="dxa" w:w="140"/>
-            </w:tcMar>
-          </w:tcPr>
-          <w:p>
-            <w:r>
-              <w:rPr>
-                <w:rFonts w:ascii="Calibri" w:cs="Calibri" w:eastAsia="Calibri" w:hAnsi="Calibri"/>
-                <w:color w:val="2D3748"/>
-                <w:sz w:val="20"/>
-                <w:szCs w:val="20"/>
+              <w:top w:type="dxa" w:w="80"/>
+              <w:left w:type="dxa" w:w="120"/>
+              <w:bottom w:type="dxa" w:w="80"/>
+              <w:right w:type="dxa" w:w="120"/>
+            </w:tcMar>
+          </w:tcPr>
+          <w:p>
+            <w:r>
+              <w:rPr>
+                <w:rFonts w:ascii="Arial" w:cs="Arial" w:eastAsia="Arial" w:hAnsi="Arial"/>
+                <w:color w:val="2D3748"/>
+                <w:sz w:val="19"/>
+                <w:szCs w:val="19"/>
               </w:rPr>
               <w:t xml:space="preserve">$0.00 (Always Free)</w:t>
             </w:r>
@@ -3410,19 +3410,19 @@
             </w:tcBorders>
             <w:shd w:fill="F7FAFC" w:val="clear"/>
             <w:tcMar>
-              <w:top w:type="dxa" w:w="100"/>
-              <w:left w:type="dxa" w:w="140"/>
-              <w:bottom w:type="dxa" w:w="100"/>
-              <w:right w:type="dxa" w:w="140"/>
-            </w:tcMar>
-          </w:tcPr>
-          <w:p>
-            <w:r>
-              <w:rPr>
-                <w:rFonts w:ascii="Calibri" w:cs="Calibri" w:eastAsia="Calibri" w:hAnsi="Calibri"/>
-                <w:color w:val="2D3748"/>
-                <w:sz w:val="20"/>
-                <w:szCs w:val="20"/>
+              <w:top w:type="dxa" w:w="80"/>
+              <w:left w:type="dxa" w:w="120"/>
+              <w:bottom w:type="dxa" w:w="80"/>
+              <w:right w:type="dxa" w:w="120"/>
+            </w:tcMar>
+          </w:tcPr>
+          <w:p>
+            <w:r>
+              <w:rPr>
+                <w:rFonts w:ascii="Arial" w:cs="Arial" w:eastAsia="Arial" w:hAnsi="Arial"/>
+                <w:color w:val="2D3748"/>
+                <w:sz w:val="19"/>
+                <w:szCs w:val="19"/>
               </w:rPr>
               <w:t xml:space="preserve">Amazon DynamoDB</w:t>
             </w:r>
@@ -3438,19 +3438,19 @@
             </w:tcBorders>
             <w:shd w:fill="F7FAFC" w:val="clear"/>
             <w:tcMar>
-              <w:top w:type="dxa" w:w="100"/>
-              <w:left w:type="dxa" w:w="140"/>
-              <w:bottom w:type="dxa" w:w="100"/>
-              <w:right w:type="dxa" w:w="140"/>
-            </w:tcMar>
-          </w:tcPr>
-          <w:p>
-            <w:r>
-              <w:rPr>
-                <w:rFonts w:ascii="Calibri" w:cs="Calibri" w:eastAsia="Calibri" w:hAnsi="Calibri"/>
-                <w:color w:val="2D3748"/>
-                <w:sz w:val="20"/>
-                <w:szCs w:val="20"/>
+              <w:top w:type="dxa" w:w="80"/>
+              <w:left w:type="dxa" w:w="120"/>
+              <w:bottom w:type="dxa" w:w="80"/>
+              <w:right w:type="dxa" w:w="120"/>
+            </w:tcMar>
+          </w:tcPr>
+          <w:p>
+            <w:r>
+              <w:rPr>
+                <w:rFonts w:ascii="Arial" w:cs="Arial" w:eastAsia="Arial" w:hAnsi="Arial"/>
+                <w:color w:val="2D3748"/>
+                <w:sz w:val="19"/>
+                <w:szCs w:val="19"/>
               </w:rPr>
               <w:t xml:space="preserve">25 GB Storage &amp; 25 RCU / 25 WCU</w:t>
             </w:r>
@@ -3466,19 +3466,19 @@
             </w:tcBorders>
             <w:shd w:fill="F7FAFC" w:val="clear"/>
             <w:tcMar>
-              <w:top w:type="dxa" w:w="100"/>
-              <w:left w:type="dxa" w:w="140"/>
-              <w:bottom w:type="dxa" w:w="100"/>
-              <w:right w:type="dxa" w:w="140"/>
-            </w:tcMar>
-          </w:tcPr>
-          <w:p>
-            <w:r>
-              <w:rPr>
-                <w:rFonts w:ascii="Calibri" w:cs="Calibri" w:eastAsia="Calibri" w:hAnsi="Calibri"/>
-                <w:color w:val="2D3748"/>
-                <w:sz w:val="20"/>
-                <w:szCs w:val="20"/>
+              <w:top w:type="dxa" w:w="80"/>
+              <w:left w:type="dxa" w:w="120"/>
+              <w:bottom w:type="dxa" w:w="80"/>
+              <w:right w:type="dxa" w:w="120"/>
+            </w:tcMar>
+          </w:tcPr>
+          <w:p>
+            <w:r>
+              <w:rPr>
+                <w:rFonts w:ascii="Arial" w:cs="Arial" w:eastAsia="Arial" w:hAnsi="Arial"/>
+                <w:color w:val="2D3748"/>
+                <w:sz w:val="19"/>
+                <w:szCs w:val="19"/>
               </w:rPr>
               <w:t xml:space="preserve">~150 MB database size</w:t>
             </w:r>
@@ -3494,19 +3494,19 @@
             </w:tcBorders>
             <w:shd w:fill="F7FAFC" w:val="clear"/>
             <w:tcMar>
-              <w:top w:type="dxa" w:w="100"/>
-              <w:left w:type="dxa" w:w="140"/>
-              <w:bottom w:type="dxa" w:w="100"/>
-              <w:right w:type="dxa" w:w="140"/>
-            </w:tcMar>
-          </w:tcPr>
-          <w:p>
-            <w:r>
-              <w:rPr>
-                <w:rFonts w:ascii="Calibri" w:cs="Calibri" w:eastAsia="Calibri" w:hAnsi="Calibri"/>
-                <w:color w:val="2D3748"/>
-                <w:sz w:val="20"/>
-                <w:szCs w:val="20"/>
+              <w:top w:type="dxa" w:w="80"/>
+              <w:left w:type="dxa" w:w="120"/>
+              <w:bottom w:type="dxa" w:w="80"/>
+              <w:right w:type="dxa" w:w="120"/>
+            </w:tcMar>
+          </w:tcPr>
+          <w:p>
+            <w:r>
+              <w:rPr>
+                <w:rFonts w:ascii="Arial" w:cs="Arial" w:eastAsia="Arial" w:hAnsi="Arial"/>
+                <w:color w:val="2D3748"/>
+                <w:sz w:val="19"/>
+                <w:szCs w:val="19"/>
               </w:rPr>
               <w:t xml:space="preserve">$0.00 (Always Free)</w:t>
             </w:r>
@@ -3524,19 +3524,19 @@
             </w:tcBorders>
             <w:shd w:fill="FFFFFF" w:val="clear"/>
             <w:tcMar>
-              <w:top w:type="dxa" w:w="100"/>
-              <w:left w:type="dxa" w:w="140"/>
-              <w:bottom w:type="dxa" w:w="100"/>
-              <w:right w:type="dxa" w:w="140"/>
-            </w:tcMar>
-          </w:tcPr>
-          <w:p>
-            <w:r>
-              <w:rPr>
-                <w:rFonts w:ascii="Calibri" w:cs="Calibri" w:eastAsia="Calibri" w:hAnsi="Calibri"/>
-                <w:color w:val="2D3748"/>
-                <w:sz w:val="20"/>
-                <w:szCs w:val="20"/>
+              <w:top w:type="dxa" w:w="80"/>
+              <w:left w:type="dxa" w:w="120"/>
+              <w:bottom w:type="dxa" w:w="80"/>
+              <w:right w:type="dxa" w:w="120"/>
+            </w:tcMar>
+          </w:tcPr>
+          <w:p>
+            <w:r>
+              <w:rPr>
+                <w:rFonts w:ascii="Arial" w:cs="Arial" w:eastAsia="Arial" w:hAnsi="Arial"/>
+                <w:color w:val="2D3748"/>
+                <w:sz w:val="19"/>
+                <w:szCs w:val="19"/>
               </w:rPr>
               <w:t xml:space="preserve">Amazon Cognito</w:t>
             </w:r>
@@ -3552,19 +3552,19 @@
             </w:tcBorders>
             <w:shd w:fill="FFFFFF" w:val="clear"/>
             <w:tcMar>
-              <w:top w:type="dxa" w:w="100"/>
-              <w:left w:type="dxa" w:w="140"/>
-              <w:bottom w:type="dxa" w:w="100"/>
-              <w:right w:type="dxa" w:w="140"/>
-            </w:tcMar>
-          </w:tcPr>
-          <w:p>
-            <w:r>
-              <w:rPr>
-                <w:rFonts w:ascii="Calibri" w:cs="Calibri" w:eastAsia="Calibri" w:hAnsi="Calibri"/>
-                <w:color w:val="2D3748"/>
-                <w:sz w:val="20"/>
-                <w:szCs w:val="20"/>
+              <w:top w:type="dxa" w:w="80"/>
+              <w:left w:type="dxa" w:w="120"/>
+              <w:bottom w:type="dxa" w:w="80"/>
+              <w:right w:type="dxa" w:w="120"/>
+            </w:tcMar>
+          </w:tcPr>
+          <w:p>
+            <w:r>
+              <w:rPr>
+                <w:rFonts w:ascii="Arial" w:cs="Arial" w:eastAsia="Arial" w:hAnsi="Arial"/>
+                <w:color w:val="2D3748"/>
+                <w:sz w:val="19"/>
+                <w:szCs w:val="19"/>
               </w:rPr>
               <w:t xml:space="preserve">50,000 Monthly Active Users (MAUs)</w:t>
             </w:r>
@@ -3580,19 +3580,19 @@
             </w:tcBorders>
             <w:shd w:fill="FFFFFF" w:val="clear"/>
             <w:tcMar>
-              <w:top w:type="dxa" w:w="100"/>
-              <w:left w:type="dxa" w:w="140"/>
-              <w:bottom w:type="dxa" w:w="100"/>
-              <w:right w:type="dxa" w:w="140"/>
-            </w:tcMar>
-          </w:tcPr>
-          <w:p>
-            <w:r>
-              <w:rPr>
-                <w:rFonts w:ascii="Calibri" w:cs="Calibri" w:eastAsia="Calibri" w:hAnsi="Calibri"/>
-                <w:color w:val="2D3748"/>
-                <w:sz w:val="20"/>
-                <w:szCs w:val="20"/>
+              <w:top w:type="dxa" w:w="80"/>
+              <w:left w:type="dxa" w:w="120"/>
+              <w:bottom w:type="dxa" w:w="80"/>
+              <w:right w:type="dxa" w:w="120"/>
+            </w:tcMar>
+          </w:tcPr>
+          <w:p>
+            <w:r>
+              <w:rPr>
+                <w:rFonts w:ascii="Arial" w:cs="Arial" w:eastAsia="Arial" w:hAnsi="Arial"/>
+                <w:color w:val="2D3748"/>
+                <w:sz w:val="19"/>
+                <w:szCs w:val="19"/>
               </w:rPr>
               <w:t xml:space="preserve">~100 Faculty Users</w:t>
             </w:r>
@@ -3608,19 +3608,19 @@
             </w:tcBorders>
             <w:shd w:fill="FFFFFF" w:val="clear"/>
             <w:tcMar>
-              <w:top w:type="dxa" w:w="100"/>
-              <w:left w:type="dxa" w:w="140"/>
-              <w:bottom w:type="dxa" w:w="100"/>
-              <w:right w:type="dxa" w:w="140"/>
-            </w:tcMar>
-          </w:tcPr>
-          <w:p>
-            <w:r>
-              <w:rPr>
-                <w:rFonts w:ascii="Calibri" w:cs="Calibri" w:eastAsia="Calibri" w:hAnsi="Calibri"/>
-                <w:color w:val="2D3748"/>
-                <w:sz w:val="20"/>
-                <w:szCs w:val="20"/>
+              <w:top w:type="dxa" w:w="80"/>
+              <w:left w:type="dxa" w:w="120"/>
+              <w:bottom w:type="dxa" w:w="80"/>
+              <w:right w:type="dxa" w:w="120"/>
+            </w:tcMar>
+          </w:tcPr>
+          <w:p>
+            <w:r>
+              <w:rPr>
+                <w:rFonts w:ascii="Arial" w:cs="Arial" w:eastAsia="Arial" w:hAnsi="Arial"/>
+                <w:color w:val="2D3748"/>
+                <w:sz w:val="19"/>
+                <w:szCs w:val="19"/>
               </w:rPr>
               <w:t xml:space="preserve">$0.00 (Always Free)</w:t>
             </w:r>
@@ -3638,19 +3638,19 @@
             </w:tcBorders>
             <w:shd w:fill="F7FAFC" w:val="clear"/>
             <w:tcMar>
-              <w:top w:type="dxa" w:w="100"/>
-              <w:left w:type="dxa" w:w="140"/>
-              <w:bottom w:type="dxa" w:w="100"/>
-              <w:right w:type="dxa" w:w="140"/>
-            </w:tcMar>
-          </w:tcPr>
-          <w:p>
-            <w:r>
-              <w:rPr>
-                <w:rFonts w:ascii="Calibri" w:cs="Calibri" w:eastAsia="Calibri" w:hAnsi="Calibri"/>
-                <w:color w:val="2D3748"/>
-                <w:sz w:val="20"/>
-                <w:szCs w:val="20"/>
+              <w:top w:type="dxa" w:w="80"/>
+              <w:left w:type="dxa" w:w="120"/>
+              <w:bottom w:type="dxa" w:w="80"/>
+              <w:right w:type="dxa" w:w="120"/>
+            </w:tcMar>
+          </w:tcPr>
+          <w:p>
+            <w:r>
+              <w:rPr>
+                <w:rFonts w:ascii="Arial" w:cs="Arial" w:eastAsia="Arial" w:hAnsi="Arial"/>
+                <w:color w:val="2D3748"/>
+                <w:sz w:val="19"/>
+                <w:szCs w:val="19"/>
               </w:rPr>
               <w:t xml:space="preserve">Amazon CloudFront</w:t>
             </w:r>
@@ -3666,19 +3666,19 @@
             </w:tcBorders>
             <w:shd w:fill="F7FAFC" w:val="clear"/>
             <w:tcMar>
-              <w:top w:type="dxa" w:w="100"/>
-              <w:left w:type="dxa" w:w="140"/>
-              <w:bottom w:type="dxa" w:w="100"/>
-              <w:right w:type="dxa" w:w="140"/>
-            </w:tcMar>
-          </w:tcPr>
-          <w:p>
-            <w:r>
-              <w:rPr>
-                <w:rFonts w:ascii="Calibri" w:cs="Calibri" w:eastAsia="Calibri" w:hAnsi="Calibri"/>
-                <w:color w:val="2D3748"/>
-                <w:sz w:val="20"/>
-                <w:szCs w:val="20"/>
+              <w:top w:type="dxa" w:w="80"/>
+              <w:left w:type="dxa" w:w="120"/>
+              <w:bottom w:type="dxa" w:w="80"/>
+              <w:right w:type="dxa" w:w="120"/>
+            </w:tcMar>
+          </w:tcPr>
+          <w:p>
+            <w:r>
+              <w:rPr>
+                <w:rFonts w:ascii="Arial" w:cs="Arial" w:eastAsia="Arial" w:hAnsi="Arial"/>
+                <w:color w:val="2D3748"/>
+                <w:sz w:val="19"/>
+                <w:szCs w:val="19"/>
               </w:rPr>
               <w:t xml:space="preserve">1 TB Data Transfer Out &amp; 10M requests</w:t>
             </w:r>
@@ -3694,19 +3694,19 @@
             </w:tcBorders>
             <w:shd w:fill="F7FAFC" w:val="clear"/>
             <w:tcMar>
-              <w:top w:type="dxa" w:w="100"/>
-              <w:left w:type="dxa" w:w="140"/>
-              <w:bottom w:type="dxa" w:w="100"/>
-              <w:right w:type="dxa" w:w="140"/>
-            </w:tcMar>
-          </w:tcPr>
-          <w:p>
-            <w:r>
-              <w:rPr>
-                <w:rFonts w:ascii="Calibri" w:cs="Calibri" w:eastAsia="Calibri" w:hAnsi="Calibri"/>
-                <w:color w:val="2D3748"/>
-                <w:sz w:val="20"/>
-                <w:szCs w:val="20"/>
+              <w:top w:type="dxa" w:w="80"/>
+              <w:left w:type="dxa" w:w="120"/>
+              <w:bottom w:type="dxa" w:w="80"/>
+              <w:right w:type="dxa" w:w="120"/>
+            </w:tcMar>
+          </w:tcPr>
+          <w:p>
+            <w:r>
+              <w:rPr>
+                <w:rFonts w:ascii="Arial" w:cs="Arial" w:eastAsia="Arial" w:hAnsi="Arial"/>
+                <w:color w:val="2D3748"/>
+                <w:sz w:val="19"/>
+                <w:szCs w:val="19"/>
               </w:rPr>
               <w:t xml:space="preserve">~5 GB CDN traffic</w:t>
             </w:r>
@@ -3722,19 +3722,19 @@
             </w:tcBorders>
             <w:shd w:fill="F7FAFC" w:val="clear"/>
             <w:tcMar>
-              <w:top w:type="dxa" w:w="100"/>
-              <w:left w:type="dxa" w:w="140"/>
-              <w:bottom w:type="dxa" w:w="100"/>
-              <w:right w:type="dxa" w:w="140"/>
-            </w:tcMar>
-          </w:tcPr>
-          <w:p>
-            <w:r>
-              <w:rPr>
-                <w:rFonts w:ascii="Calibri" w:cs="Calibri" w:eastAsia="Calibri" w:hAnsi="Calibri"/>
-                <w:color w:val="2D3748"/>
-                <w:sz w:val="20"/>
-                <w:szCs w:val="20"/>
+              <w:top w:type="dxa" w:w="80"/>
+              <w:left w:type="dxa" w:w="120"/>
+              <w:bottom w:type="dxa" w:w="80"/>
+              <w:right w:type="dxa" w:w="120"/>
+            </w:tcMar>
+          </w:tcPr>
+          <w:p>
+            <w:r>
+              <w:rPr>
+                <w:rFonts w:ascii="Arial" w:cs="Arial" w:eastAsia="Arial" w:hAnsi="Arial"/>
+                <w:color w:val="2D3748"/>
+                <w:sz w:val="19"/>
+                <w:szCs w:val="19"/>
               </w:rPr>
               <w:t xml:space="preserve">$0.00 (Always Free)</w:t>
             </w:r>
@@ -3752,19 +3752,19 @@
             </w:tcBorders>
             <w:shd w:fill="FFFFFF" w:val="clear"/>
             <w:tcMar>
-              <w:top w:type="dxa" w:w="100"/>
-              <w:left w:type="dxa" w:w="140"/>
-              <w:bottom w:type="dxa" w:w="100"/>
-              <w:right w:type="dxa" w:w="140"/>
-            </w:tcMar>
-          </w:tcPr>
-          <w:p>
-            <w:r>
-              <w:rPr>
-                <w:rFonts w:ascii="Calibri" w:cs="Calibri" w:eastAsia="Calibri" w:hAnsi="Calibri"/>
-                <w:color w:val="2D3748"/>
-                <w:sz w:val="20"/>
-                <w:szCs w:val="20"/>
+              <w:top w:type="dxa" w:w="80"/>
+              <w:left w:type="dxa" w:w="120"/>
+              <w:bottom w:type="dxa" w:w="80"/>
+              <w:right w:type="dxa" w:w="120"/>
+            </w:tcMar>
+          </w:tcPr>
+          <w:p>
+            <w:r>
+              <w:rPr>
+                <w:rFonts w:ascii="Arial" w:cs="Arial" w:eastAsia="Arial" w:hAnsi="Arial"/>
+                <w:color w:val="2D3748"/>
+                <w:sz w:val="19"/>
+                <w:szCs w:val="19"/>
               </w:rPr>
               <w:t xml:space="preserve">Amazon S3</w:t>
             </w:r>
@@ -3780,19 +3780,19 @@
             </w:tcBorders>
             <w:shd w:fill="FFFFFF" w:val="clear"/>
             <w:tcMar>
-              <w:top w:type="dxa" w:w="100"/>
-              <w:left w:type="dxa" w:w="140"/>
-              <w:bottom w:type="dxa" w:w="100"/>
-              <w:right w:type="dxa" w:w="140"/>
-            </w:tcMar>
-          </w:tcPr>
-          <w:p>
-            <w:r>
-              <w:rPr>
-                <w:rFonts w:ascii="Calibri" w:cs="Calibri" w:eastAsia="Calibri" w:hAnsi="Calibri"/>
-                <w:color w:val="2D3748"/>
-                <w:sz w:val="20"/>
-                <w:szCs w:val="20"/>
+              <w:top w:type="dxa" w:w="80"/>
+              <w:left w:type="dxa" w:w="120"/>
+              <w:bottom w:type="dxa" w:w="80"/>
+              <w:right w:type="dxa" w:w="120"/>
+            </w:tcMar>
+          </w:tcPr>
+          <w:p>
+            <w:r>
+              <w:rPr>
+                <w:rFonts w:ascii="Arial" w:cs="Arial" w:eastAsia="Arial" w:hAnsi="Arial"/>
+                <w:color w:val="2D3748"/>
+                <w:sz w:val="19"/>
+                <w:szCs w:val="19"/>
               </w:rPr>
               <w:t xml:space="preserve">5 GB Standard Storage &amp; 20,000 GETs</w:t>
             </w:r>
@@ -3808,19 +3808,19 @@
             </w:tcBorders>
             <w:shd w:fill="FFFFFF" w:val="clear"/>
             <w:tcMar>
-              <w:top w:type="dxa" w:w="100"/>
-              <w:left w:type="dxa" w:w="140"/>
-              <w:bottom w:type="dxa" w:w="100"/>
-              <w:right w:type="dxa" w:w="140"/>
-            </w:tcMar>
-          </w:tcPr>
-          <w:p>
-            <w:r>
-              <w:rPr>
-                <w:rFonts w:ascii="Calibri" w:cs="Calibri" w:eastAsia="Calibri" w:hAnsi="Calibri"/>
-                <w:color w:val="2D3748"/>
-                <w:sz w:val="20"/>
-                <w:szCs w:val="20"/>
+              <w:top w:type="dxa" w:w="80"/>
+              <w:left w:type="dxa" w:w="120"/>
+              <w:bottom w:type="dxa" w:w="80"/>
+              <w:right w:type="dxa" w:w="120"/>
+            </w:tcMar>
+          </w:tcPr>
+          <w:p>
+            <w:r>
+              <w:rPr>
+                <w:rFonts w:ascii="Arial" w:cs="Arial" w:eastAsia="Arial" w:hAnsi="Arial"/>
+                <w:color w:val="2D3748"/>
+                <w:sz w:val="19"/>
+                <w:szCs w:val="19"/>
               </w:rPr>
               <w:t xml:space="preserve">~1.2 GB Photo storage</w:t>
             </w:r>
@@ -3836,19 +3836,19 @@
             </w:tcBorders>
             <w:shd w:fill="FFFFFF" w:val="clear"/>
             <w:tcMar>
-              <w:top w:type="dxa" w:w="100"/>
-              <w:left w:type="dxa" w:w="140"/>
-              <w:bottom w:type="dxa" w:w="100"/>
-              <w:right w:type="dxa" w:w="140"/>
-            </w:tcMar>
-          </w:tcPr>
-          <w:p>
-            <w:r>
-              <w:rPr>
-                <w:rFonts w:ascii="Calibri" w:cs="Calibri" w:eastAsia="Calibri" w:hAnsi="Calibri"/>
-                <w:color w:val="2D3748"/>
-                <w:sz w:val="20"/>
-                <w:szCs w:val="20"/>
+              <w:top w:type="dxa" w:w="80"/>
+              <w:left w:type="dxa" w:w="120"/>
+              <w:bottom w:type="dxa" w:w="80"/>
+              <w:right w:type="dxa" w:w="120"/>
+            </w:tcMar>
+          </w:tcPr>
+          <w:p>
+            <w:r>
+              <w:rPr>
+                <w:rFonts w:ascii="Arial" w:cs="Arial" w:eastAsia="Arial" w:hAnsi="Arial"/>
+                <w:color w:val="2D3748"/>
+                <w:sz w:val="19"/>
+                <w:szCs w:val="19"/>
               </w:rPr>
               <w:t xml:space="preserve">$0.00 (12-Month Free)</w:t>
             </w:r>
@@ -3866,19 +3866,19 @@
             </w:tcBorders>
             <w:shd w:fill="F7FAFC" w:val="clear"/>
             <w:tcMar>
-              <w:top w:type="dxa" w:w="100"/>
-              <w:left w:type="dxa" w:w="140"/>
-              <w:bottom w:type="dxa" w:w="100"/>
-              <w:right w:type="dxa" w:w="140"/>
-            </w:tcMar>
-          </w:tcPr>
-          <w:p>
-            <w:r>
-              <w:rPr>
-                <w:rFonts w:ascii="Calibri" w:cs="Calibri" w:eastAsia="Calibri" w:hAnsi="Calibri"/>
-                <w:color w:val="2D3748"/>
-                <w:sz w:val="20"/>
-                <w:szCs w:val="20"/>
+              <w:top w:type="dxa" w:w="80"/>
+              <w:left w:type="dxa" w:w="120"/>
+              <w:bottom w:type="dxa" w:w="80"/>
+              <w:right w:type="dxa" w:w="120"/>
+            </w:tcMar>
+          </w:tcPr>
+          <w:p>
+            <w:r>
+              <w:rPr>
+                <w:rFonts w:ascii="Arial" w:cs="Arial" w:eastAsia="Arial" w:hAnsi="Arial"/>
+                <w:color w:val="2D3748"/>
+                <w:sz w:val="19"/>
+                <w:szCs w:val="19"/>
               </w:rPr>
               <w:t xml:space="preserve">Amazon API Gateway</w:t>
             </w:r>
@@ -3894,19 +3894,19 @@
             </w:tcBorders>
             <w:shd w:fill="F7FAFC" w:val="clear"/>
             <w:tcMar>
-              <w:top w:type="dxa" w:w="100"/>
-              <w:left w:type="dxa" w:w="140"/>
-              <w:bottom w:type="dxa" w:w="100"/>
-              <w:right w:type="dxa" w:w="140"/>
-            </w:tcMar>
-          </w:tcPr>
-          <w:p>
-            <w:r>
-              <w:rPr>
-                <w:rFonts w:ascii="Calibri" w:cs="Calibri" w:eastAsia="Calibri" w:hAnsi="Calibri"/>
-                <w:color w:val="2D3748"/>
-                <w:sz w:val="20"/>
-                <w:szCs w:val="20"/>
+              <w:top w:type="dxa" w:w="80"/>
+              <w:left w:type="dxa" w:w="120"/>
+              <w:bottom w:type="dxa" w:w="80"/>
+              <w:right w:type="dxa" w:w="120"/>
+            </w:tcMar>
+          </w:tcPr>
+          <w:p>
+            <w:r>
+              <w:rPr>
+                <w:rFonts w:ascii="Arial" w:cs="Arial" w:eastAsia="Arial" w:hAnsi="Arial"/>
+                <w:color w:val="2D3748"/>
+                <w:sz w:val="19"/>
+                <w:szCs w:val="19"/>
               </w:rPr>
               <w:t xml:space="preserve">1,000,000 HTTP API calls</w:t>
             </w:r>
@@ -3922,19 +3922,19 @@
             </w:tcBorders>
             <w:shd w:fill="F7FAFC" w:val="clear"/>
             <w:tcMar>
-              <w:top w:type="dxa" w:w="100"/>
-              <w:left w:type="dxa" w:w="140"/>
-              <w:bottom w:type="dxa" w:w="100"/>
-              <w:right w:type="dxa" w:w="140"/>
-            </w:tcMar>
-          </w:tcPr>
-          <w:p>
-            <w:r>
-              <w:rPr>
-                <w:rFonts w:ascii="Calibri" w:cs="Calibri" w:eastAsia="Calibri" w:hAnsi="Calibri"/>
-                <w:color w:val="2D3748"/>
-                <w:sz w:val="20"/>
-                <w:szCs w:val="20"/>
+              <w:top w:type="dxa" w:w="80"/>
+              <w:left w:type="dxa" w:w="120"/>
+              <w:bottom w:type="dxa" w:w="80"/>
+              <w:right w:type="dxa" w:w="120"/>
+            </w:tcMar>
+          </w:tcPr>
+          <w:p>
+            <w:r>
+              <w:rPr>
+                <w:rFonts w:ascii="Arial" w:cs="Arial" w:eastAsia="Arial" w:hAnsi="Arial"/>
+                <w:color w:val="2D3748"/>
+                <w:sz w:val="19"/>
+                <w:szCs w:val="19"/>
               </w:rPr>
               <w:t xml:space="preserve">~120,000 API calls</w:t>
             </w:r>
@@ -3950,19 +3950,19 @@
             </w:tcBorders>
             <w:shd w:fill="F7FAFC" w:val="clear"/>
             <w:tcMar>
-              <w:top w:type="dxa" w:w="100"/>
-              <w:left w:type="dxa" w:w="140"/>
-              <w:bottom w:type="dxa" w:w="100"/>
-              <w:right w:type="dxa" w:w="140"/>
-            </w:tcMar>
-          </w:tcPr>
-          <w:p>
-            <w:r>
-              <w:rPr>
-                <w:rFonts w:ascii="Calibri" w:cs="Calibri" w:eastAsia="Calibri" w:hAnsi="Calibri"/>
-                <w:color w:val="2D3748"/>
-                <w:sz w:val="20"/>
-                <w:szCs w:val="20"/>
+              <w:top w:type="dxa" w:w="80"/>
+              <w:left w:type="dxa" w:w="120"/>
+              <w:bottom w:type="dxa" w:w="80"/>
+              <w:right w:type="dxa" w:w="120"/>
+            </w:tcMar>
+          </w:tcPr>
+          <w:p>
+            <w:r>
+              <w:rPr>
+                <w:rFonts w:ascii="Arial" w:cs="Arial" w:eastAsia="Arial" w:hAnsi="Arial"/>
+                <w:color w:val="2D3748"/>
+                <w:sz w:val="19"/>
+                <w:szCs w:val="19"/>
               </w:rPr>
               <w:t xml:space="preserve">$0.00 (12-Month Free)</w:t>
             </w:r>
@@ -3980,19 +3980,19 @@
             </w:tcBorders>
             <w:shd w:fill="FFFFFF" w:val="clear"/>
             <w:tcMar>
-              <w:top w:type="dxa" w:w="100"/>
-              <w:left w:type="dxa" w:w="140"/>
-              <w:bottom w:type="dxa" w:w="100"/>
-              <w:right w:type="dxa" w:w="140"/>
-            </w:tcMar>
-          </w:tcPr>
-          <w:p>
-            <w:r>
-              <w:rPr>
-                <w:rFonts w:ascii="Calibri" w:cs="Calibri" w:eastAsia="Calibri" w:hAnsi="Calibri"/>
-                <w:color w:val="2D3748"/>
-                <w:sz w:val="20"/>
-                <w:szCs w:val="20"/>
+              <w:top w:type="dxa" w:w="80"/>
+              <w:left w:type="dxa" w:w="120"/>
+              <w:bottom w:type="dxa" w:w="80"/>
+              <w:right w:type="dxa" w:w="120"/>
+            </w:tcMar>
+          </w:tcPr>
+          <w:p>
+            <w:r>
+              <w:rPr>
+                <w:rFonts w:ascii="Arial" w:cs="Arial" w:eastAsia="Arial" w:hAnsi="Arial"/>
+                <w:color w:val="2D3748"/>
+                <w:sz w:val="19"/>
+                <w:szCs w:val="19"/>
               </w:rPr>
               <w:t xml:space="preserve">Amazon SNS</w:t>
             </w:r>
@@ -4008,19 +4008,19 @@
             </w:tcBorders>
             <w:shd w:fill="FFFFFF" w:val="clear"/>
             <w:tcMar>
-              <w:top w:type="dxa" w:w="100"/>
-              <w:left w:type="dxa" w:w="140"/>
-              <w:bottom w:type="dxa" w:w="100"/>
-              <w:right w:type="dxa" w:w="140"/>
-            </w:tcMar>
-          </w:tcPr>
-          <w:p>
-            <w:r>
-              <w:rPr>
-                <w:rFonts w:ascii="Calibri" w:cs="Calibri" w:eastAsia="Calibri" w:hAnsi="Calibri"/>
-                <w:color w:val="2D3748"/>
-                <w:sz w:val="20"/>
-                <w:szCs w:val="20"/>
+              <w:top w:type="dxa" w:w="80"/>
+              <w:left w:type="dxa" w:w="120"/>
+              <w:bottom w:type="dxa" w:w="80"/>
+              <w:right w:type="dxa" w:w="120"/>
+            </w:tcMar>
+          </w:tcPr>
+          <w:p>
+            <w:r>
+              <w:rPr>
+                <w:rFonts w:ascii="Arial" w:cs="Arial" w:eastAsia="Arial" w:hAnsi="Arial"/>
+                <w:color w:val="2D3748"/>
+                <w:sz w:val="19"/>
+                <w:szCs w:val="19"/>
               </w:rPr>
               <w:t xml:space="preserve">1,000,000 Mobile/Email Publishes</w:t>
             </w:r>
@@ -4036,19 +4036,19 @@
             </w:tcBorders>
             <w:shd w:fill="FFFFFF" w:val="clear"/>
             <w:tcMar>
-              <w:top w:type="dxa" w:w="100"/>
-              <w:left w:type="dxa" w:w="140"/>
-              <w:bottom w:type="dxa" w:w="100"/>
-              <w:right w:type="dxa" w:w="140"/>
-            </w:tcMar>
-          </w:tcPr>
-          <w:p>
-            <w:r>
-              <w:rPr>
-                <w:rFonts w:ascii="Calibri" w:cs="Calibri" w:eastAsia="Calibri" w:hAnsi="Calibri"/>
-                <w:color w:val="2D3748"/>
-                <w:sz w:val="20"/>
-                <w:szCs w:val="20"/>
+              <w:top w:type="dxa" w:w="80"/>
+              <w:left w:type="dxa" w:w="120"/>
+              <w:bottom w:type="dxa" w:w="80"/>
+              <w:right w:type="dxa" w:w="120"/>
+            </w:tcMar>
+          </w:tcPr>
+          <w:p>
+            <w:r>
+              <w:rPr>
+                <w:rFonts w:ascii="Arial" w:cs="Arial" w:eastAsia="Arial" w:hAnsi="Arial"/>
+                <w:color w:val="2D3748"/>
+                <w:sz w:val="19"/>
+                <w:szCs w:val="19"/>
               </w:rPr>
               <w:t xml:space="preserve">~300 Email reminders</w:t>
             </w:r>
@@ -4064,19 +4064,19 @@
             </w:tcBorders>
             <w:shd w:fill="FFFFFF" w:val="clear"/>
             <w:tcMar>
-              <w:top w:type="dxa" w:w="100"/>
-              <w:left w:type="dxa" w:w="140"/>
-              <w:bottom w:type="dxa" w:w="100"/>
-              <w:right w:type="dxa" w:w="140"/>
-            </w:tcMar>
-          </w:tcPr>
-          <w:p>
-            <w:r>
-              <w:rPr>
-                <w:rFonts w:ascii="Calibri" w:cs="Calibri" w:eastAsia="Calibri" w:hAnsi="Calibri"/>
-                <w:color w:val="2D3748"/>
-                <w:sz w:val="20"/>
-                <w:szCs w:val="20"/>
+              <w:top w:type="dxa" w:w="80"/>
+              <w:left w:type="dxa" w:w="120"/>
+              <w:bottom w:type="dxa" w:w="80"/>
+              <w:right w:type="dxa" w:w="120"/>
+            </w:tcMar>
+          </w:tcPr>
+          <w:p>
+            <w:r>
+              <w:rPr>
+                <w:rFonts w:ascii="Arial" w:cs="Arial" w:eastAsia="Arial" w:hAnsi="Arial"/>
+                <w:color w:val="2D3748"/>
+                <w:sz w:val="19"/>
+                <w:szCs w:val="19"/>
               </w:rPr>
               <w:t xml:space="preserve">$0.00 (Always Free)</w:t>
             </w:r>
@@ -4094,19 +4094,19 @@
             </w:tcBorders>
             <w:shd w:fill="F7FAFC" w:val="clear"/>
             <w:tcMar>
-              <w:top w:type="dxa" w:w="100"/>
-              <w:left w:type="dxa" w:w="140"/>
-              <w:bottom w:type="dxa" w:w="100"/>
-              <w:right w:type="dxa" w:w="140"/>
-            </w:tcMar>
-          </w:tcPr>
-          <w:p>
-            <w:r>
-              <w:rPr>
-                <w:rFonts w:ascii="Calibri" w:cs="Calibri" w:eastAsia="Calibri" w:hAnsi="Calibri"/>
-                <w:color w:val="2D3748"/>
-                <w:sz w:val="20"/>
-                <w:szCs w:val="20"/>
+              <w:top w:type="dxa" w:w="80"/>
+              <w:left w:type="dxa" w:w="120"/>
+              <w:bottom w:type="dxa" w:w="80"/>
+              <w:right w:type="dxa" w:w="120"/>
+            </w:tcMar>
+          </w:tcPr>
+          <w:p>
+            <w:r>
+              <w:rPr>
+                <w:rFonts w:ascii="Arial" w:cs="Arial" w:eastAsia="Arial" w:hAnsi="Arial"/>
+                <w:color w:val="2D3748"/>
+                <w:sz w:val="19"/>
+                <w:szCs w:val="19"/>
               </w:rPr>
               <w:t xml:space="preserve">Amazon Rekognition</w:t>
             </w:r>
@@ -4122,19 +4122,19 @@
             </w:tcBorders>
             <w:shd w:fill="F7FAFC" w:val="clear"/>
             <w:tcMar>
-              <w:top w:type="dxa" w:w="100"/>
-              <w:left w:type="dxa" w:w="140"/>
-              <w:bottom w:type="dxa" w:w="100"/>
-              <w:right w:type="dxa" w:w="140"/>
-            </w:tcMar>
-          </w:tcPr>
-          <w:p>
-            <w:r>
-              <w:rPr>
-                <w:rFonts w:ascii="Calibri" w:cs="Calibri" w:eastAsia="Calibri" w:hAnsi="Calibri"/>
-                <w:color w:val="2D3748"/>
-                <w:sz w:val="20"/>
-                <w:szCs w:val="20"/>
+              <w:top w:type="dxa" w:w="80"/>
+              <w:left w:type="dxa" w:w="120"/>
+              <w:bottom w:type="dxa" w:w="80"/>
+              <w:right w:type="dxa" w:w="120"/>
+            </w:tcMar>
+          </w:tcPr>
+          <w:p>
+            <w:r>
+              <w:rPr>
+                <w:rFonts w:ascii="Arial" w:cs="Arial" w:eastAsia="Arial" w:hAnsi="Arial"/>
+                <w:color w:val="2D3748"/>
+                <w:sz w:val="19"/>
+                <w:szCs w:val="19"/>
               </w:rPr>
               <w:t xml:space="preserve">Free trial &amp; 5,000 free images/mo</w:t>
             </w:r>
@@ -4150,19 +4150,19 @@
             </w:tcBorders>
             <w:shd w:fill="F7FAFC" w:val="clear"/>
             <w:tcMar>
-              <w:top w:type="dxa" w:w="100"/>
-              <w:left w:type="dxa" w:w="140"/>
-              <w:bottom w:type="dxa" w:w="100"/>
-              <w:right w:type="dxa" w:w="140"/>
-            </w:tcMar>
-          </w:tcPr>
-          <w:p>
-            <w:r>
-              <w:rPr>
-                <w:rFonts w:ascii="Calibri" w:cs="Calibri" w:eastAsia="Calibri" w:hAnsi="Calibri"/>
-                <w:color w:val="2D3748"/>
-                <w:sz w:val="20"/>
-                <w:szCs w:val="20"/>
+              <w:top w:type="dxa" w:w="80"/>
+              <w:left w:type="dxa" w:w="120"/>
+              <w:bottom w:type="dxa" w:w="80"/>
+              <w:right w:type="dxa" w:w="120"/>
+            </w:tcMar>
+          </w:tcPr>
+          <w:p>
+            <w:r>
+              <w:rPr>
+                <w:rFonts w:ascii="Arial" w:cs="Arial" w:eastAsia="Arial" w:hAnsi="Arial"/>
+                <w:color w:val="2D3748"/>
+                <w:sz w:val="19"/>
+                <w:szCs w:val="19"/>
               </w:rPr>
               <w:t xml:space="preserve">Pay-as-you-go ($0.001/call beyond free)</w:t>
             </w:r>
@@ -4178,19 +4178,19 @@
             </w:tcBorders>
             <w:shd w:fill="F7FAFC" w:val="clear"/>
             <w:tcMar>
-              <w:top w:type="dxa" w:w="100"/>
-              <w:left w:type="dxa" w:w="140"/>
-              <w:bottom w:type="dxa" w:w="100"/>
-              <w:right w:type="dxa" w:w="140"/>
-            </w:tcMar>
-          </w:tcPr>
-          <w:p>
-            <w:r>
-              <w:rPr>
-                <w:rFonts w:ascii="Calibri" w:cs="Calibri" w:eastAsia="Calibri" w:hAnsi="Calibri"/>
-                <w:color w:val="2D3748"/>
-                <w:sz w:val="20"/>
-                <w:szCs w:val="20"/>
+              <w:top w:type="dxa" w:w="80"/>
+              <w:left w:type="dxa" w:w="120"/>
+              <w:bottom w:type="dxa" w:w="80"/>
+              <w:right w:type="dxa" w:w="120"/>
+            </w:tcMar>
+          </w:tcPr>
+          <w:p>
+            <w:r>
+              <w:rPr>
+                <w:rFonts w:ascii="Arial" w:cs="Arial" w:eastAsia="Arial" w:hAnsi="Arial"/>
+                <w:color w:val="2D3748"/>
+                <w:sz w:val="19"/>
+                <w:szCs w:val="19"/>
               </w:rPr>
               <w:t xml:space="preserve">&lt; $1.00 / month</w:t>
             </w:r>
@@ -4200,23 +4200,23 @@
     </w:tbl>
     <w:p>
       <w:pPr>
-        <w:spacing w:after="120" w:before="240"/>
+        <w:spacing w:after="100" w:before="180"/>
       </w:pPr>
     </w:p>
     <w:p>
       <w:pPr>
         <w:pStyle w:val="Heading1"/>
         <w:spacing w:after="140" w:before="360"/>
-        <w:rPr>
-          <w:rFonts w:ascii="Calibri" w:cs="Calibri" w:eastAsia="Calibri" w:hAnsi="Calibri"/>
+      </w:pPr>
+      <w:r>
+        <w:rPr>
+          <w:rFonts w:ascii="Arial" w:cs="Arial" w:eastAsia="Arial" w:hAnsi="Arial"/>
           <w:b/>
           <w:bCs/>
           <w:color w:val="0A2540"/>
-          <w:sz w:val="32"/>
-          <w:szCs w:val="32"/>
-        </w:rPr>
-      </w:pPr>
-      <w:r>
+          <w:sz w:val="30"/>
+          <w:szCs w:val="30"/>
+        </w:rPr>
         <w:t xml:space="preserve">7. Conclusion &amp; Future Roadmap</w:t>
       </w:r>
     </w:p>
@@ -4226,14 +4226,14 @@
       </w:pPr>
       <w:r>
         <w:rPr>
-          <w:rFonts w:ascii="Calibri" w:cs="Calibri" w:eastAsia="Calibri" w:hAnsi="Calibri"/>
+          <w:rFonts w:ascii="Arial" w:cs="Arial" w:eastAsia="Arial" w:hAnsi="Arial"/>
           <w:b w:val="false"/>
           <w:bCs w:val="false"/>
           <w:i w:val="false"/>
           <w:iCs w:val="false"/>
           <w:color w:val="2D3748"/>
-          <w:sz w:val="22"/>
-          <w:szCs w:val="22"/>
+          <w:sz w:val="21"/>
+          <w:szCs w:val="21"/>
         </w:rPr>
         <w:t xml:space="preserve">Presently demonstrates the power of combining AI biometric recognition with AWS Serverless cloud infrastructure. Through prompt engineering and agentic pair programming, a complete enterprise-ready attendance and classroom platform was designed, tested, provisioned with Terraform, and deployed live to CloudFront.</w:t>
       </w:r>
@@ -4242,16 +4242,16 @@
       <w:pPr>
         <w:pStyle w:val="Heading2"/>
         <w:spacing w:after="100" w:before="240"/>
-        <w:rPr>
-          <w:rFonts w:ascii="Calibri" w:cs="Calibri" w:eastAsia="Calibri" w:hAnsi="Calibri"/>
+      </w:pPr>
+      <w:r>
+        <w:rPr>
+          <w:rFonts w:ascii="Arial" w:cs="Arial" w:eastAsia="Arial" w:hAnsi="Arial"/>
           <w:b/>
           <w:bCs/>
           <w:color w:val="0066CC"/>
-          <w:sz w:val="26"/>
-          <w:szCs w:val="26"/>
-        </w:rPr>
-      </w:pPr>
-      <w:r>
+          <w:sz w:val="24"/>
+          <w:szCs w:val="24"/>
+        </w:rPr>
         <w:t xml:space="preserve">Future Roadmap Enhancements:</w:t>
       </w:r>
     </w:p>
@@ -4266,21 +4266,21 @@
       </w:pPr>
       <w:r>
         <w:rPr>
-          <w:rFonts w:ascii="Calibri" w:cs="Calibri" w:eastAsia="Calibri" w:hAnsi="Calibri"/>
+          <w:rFonts w:ascii="Arial" w:cs="Arial" w:eastAsia="Arial" w:hAnsi="Arial"/>
           <w:b/>
           <w:bCs/>
           <w:color w:val="0A2540"/>
-          <w:sz w:val="22"/>
-          <w:szCs w:val="22"/>
+          <w:sz w:val="21"/>
+          <w:szCs w:val="21"/>
         </w:rPr>
         <w:t xml:space="preserve">• </w:t>
       </w:r>
       <w:r>
         <w:rPr>
-          <w:rFonts w:ascii="Calibri" w:cs="Calibri" w:eastAsia="Calibri" w:hAnsi="Calibri"/>
+          <w:rFonts w:ascii="Arial" w:cs="Arial" w:eastAsia="Arial" w:hAnsi="Arial"/>
           <w:color w:val="2D3748"/>
-          <w:sz w:val="22"/>
-          <w:szCs w:val="22"/>
+          <w:sz w:val="21"/>
+          <w:szCs w:val="21"/>
         </w:rPr>
         <w:t xml:space="preserve">Multi-Face Wide-Angle Group Scan: Mark attendance for entire lecture halls from a single wide-angle panoramic camera.</w:t>
       </w:r>
@@ -4296,21 +4296,21 @@
       </w:pPr>
       <w:r>
         <w:rPr>
-          <w:rFonts w:ascii="Calibri" w:cs="Calibri" w:eastAsia="Calibri" w:hAnsi="Calibri"/>
+          <w:rFonts w:ascii="Arial" w:cs="Arial" w:eastAsia="Arial" w:hAnsi="Arial"/>
           <w:b/>
           <w:bCs/>
           <w:color w:val="0A2540"/>
-          <w:sz w:val="22"/>
-          <w:szCs w:val="22"/>
+          <w:sz w:val="21"/>
+          <w:szCs w:val="21"/>
         </w:rPr>
         <w:t xml:space="preserve">• </w:t>
       </w:r>
       <w:r>
         <w:rPr>
-          <w:rFonts w:ascii="Calibri" w:cs="Calibri" w:eastAsia="Calibri" w:hAnsi="Calibri"/>
+          <w:rFonts w:ascii="Arial" w:cs="Arial" w:eastAsia="Arial" w:hAnsi="Arial"/>
           <w:color w:val="2D3748"/>
-          <w:sz w:val="22"/>
-          <w:szCs w:val="22"/>
+          <w:sz w:val="21"/>
+          <w:szCs w:val="21"/>
         </w:rPr>
         <w:t xml:space="preserve">LMS Integration: Direct gradebook and attendance synchronization with Canvas, Blackboard, and Google Classroom.</w:t>
       </w:r>
@@ -4326,21 +4326,21 @@
       </w:pPr>
       <w:r>
         <w:rPr>
-          <w:rFonts w:ascii="Calibri" w:cs="Calibri" w:eastAsia="Calibri" w:hAnsi="Calibri"/>
+          <w:rFonts w:ascii="Arial" w:cs="Arial" w:eastAsia="Arial" w:hAnsi="Arial"/>
           <w:b/>
           <w:bCs/>
           <w:color w:val="0A2540"/>
-          <w:sz w:val="22"/>
-          <w:szCs w:val="22"/>
+          <w:sz w:val="21"/>
+          <w:szCs w:val="21"/>
         </w:rPr>
         <w:t xml:space="preserve">• </w:t>
       </w:r>
       <w:r>
         <w:rPr>
-          <w:rFonts w:ascii="Calibri" w:cs="Calibri" w:eastAsia="Calibri" w:hAnsi="Calibri"/>
+          <w:rFonts w:ascii="Arial" w:cs="Arial" w:eastAsia="Arial" w:hAnsi="Arial"/>
           <w:color w:val="2D3748"/>
-          <w:sz w:val="22"/>
-          <w:szCs w:val="22"/>
+          <w:sz w:val="21"/>
+          <w:szCs w:val="21"/>
         </w:rPr>
         <w:t xml:space="preserve">Offline Mobile PWA: Edge face recognition using TensorFlow.js with automated cloud synchronization upon reconnection.</w:t>
       </w:r>
@@ -4406,7 +4406,7 @@
     </w:pPr>
     <w:r>
       <w:rPr>
-        <w:rFonts w:ascii="Calibri" w:cs="Calibri" w:eastAsia="Calibri" w:hAnsi="Calibri"/>
+        <w:rFonts w:ascii="Arial" w:cs="Arial" w:eastAsia="Arial" w:hAnsi="Arial"/>
         <w:color w:val="718096"/>
         <w:sz w:val="16"/>
         <w:szCs w:val="16"/>
@@ -4415,7 +4415,7 @@
     </w:r>
     <w:r>
       <w:rPr>
-        <w:rFonts w:ascii="Calibri" w:cs="Calibri" w:eastAsia="Calibri" w:hAnsi="Calibri"/>
+        <w:rFonts w:ascii="Arial" w:cs="Arial" w:eastAsia="Arial" w:hAnsi="Arial"/>
         <w:color w:val="718096"/>
         <w:sz w:val="16"/>
         <w:szCs w:val="16"/>
@@ -4427,7 +4427,7 @@
     </w:r>
     <w:r>
       <w:rPr>
-        <w:rFonts w:ascii="Calibri" w:cs="Calibri" w:eastAsia="Calibri" w:hAnsi="Calibri"/>
+        <w:rFonts w:ascii="Arial" w:cs="Arial" w:eastAsia="Arial" w:hAnsi="Arial"/>
         <w:color w:val="718096"/>
         <w:sz w:val="16"/>
         <w:szCs w:val="16"/>
@@ -4436,7 +4436,7 @@
     </w:r>
     <w:r>
       <w:rPr>
-        <w:rFonts w:ascii="Calibri" w:cs="Calibri" w:eastAsia="Calibri" w:hAnsi="Calibri"/>
+        <w:rFonts w:ascii="Arial" w:cs="Arial" w:eastAsia="Arial" w:hAnsi="Arial"/>
         <w:color w:val="718096"/>
         <w:sz w:val="16"/>
         <w:szCs w:val="16"/>
@@ -4495,7 +4495,7 @@
     </w:pPr>
     <w:r>
       <w:rPr>
-        <w:rFonts w:ascii="Calibri" w:cs="Calibri" w:eastAsia="Calibri" w:hAnsi="Calibri"/>
+        <w:rFonts w:ascii="Arial" w:cs="Arial" w:eastAsia="Arial" w:hAnsi="Arial"/>
         <w:color w:val="718096"/>
         <w:sz w:val="16"/>
         <w:szCs w:val="16"/>

</xml_diff>